<commit_message>
Whitepaper em português no modelo de Briefing do Sistema OCB, com quatro figuras traduzidas
whitepaper_ocb.md is the source (sumário executivo, contexto, o que foi analisado, resultados, o que significa, limites, recomendações, anexo metodológico, referências APA). make_docx.py whitepaper fills the sistemaocb-docx Briefing template (header label WHITEPAPER, template media preserved) and builds the Portuguese results table from tables/t2_main.tex. make_whitepaper_figures.py draws figures/wp1..wp4 through make_figures.py's loaders. Also fixes the dotless-i accent in bib titles for the conference paper.

Co-Authored-By: Claude Fable 5.1 <noreply@anthropic.com>
</commit_message>
<xml_diff>
--- a/paper/ICACCR2026_paper_Nery_Victorino_Rangel.docx
+++ b/paper/ICACCR2026_paper_Nery_Victorino_Rangel.docx
@@ -135,6 +135,7 @@
       <w:pPr>
         <w:pStyle w:val="Abstract"/>
         <w:keepNext/>
+        <w:keepLines/>
         <w:ind w:left="0" w:right="284"/>
       </w:pPr>
       <w:r>
@@ -196,6 +197,7 @@
       <w:pPr>
         <w:pStyle w:val="Heading1"/>
         <w:keepNext/>
+        <w:keepLines/>
         <w:numPr>
           <w:ilvl w:val="0"/>
           <w:numId w:val="0"/>
@@ -245,6 +247,7 @@
     <w:p>
       <w:pPr>
         <w:keepNext/>
+        <w:keepLines/>
         <w:spacing w:before="120" w:after="60"/>
         <w:jc w:val="center"/>
       </w:pPr>
@@ -289,6 +292,7 @@
       <w:pPr>
         <w:pStyle w:val="TablaImagen-Ttulo"/>
         <w:keepNext/>
+        <w:keepLines/>
         <w:spacing w:before="0" w:after="60"/>
       </w:pPr>
       <w:r>
@@ -365,6 +369,7 @@
       <w:pPr>
         <w:pStyle w:val="Heading2"/>
         <w:keepNext/>
+        <w:keepLines/>
         <w:numPr>
           <w:ilvl w:val="0"/>
           <w:numId w:val="0"/>
@@ -404,6 +409,7 @@
       <w:pPr>
         <w:pStyle w:val="Heading2"/>
         <w:keepNext/>
+        <w:keepLines/>
         <w:numPr>
           <w:ilvl w:val="0"/>
           <w:numId w:val="0"/>
@@ -435,6 +441,7 @@
       <w:pPr>
         <w:pStyle w:val="Heading2"/>
         <w:keepNext/>
+        <w:keepLines/>
         <w:numPr>
           <w:ilvl w:val="0"/>
           <w:numId w:val="0"/>
@@ -458,6 +465,7 @@
       <w:pPr>
         <w:pStyle w:val="Heading1"/>
         <w:keepNext/>
+        <w:keepLines/>
         <w:numPr>
           <w:ilvl w:val="0"/>
           <w:numId w:val="0"/>
@@ -489,6 +497,7 @@
       <w:pPr>
         <w:pStyle w:val="Heading1"/>
         <w:keepNext/>
+        <w:keepLines/>
         <w:numPr>
           <w:ilvl w:val="0"/>
           <w:numId w:val="0"/>
@@ -504,6 +513,7 @@
       <w:pPr>
         <w:pStyle w:val="Heading2"/>
         <w:keepNext/>
+        <w:keepLines/>
         <w:numPr>
           <w:ilvl w:val="0"/>
           <w:numId w:val="0"/>
@@ -598,6 +608,7 @@
       <w:pPr>
         <w:pStyle w:val="Heading2"/>
         <w:keepNext/>
+        <w:keepLines/>
         <w:numPr>
           <w:ilvl w:val="0"/>
           <w:numId w:val="0"/>
@@ -753,6 +764,7 @@
     <w:p>
       <w:pPr>
         <w:keepNext/>
+        <w:keepLines/>
         <w:spacing w:before="120" w:after="60"/>
         <w:jc w:val="center"/>
       </w:pPr>
@@ -797,6 +809,7 @@
       <w:pPr>
         <w:pStyle w:val="TablaImagen-Ttulo"/>
         <w:keepNext/>
+        <w:keepLines/>
         <w:spacing w:before="0" w:after="60"/>
       </w:pPr>
       <w:r>
@@ -827,6 +840,7 @@
       <w:pPr>
         <w:pStyle w:val="Heading2"/>
         <w:keepNext/>
+        <w:keepLines/>
         <w:numPr>
           <w:ilvl w:val="0"/>
           <w:numId w:val="0"/>
@@ -936,6 +950,7 @@
       <w:pPr>
         <w:pStyle w:val="TablaImagen-Ttulo"/>
         <w:keepNext/>
+        <w:keepLines/>
         <w:spacing w:before="200" w:after="60"/>
       </w:pPr>
       <w:r>
@@ -1591,6 +1606,7 @@
       <w:pPr>
         <w:pStyle w:val="Heading2"/>
         <w:keepNext/>
+        <w:keepLines/>
         <w:numPr>
           <w:ilvl w:val="0"/>
           <w:numId w:val="0"/>
@@ -1668,6 +1684,7 @@
       <w:pPr>
         <w:pStyle w:val="Heading1"/>
         <w:keepNext/>
+        <w:keepLines/>
         <w:numPr>
           <w:ilvl w:val="0"/>
           <w:numId w:val="0"/>
@@ -1690,6 +1707,7 @@
     <w:p>
       <w:pPr>
         <w:keepNext/>
+        <w:keepLines/>
         <w:spacing w:before="120" w:after="60"/>
         <w:jc w:val="center"/>
       </w:pPr>
@@ -1750,6 +1768,7 @@
       <w:pPr>
         <w:pStyle w:val="Heading2"/>
         <w:keepNext/>
+        <w:keepLines/>
         <w:numPr>
           <w:ilvl w:val="0"/>
           <w:numId w:val="0"/>
@@ -1791,6 +1810,7 @@
       <w:pPr>
         <w:pStyle w:val="TablaImagen-Ttulo"/>
         <w:keepNext/>
+        <w:keepLines/>
         <w:spacing w:before="200" w:after="60"/>
       </w:pPr>
       <w:r>
@@ -3820,6 +3840,7 @@
     <w:p>
       <w:pPr>
         <w:keepNext/>
+        <w:keepLines/>
         <w:spacing w:before="120" w:after="60"/>
         <w:jc w:val="center"/>
       </w:pPr>
@@ -3864,6 +3885,7 @@
       <w:pPr>
         <w:pStyle w:val="TablaImagen-Ttulo"/>
         <w:keepNext/>
+        <w:keepLines/>
         <w:spacing w:before="0" w:after="60"/>
       </w:pPr>
       <w:r>
@@ -3910,6 +3932,7 @@
       <w:pPr>
         <w:pStyle w:val="Heading2"/>
         <w:keepNext/>
+        <w:keepLines/>
         <w:numPr>
           <w:ilvl w:val="0"/>
           <w:numId w:val="0"/>
@@ -3932,6 +3955,7 @@
     <w:p>
       <w:pPr>
         <w:keepNext/>
+        <w:keepLines/>
         <w:spacing w:before="120" w:after="60"/>
         <w:jc w:val="center"/>
       </w:pPr>
@@ -3976,6 +4000,7 @@
       <w:pPr>
         <w:pStyle w:val="TablaImagen-Ttulo"/>
         <w:keepNext/>
+        <w:keepLines/>
         <w:spacing w:before="0" w:after="60"/>
       </w:pPr>
       <w:r>
@@ -4021,6 +4046,7 @@
     <w:p>
       <w:pPr>
         <w:keepNext/>
+        <w:keepLines/>
         <w:spacing w:before="120" w:after="60"/>
         <w:jc w:val="center"/>
       </w:pPr>
@@ -4103,6 +4129,7 @@
       <w:pPr>
         <w:pStyle w:val="Heading2"/>
         <w:keepNext/>
+        <w:keepLines/>
         <w:numPr>
           <w:ilvl w:val="0"/>
           <w:numId w:val="0"/>
@@ -4134,6 +4161,7 @@
       <w:pPr>
         <w:pStyle w:val="Heading2"/>
         <w:keepNext/>
+        <w:keepLines/>
         <w:numPr>
           <w:ilvl w:val="0"/>
           <w:numId w:val="0"/>
@@ -4165,6 +4193,7 @@
       <w:pPr>
         <w:pStyle w:val="Heading2"/>
         <w:keepNext/>
+        <w:keepLines/>
         <w:numPr>
           <w:ilvl w:val="0"/>
           <w:numId w:val="0"/>
@@ -4207,6 +4236,7 @@
       <w:pPr>
         <w:pStyle w:val="Heading2"/>
         <w:keepNext/>
+        <w:keepLines/>
         <w:numPr>
           <w:ilvl w:val="0"/>
           <w:numId w:val="0"/>
@@ -4230,6 +4260,7 @@
       <w:pPr>
         <w:pStyle w:val="Heading1"/>
         <w:keepNext/>
+        <w:keepLines/>
         <w:numPr>
           <w:ilvl w:val="0"/>
           <w:numId w:val="0"/>
@@ -4277,6 +4308,7 @@
       <w:pPr>
         <w:pStyle w:val="Heading2"/>
         <w:keepNext/>
+        <w:keepLines/>
         <w:numPr>
           <w:ilvl w:val="0"/>
           <w:numId w:val="0"/>
@@ -4300,6 +4332,7 @@
       <w:pPr>
         <w:pStyle w:val="Heading1"/>
         <w:keepNext/>
+        <w:keepLines/>
         <w:numPr>
           <w:ilvl w:val="0"/>
           <w:numId w:val="0"/>
@@ -4349,6 +4382,7 @@
       <w:pPr>
         <w:pStyle w:val="Heading1"/>
         <w:keepNext/>
+        <w:keepLines/>
         <w:numPr>
           <w:ilvl w:val="0"/>
           <w:numId w:val="0"/>
@@ -5062,7 +5096,7 @@
           <w:sz w:val="18"/>
           <w:szCs w:val="18"/>
         </w:rPr>
-        <w:t xml:space="preserve">Resolução nº 4.193, de 1º de março de 2013. Apuração dos requerimentos m\inimos de Patrimônio de Referência, de N\ivel I e de Capital Principal e adicional de Capital Principal</w:t>
+        <w:t xml:space="preserve">Resolução nº 4.193, de 1º de março de 2013. Apuração dos requerimentos mínimos de Patrimônio de Referência, de Nível I e de Capital Principal e adicional de Capital Principal</w:t>
       </w:r>
       <w:r>
         <w:rPr>
@@ -5092,7 +5126,7 @@
           <w:sz w:val="18"/>
           <w:szCs w:val="18"/>
         </w:rPr>
-        <w:t xml:space="preserve">Resolução nº 4.194, de 1º de março de 2013. Metodologia facultativa simplificada para apuração do requerimento m\inimo de Patrimônio de Referência por cooperativas de crédito</w:t>
+        <w:t xml:space="preserve">Resolução nº 4.194, de 1º de março de 2013. Metodologia facultativa simplificada para apuração do requerimento mínimo de Patrimônio de Referência por cooperativas de crédito</w:t>
       </w:r>
       <w:r>
         <w:rPr>
@@ -5122,7 +5156,7 @@
           <w:sz w:val="18"/>
           <w:szCs w:val="18"/>
         </w:rPr>
-        <w:t xml:space="preserve">Resolução nº 4.401, de 27 de fevereiro de 2015. Requerimentos m\inimos de liquidez de curto prazo (LCR)</w:t>
+        <w:t xml:space="preserve">Resolução nº 4.401, de 27 de fevereiro de 2015. Requerimentos mínimos de liquidez de curto prazo (LCR)</w:t>
       </w:r>
       <w:r>
         <w:rPr>
@@ -5212,7 +5246,7 @@
           <w:sz w:val="18"/>
           <w:szCs w:val="18"/>
         </w:rPr>
-        <w:t xml:space="preserve">Resolução nº 4.606, de 19 de outubro de 2017. Metodologia facultativa simplificada para apuração do requerimento m\inimo de Patrimônio de Referência Simplificado (PRS5)</w:t>
+        <w:t xml:space="preserve">Resolução nº 4.606, de 19 de outubro de 2017. Metodologia facultativa simplificada para apuração do requerimento mínimo de Patrimônio de Referência Simplificado (PRS5)</w:t>
       </w:r>
       <w:r>
         <w:rPr>
@@ -5272,7 +5306,7 @@
           <w:sz w:val="18"/>
           <w:szCs w:val="18"/>
         </w:rPr>
-        <w:t xml:space="preserve">Resolução nº 4.616, de 30 de novembro de 2017. Requerimento m\inimo de liquidez de longo prazo (NSFR)</w:t>
+        <w:t xml:space="preserve">Resolução nº 4.616, de 30 de novembro de 2017. Requerimento mínimo de liquidez de longo prazo (NSFR)</w:t>
       </w:r>
       <w:r>
         <w:rPr>
@@ -5332,7 +5366,7 @@
           <w:sz w:val="18"/>
           <w:szCs w:val="18"/>
         </w:rPr>
-        <w:t xml:space="preserve">Resolução nº 4.958, de 21 de outubro de 2021. Requerimentos m\inimos de Patrimônio de Referência, de N\ivel I e de Capital Principal e adicional de Capital Principal</w:t>
+        <w:t xml:space="preserve">Resolução nº 4.958, de 21 de outubro de 2021. Requerimentos mínimos de Patrimônio de Referência, de Nível I e de Capital Principal e adicional de Capital Principal</w:t>
       </w:r>
       <w:r>
         <w:rPr>
@@ -5848,6 +5882,7 @@
       <w:pPr>
         <w:pStyle w:val="Heading1"/>
         <w:keepNext/>
+        <w:keepLines/>
         <w:numPr>
           <w:ilvl w:val="0"/>
           <w:numId w:val="0"/>

</xml_diff>

<commit_message>
Committee review: plain-language glosses, survival table, declaration, territorial caveat, bootstrap rates, Figure 6 labels, Groeneveld; margin widened
Title kept. Glosses replace the retention-ratio formula, the Kish measure and the Rademacher weights in the text; Table 4 (make_tables t14, from the five results files) states which differentials are significant against which comparison group; the abstract and Section 6 say the territorial claim is the one the data cannot settle; a Declaration subsection states the OCB affiliation; the bootstrap sentence gives the simulated rejection rates; Figure 6's top row carries year labels; one COVID sentence in 3.1; Groeneveld (2020, APCE) added and verified through Crossref. Cuts for margin: beck2009, hansmann1996, abadie2023, cmn4192 and cmn4193 no longer cited, duplicated details removed, Table 1 compressed. Estimate 7,762 words; Word counts the docx at 7,779.

Co-Authored-By: Claude Fable 5.1 <noreply@anthropic.com>
</commit_message>
<xml_diff>
--- a/paper/ICACCR2026_paper_Nery_Victorino_Rangel.docx
+++ b/paper/ICACCR2026_paper_Nery_Victorino_Rangel.docx
@@ -155,7 +155,7 @@
         <w:jc w:val="both"/>
       </w:pPr>
       <w:r>
-        <w:t xml:space="preserve">In Brazil, a credit cooperative that grows past a size threshold computes capital, leverage and risk under the same prudential methodology as a commercial bank. We use this setting to ask whether the cooperative form retains distinct balance-sheet characteristics. Using a quarterly panel of every full-methodology institution from 2017 to 2024, 130 singular credit cooperatives and 144 banks, we relate ten measures of capital, performance, stability and balance-sheet structure to a cooperative dummy. The estimates control for size and time and are repeated on a matched sample, on the region of common support and across five comparison groups. Three results emerge. First, cooperatives of comparable size allocate more of their assets to credit than banks nationally, operate at lower cost, show lower return volatility and earn a higher return on assets after tax, a gap that the tax exemption of cooperative acts explains in part. Second, capital differs modestly in level and markedly in dispersion. The mean gap comes largely from small banks that barely intermediate and hold capital ratios above fifty percent, and it roughly halves against deposit-funded banks. Among thinly capitalised institutions, cooperatives hold more capital than banks and provision no less. Third, lower provisioning and narrower margins, two differences often reported, disappear once the comparison group is restricted to banks. A benchmark calibrated on the average institution may therefore describe the locally lending cooperative poorly, which bears on institutional resilience and on the territorial role of cooperative lenders.</w:t>
+        <w:t xml:space="preserve">In Brazil, a credit cooperative that grows past a size threshold computes capital, leverage and risk under the same prudential methodology as a commercial bank. We use this setting to ask whether the cooperative form retains distinct balance-sheet characteristics. Using a quarterly panel of every full-methodology institution from 2017 to 2024, 130 singular credit cooperatives and 144 banks, we relate ten measures of capital, performance, stability and balance-sheet structure to a cooperative dummy. The estimates control for size and time and are repeated on a matched sample and across five comparison groups. Three results emerge. First, cooperatives of comparable size allocate more of their assets to credit than banks nationally, operate at lower cost, show lower return volatility and earn a higher return on assets after tax, a gap that the tax exemption of cooperative acts explains in part. Second, capital differs modestly in level and markedly in dispersion. The mean gap comes largely from small banks that barely intermediate and hold capital ratios above fifty percent, and it roughly halves against deposit-funded banks. Among thinly capitalised institutions, cooperatives hold more capital than banks and provision no less. Third, lower provisioning and narrower margins, two differences often reported, disappear once the comparison group is restricted to banks. A benchmark calibrated on the average institution may therefore describe the locally lending cooperative poorly. Whether that bears on the territorial role of cooperative lenders is the claim these data cannot yet settle.</w:t>
       </w:r>
     </w:p>
     <w:p>
@@ -214,7 +214,7 @@
         <w:jc w:val="both"/>
       </w:pPr>
       <w:r>
-        <w:t xml:space="preserve">Prudential regulation has converged on a common template. Basel III supplies the architecture for capital, leverage and risk measurement, and national supervisors adapt it to local conditions (Basel Committee on Banking Supervision, 2011). Brazil sorts authorised institutions into five segments for the proportional application of prudential rules (Conselho Monetário Nacional, 2017a); Figure 1 shows how cooperatives and other institutions divide between the two methodologies. Segments 1 to 4 apply the full methodology, while Segment 5 comprises institutions with total exposure below 0.1 percent of GDP that opt for a simplified method of computing minimum capital, under Resolution 4.194/2013 until February 2018 and Resolution 4.606/2017 thereafter (Conselho Monetário Nacional, 2017b). Commercial, multiple, investment and exchange banks are excluded from S5 at any size. Membership of S5 therefore follows from the choice of methodology, and an institution that stops using the simplified method is reassigned to S4.</w:t>
+        <w:t xml:space="preserve">Prudential regulation has converged on a common template. Basel III supplies the architecture for capital, leverage and risk measurement, and national supervisors adapt it to local conditions (Basel Committee on Banking Supervision, 2011). Brazil sorts authorised institutions into five segments for the proportional application of prudential rules (Conselho Monetário Nacional, 2017a); Figure 1 shows how cooperatives and other institutions divide between the two methodologies. Segments 1 to 4 apply the full methodology, while Segment 5 comprises institutions with total exposure below 0.1 percent of GDP that opt for a simplified method of computing minimum capital, under Resolution 4.194/2013 until February 2018 and Resolution 4.606/2017 thereafter (Conselho Monetário Nacional, 2017b). Commercial, multiple, investment and exchange banks are excluded from S5 at any size.</w:t>
       </w:r>
       <w:r>
         <w:rPr>
@@ -233,7 +233,7 @@
         <w:t xml:space="preserve">Patrimônio de Referência</w:t>
       </w:r>
       <w:r>
-        <w:t xml:space="preserve"> capital definition, minimum requirements and risk-weighted-asset computation of Resolutions 4.192 and 4.193 of 2013 and, from 3 January 2022, of Resolutions 4.955 and 4.958 (Conselho Monetário Nacional, 2013a, 2013b, 2021a, 2021b). Loan classification and minimum provisioning follow Resolution 2.682/1999 throughout the window, since its expected-loss successor took effect only in 2025 (Conselho Monetário Nacional, 1999, 2021c).</w:t>
+        <w:t xml:space="preserve"> capital definition, minimum requirements and risk-weighted-asset computation of Resolutions 4.192 and 4.193 of 2013 and, from 3 January 2022, of Resolutions 4.955 and 4.958 (Conselho Monetário Nacional, 2021a, 2021b). Loan classification and minimum provisioning follow Resolution 2.682/1999 throughout the window, since its expected-loss successor took effect only in 2025 (Conselho Monetário Nacional, 1999, 2021c).</w:t>
       </w:r>
     </w:p>
     <w:p>
@@ -364,7 +364,7 @@
         <w:jc w:val="both"/>
       </w:pPr>
       <w:r>
-        <w:t xml:space="preserve">Brazil's segmentation sorts institutions by size and international activity (Conselho Monetário Nacional, 2017a), and the international surveys of proportionality record size, complexity and business model as the criteria in use, none based on organisational form (Basel Committee on Banking Supervision, 2019; Castro Carvalho et al., 2017). Where supervisors adapt the framework to financial cooperatives, the adaptation concerns the capital treatment of member shares and the arrangements within networks, while supervisory powers remain those applied to commercial banks (Coelho et al., 2019). Responsive regulation (Ayres &amp; Braithwaite, 1992; Baldwin &amp; Black, 2008) treats the structure of the regulated industry and the motivations of its firms as inputs to how a regime engages them. Organisational form and network membership then become candidate calibration margins, and the profile of each form decides whether they point to lighter treatment or closer scrutiny. This paper provides that profile.</w:t>
+        <w:t xml:space="preserve">Brazil's segmentation sorts institutions by size and international activity (Conselho Monetário Nacional, 2017a), and the international surveys of proportionality record size, complexity and business model as the criteria in use, none based on organisational form (Basel Committee on Banking Supervision, 2019; Castro Carvalho et al., 2017). Where supervisors adapt the framework to cooperatives, the adaptation concerns member shares and network arrangements (Coelho et al., 2019). Responsive regulation (Ayres &amp; Braithwaite, 1992; Baldwin &amp; Black, 2008) treats the structure of the regulated industry and the motivations of its firms as inputs to how a regime engages them. Organisational form and network membership then become candidate calibration margins, and the profile of each form decides whether they point to lighter treatment or closer scrutiny. This paper provides that profile.</w:t>
       </w:r>
     </w:p>
     <w:p>
@@ -372,7 +372,7 @@
         <w:jc w:val="both"/>
       </w:pPr>
       <w:r>
-        <w:t xml:space="preserve">Ownership offers a reason to expect the two forms to differ under a common methodology. A cooperative cannot raise outside voting equity as needed, so its capital is an endowment of retained earnings accumulated across member generations (Fonteyne, 2007). Basel III admits the member shares of mutuals and cooperatives as common equity under criteria adapted to their legal form (Basel Committee on Banking Supervision, 2011). However, the shares remain redeemable claims of members and cannot be placed with outside investors. The member's claim carries the five property-rights problems that Cook (1995) sets out: free-rider, horizon, portfolio, control and influence costs, which together weaken the incentive to build capital beyond what member service requires. In Hansmann's terms the claim is tied to use of the institution, so capital accumulation is instrumental to member credit (Hansmann, 1996).</w:t>
+        <w:t xml:space="preserve">Ownership offers a reason to expect the two forms to differ under a common methodology. A cooperative cannot raise outside voting equity as needed, so its capital is an endowment of retained earnings accumulated across member generations (Fonteyne, 2007). Basel III admits the member shares of mutuals and cooperatives as common equity under criteria adapted to their legal form (Basel Committee on Banking Supervision, 2011). However, the shares remain redeemable claims of members and cannot be placed with outside investors. The member's claim carries the five property-rights problems that Cook (1995) sets out: free-rider, horizon, portfolio, control and influence costs, which together weaken the incentive to build capital beyond what member service requires, since the member's claim is a claim on the use of the institution.</w:t>
       </w:r>
     </w:p>
     <w:p>
@@ -396,7 +396,7 @@
         <w:jc w:val="both"/>
       </w:pPr>
       <w:r>
-        <w:t xml:space="preserve">Besides the proportionality work above, two strands of the literature reviewed by McKillop et al. (2020) bear on this paper. The first concerns capital, profitability and stability. Hesse and Čihák (2007) find in a cross-country panel that cooperative banks are more stable than commercial banks. They attribute the result to the lower volatility of cooperative returns, which more than offsets lower profitability and capitalisation. Iannotta et al. (2007) and Beck et al. (2009) find that ownership structure predicts risk and performance across European banks and within Germany, and Becchetti et al. (2016) and Ferri et al. (2014) show that it shapes lending. Cuevas and Fischer (2006) set out the tension between member orientation and prudential templates written for investor-owned banks. The second is Brazilian. Bressan et al. (2011) apply the PEARLS system to Brazilian credit cooperatives and model their insolvency risk, and Carvalho et al. (2015) analyse the exit and failure of Brazilian credit unions. None of these studies compares cooperatives with banks under a common prudential methodology, which is the setting we use here.</w:t>
+        <w:t xml:space="preserve">Besides the proportionality work above, two strands of the literature reviewed by McKillop et al. (2020) bear on this paper. The first concerns capital, profitability and stability. Hesse and Čihák (2007) find in a cross-country panel that cooperative banks are more stable than commercial banks. They attribute the result to the lower volatility of cooperative returns, which more than offsets lower profitability and capitalisation. Iannotta et al. (2007) find that ownership structure predicts risk and performance across European banks, and Becchetti et al. (2016) and Ferri et al. (2014) show that it shapes lending. Groeneveld (2020) weighs the adaptations of European cooperative banks against the traits they retain and finds their distinctive character intact. Cuevas and Fischer (2006) set out the tension between member orientation and prudential templates written for investor-owned banks. The second is Brazilian. Bressan et al. (2011) apply the PEARLS system to Brazilian credit cooperatives and model their insolvency risk, and Carvalho et al. (2015) analyse the exit and failure of Brazilian credit unions. None of these studies compares cooperatives with banks under a common prudential methodology, which is the setting we use here.</w:t>
       </w:r>
     </w:p>
     <w:p>
@@ -404,7 +404,7 @@
         <w:jc w:val="both"/>
       </w:pPr>
       <w:r>
-        <w:t xml:space="preserve">A further question is asked less often: which institutions the comparison group contains. Regulatory populations are defined by legal category and can include institutions with little economic resemblance to a bank. Of the 483 non-cooperative institutions under the full methodology in Brazil, 158 report a median credit-to-assets ratio of zero and a median ratio of funds raised to assets of zero.</w:t>
+        <w:t xml:space="preserve">A further question is asked less often: which institutions the comparison group contains. Regulatory populations are defined by legal category and can include institutions with little economic resemblance to a bank, as Section 3.2 shows for Brazil.</w:t>
       </w:r>
     </w:p>
     <w:p>
@@ -428,7 +428,7 @@
         <w:jc w:val="both"/>
       </w:pPr>
       <w:r>
-        <w:t xml:space="preserve">We compare cooperatives with banks across a ladder of comparison groups defined on the regulator's own categories, correct two features of the source data that distort the rate variables, and separate sector-wide differences from differences within regional markets. The window opens in 2017Q1, the first quarter with segment reporting under Resolution 4.553, so the paper cannot speak to the crisis-period lending that Becchetti et al. (2016) and Ferri et al. (2014) study.</w:t>
+        <w:t xml:space="preserve">We compare cooperatives with banks across a ladder of comparison groups defined on the regulator's own categories, and separate sector-wide differences from differences within regional markets. The window opens in 2017Q1, the first quarter with segment reporting under Resolution 4.553, so the paper cannot speak to the crisis-period lending that Becchetti et al. (2016) and Ferri et al. (2014) study.</w:t>
       </w:r>
     </w:p>
     <w:p>
@@ -500,7 +500,7 @@
         <w:jc w:val="both"/>
       </w:pPr>
       <w:r>
-        <w:t xml:space="preserve">We construct an institution-level quarterly panel from IF.data, the public statistical repository of the Central Bank of Brazil. The summary financials, the segmentation file, the asset composition file and the income statement are merged on institution code and reporting date. Each source is deduplicated on the institution-quarter key before merging, keeping the most complete record, and the raw panel runs from 2014Q1 to 2024Q4. All tables and figures are the authors' calculations from the IF.data files.</w:t>
+        <w:t xml:space="preserve">We construct an institution-level quarterly panel from IF.data, the public statistical repository of the Central Bank of Brazil. The summary financials, the segmentation file, the asset composition file and the income statement are merged on institution code and reporting date. Each source is deduplicated on the institution-quarter key before merging, keeping the most complete record, and the raw panel runs from 2014Q1 to 2024Q4. The window includes the pandemic years; quarter fixed effects absorb the common shock, and the pre-2022 subperiod that contains them shows every surviving result (Section 4.6). All tables and figures are the authors' calculations from the IF.data files.</w:t>
       </w:r>
     </w:p>
     <w:p>
@@ -728,7 +728,7 @@
         <w:jc w:val="both"/>
       </w:pPr>
       <w:r>
-        <w:t xml:space="preserve">Each rung can further be restricted to banks reporting individually. Of the 339 institutions in the broad group outside the bank rung, 335 are non-banking, and 158 institutions, almost all of them non-banking, have a median of zero credit and zero funds raised (Figure 2). Their presence makes the credit and funding differentials mechanical, but we still report the broad group because its divergence from banks is one of our results.</w:t>
+        <w:t xml:space="preserve">Each rung can further be restricted to banks reporting individually. Of the 339 institutions in the broad group outside the bank rung, 158 have a median of zero credit and zero funds raised (Figure 2), which makes the credit and funding differentials mechanical; we still report the broad group because its divergence from banks is one of our results.</w:t>
       </w:r>
     </w:p>
     <w:p>
@@ -1171,7 +1171,7 @@
                 <w:sz w:val="18"/>
                 <w:szCs w:val="18"/>
               </w:rPr>
-              <w:t xml:space="preserve">4× (quarterly net income, line (j) de-cumulated within the semester) / total assets</w:t>
+              <w:t xml:space="preserve">4× line (j) / total assets</w:t>
             </w:r>
           </w:p>
         </w:tc>
@@ -1244,7 +1244,7 @@
                 <w:sz w:val="18"/>
                 <w:szCs w:val="18"/>
               </w:rPr>
-              <w:t xml:space="preserve">5)] /  total assets, de-cumulated within the semester</w:t>
+              <w:t xml:space="preserve">5)] /  total assets</w:t>
             </w:r>
           </w:p>
         </w:tc>
@@ -1365,7 +1365,7 @@
                 <w:sz w:val="18"/>
                 <w:szCs w:val="18"/>
               </w:rPr>
-              <w:t xml:space="preserve">2)|], de-cumulated within the semester</w:t>
+              <w:t xml:space="preserve">2)|]</w:t>
             </w:r>
           </w:p>
         </w:tc>
@@ -1544,7 +1544,7 @@
                 <w:sz w:val="18"/>
                 <w:szCs w:val="18"/>
               </w:rPr>
-              <w:t xml:space="preserve">S.d. of annualised quarterly return on assets over the institution's full-methodology quarters (at least eight)</w:t>
+              <w:t xml:space="preserve">S.d. of annualised quarterly return on assets over the institution's full-methodology quarters</w:t>
             </w:r>
           </w:p>
         </w:tc>
@@ -1591,7 +1591,7 @@
                 <w:sz w:val="18"/>
                 <w:szCs w:val="18"/>
               </w:rPr>
-              <w:t xml:space="preserve">[mean return on assets  +  mean (1−leverage)] / s.d. of return on assets (at least eight quarters)</w:t>
+              <w:t xml:space="preserve">[mean return on assets  +  mean (1−leverage)] / s.d. of return on assets</w:t>
             </w:r>
           </w:p>
         </w:tc>
@@ -1607,7 +1607,7 @@
           <w:sz w:val="16"/>
           <w:szCs w:val="16"/>
         </w:rPr>
-        <w:t xml:space="preserve">IF.data lines: (a) intermediation revenue, (b) intermediation expense, carried as a negative, (c)  =  (a)  +  (b) intermediation result, (b5) loan-loss provision result within (b), (d2) fee income, (d3) personnel expense, (d4) administrative expense, (j) net income.</w:t>
+        <w:t xml:space="preserve">IF.data lines, de-cumulated within the semester: (a) intermediation revenue, (b) intermediation expense, carried as a negative, (c)  =  (a)  +  (b) intermediation result, (b5) loan-loss provision result within (b), (d2) fee income, (d3) personnel expense, (d4) administrative expense, (j) net income.</w:t>
       </w:r>
     </w:p>
     <w:p>
@@ -1639,7 +1639,7 @@
         <w:jc w:val="both"/>
       </w:pPr>
       <w:r>
-        <w:t xml:space="preserve">The coarsened-exact-matching estimand weights control units so that the treated-to-control ratio is equal within every stratum (Iacus et al., 2012). OLS on the matched sample does not recover it, since unweighted strata are implicitly weighted by their control counts. We report the weighted estimand and the unweighted matched-sample regression together. We coarsen on size quintile and control for region. Region-exact matching would leave too few controls: cooperatives concentrate in the South and banks in the Southeast, so region-exact strata leave an effective control sample of about eighteen institutions by the Kish measure, against seventy-six under size coarsening. Region-exact estimates are reported as a second parameter (Section 4.3).</w:t>
+        <w:t xml:space="preserve">The coarsened-exact-matching estimand weights control units so that the treated-to-control ratio is equal within every stratum (Iacus et al., 2012); an unweighted regression on the matched sample does not recover it, so we report both. We coarsen on size quintile and control for region. Region-exact matching would leave too few controls, since cooperatives concentrate in the South and banks in the Southeast: once unequal weights are discounted, the effective control sample is about eighteen institutions, against seventy-six under size coarsening. Region-exact estimates are reported as a second parameter (Section 4.3).</w:t>
       </w:r>
     </w:p>
     <w:p>
@@ -1647,7 +1647,7 @@
         <w:jc w:val="both"/>
       </w:pPr>
       <w:r>
-        <w:t xml:space="preserve">Standard errors are clustered by institution, since cooperative status is assigned at the institution level and observations are serially correlated (Abadie et al., 2023; Cameron &amp; Miller, 2015). Inference from clustered standard errors is unreliable when few clusters are treated (MacKinnon &amp; Webb, 2017), as in the system-by-system estimates. We therefore compute a restricted wild cluster bootstrap with Rademacher weights for every coefficient (Cameron et al., 2008). In simulations on our design with six treated clusters, the clustered test rejects a true null 16 percent of the time at a nominal 5 percent level. The wild bootstrap comes closer to the nominal level and is correctly sized at one percent. System-level estimates report the number of treated clusters, and quantile coefficients carry intervals from an institution bootstrap. Several outcomes are right-skewed, so we report the conditional median alongside the conditional mean.</w:t>
+        <w:t xml:space="preserve">Standard errors are clustered by institution, since cooperative status is assigned at the institution level and observations are serially correlated (Cameron &amp; Miller, 2015). Clustered inference is unreliable when few clusters are treated (MacKinnon &amp; Webb, 2017), as in the system-by-system estimates, so every coefficient also carries a restricted wild cluster bootstrap, which re-draws the sign of each institution's residuals under the null and compares the observed statistic with that distribution (Cameron et al., 2008). In simulations on our design with six treated clusters, the clustered test rejects a true null 16 percent of the time at a nominal 5 percent level and 10 percent at a nominal 1 percent; the bootstrap rejects 10 percent and half of one percent, so its rejections at one percent are conservative while those at five percent still over-reject. System-level estimates report the number of treated clusters, and quantile coefficients carry intervals from an institution bootstrap. Several outcomes are right-skewed, so we report the conditional median alongside the conditional mean.</w:t>
       </w:r>
     </w:p>
     <w:p>
@@ -1793,25 +1793,7 @@
         <w:jc w:val="both"/>
       </w:pPr>
       <w:r>
-        <w:t xml:space="preserve">Table 2 reports the coefficient on the cooperative dummy under the four specifications, together with the conditional median counterpart of the second column and the retention ratio ρ = |β</w:t>
-      </w:r>
-      <w:r>
-        <w:rPr>
-          <w:vertAlign w:val="subscript"/>
-        </w:rPr>
-        <w:t xml:space="preserve">trim</w:t>
-      </w:r>
-      <w:r>
-        <w:t xml:space="preserve">| / |β</w:t>
-      </w:r>
-      <w:r>
-        <w:rPr>
-          <w:vertAlign w:val="subscript"/>
-        </w:rPr>
-        <w:t xml:space="preserve">raw</w:t>
-      </w:r>
-      <w:r>
-        <w:t xml:space="preserve">|.</w:t>
+        <w:t xml:space="preserve">Table 2 reports the coefficient on the cooperative dummy under the four specifications, together with the conditional median counterpart of the second column and the retention ratio ρ, the share of the raw differential that survives the restriction to common support.</w:t>
       </w:r>
     </w:p>
     <w:p>
@@ -3810,7 +3792,7 @@
         <w:jc w:val="both"/>
       </w:pPr>
       <w:r>
-        <w:t xml:space="preserve">Five of the eight quarterly outcomes keep their sign and significance across all four specifications and every winsorisation rule, including no winsorisation. Their retention ratios are above one, except for return on assets, which keeps most of its raw value. A size-composition artefact would shrink as size is held more tightly, so this pattern points away from that explanation. However, trimming also narrows the control set, and the ratio is not a formal test. By the rule of Section 3.4, credit intensity, return on assets and return volatility are stable. Capital, leverage and cost-to-income are stable in sign, while provisioning, the margin and funding are null. The capital coefficient should not be read at face value: under controls its conditional mean is about seven times its conditional median, because the mean mostly reflects the upper tail of the bank distribution, as we show below.</w:t>
+        <w:t xml:space="preserve">Five of the eight quarterly outcomes keep their sign and significance across all four specifications and every winsorisation rule, including no winsorisation. Their retention ratios are above one, except for return on assets, which keeps most of its raw value; a size-composition artefact would shrink as size is held more tightly, although the ratio is not a formal test. By the rule of Section 3.4, credit intensity, return on assets and return volatility are stable. Capital, leverage and cost-to-income are stable in sign, while provisioning, the margin and funding are null. The capital coefficient should not be read at face value: under controls its conditional mean is about seven times its conditional median, because the mean mostly reflects the upper tail of the bank distribution, as we show below.</w:t>
       </w:r>
     </w:p>
     <w:p>
@@ -3842,7 +3824,7 @@
         <w:jc w:val="both"/>
       </w:pPr>
       <w:r>
-        <w:t xml:space="preserve">The capital result requires the most care. Unconditionally, the median cooperative is better capitalised than the median bank, and Figure 6 shows the cooperative median above the bank median for most of the window. Yet the size-controlled mean differential is large and negative in every column of Table 2. Figure 4 reconciles the two: the cooperative coefficient is positive at the bottom of the conditional capital distribution and negative at the top, and it crosses zero near the fortieth percentile. Its bootstrap interval lies above zero at the twenty-fifth percentile, includes zero at the median and lies well below zero at the seventy-fifth. Averaged over the twentieth to eightieth percentiles, the differential is about a third of the conditional mean (Table 3). Unconditionally, 14 percent of bank-quarters exceed a Basel ratio of 50 percent, against 1 percent of cooperative-quarters. At equal size, what mainly separates the two groups is dispersion: residualised on size and quarter, the standard deviation of the capital ratio among cooperatives is about a third of the bank figure (online appendix), and the shaded bands of Figure 6 show the same contrast in every quarter.</w:t>
+        <w:t xml:space="preserve">The capital result requires the most care. Unconditionally, the median cooperative is better capitalised than the median bank, and Figure 6 shows the cooperative median above the bank median for most of the window. Yet the size-controlled mean differential is large and negative in every column of Table 2. Figure 4 reconciles the two: the cooperative coefficient is positive at the bottom of the conditional capital distribution and negative at the top, and it crosses zero near the fortieth percentile. Averaged over the twentieth to eightieth percentiles, the differential is about a third of the conditional mean (Table 3). Unconditionally, 14 percent of bank-quarters exceed a Basel ratio of 50 percent, against 1 percent of cooperative-quarters. At equal size, what mainly separates the two groups is dispersion: residualised on size and quarter, the standard deviation of the capital ratio among cooperatives is about a third of the bank figure (online appendix), and the shaded bands of Figure 6 show the same contrast in every quarter.</w:t>
       </w:r>
     </w:p>
     <w:p>
@@ -5670,7 +5652,7 @@
         <w:jc w:val="both"/>
       </w:pPr>
       <w:r>
-        <w:t xml:space="preserve">We examine two possible explanations of the bank upper tail. The first is reporting level. The tail sits among the banks that report individually, whose ninetieth percentile is far above that of the consolidations. The controlled gap against them is about four times the gap against the consolidations and has the same sign-crossing shape. Against the consolidations the gap is marginal, with a positive median coefficient (online appendix). The second is business model. Requiring a bank to be deposit-funded in every quarter, the structural rung, roughly halves both the share of bank-quarters above 50 percent and the estimated mean gap, which remains significant (Figure 5). The evidence is consistent with the bank upper tail being concentrated among small standalone banks with little risk-weighted exposure. Against banks that lend and take deposits, the capital difference consists of a modest gap in level and a large gap in dispersion.</w:t>
+        <w:t xml:space="preserve">We examine two possible explanations of the bank upper tail. The first is reporting level. The tail sits among the banks that report individually, whose ninetieth percentile is far above that of the consolidations. The controlled gap against them is about four times the gap against the consolidations (online appendix). The second is business model. Requiring a bank to be deposit-funded in every quarter, the structural rung, roughly halves both the share of bank-quarters above 50 percent and the estimated mean gap, which remains significant (Figure 5). The evidence is consistent with the bank upper tail being concentrated among small standalone banks with little risk-weighted exposure. Against banks that lend and take deposits, the capital difference consists of a modest gap in level and a large gap in dispersion.</w:t>
       </w:r>
     </w:p>
     <w:p>
@@ -5785,7 +5767,1369 @@
         <w:jc w:val="both"/>
       </w:pPr>
       <w:r>
-        <w:t xml:space="preserve">Figure 5 re-estimates every outcome on five rungs: the broad group, banks, banks within macro-region, commercial banks and structural banks. Return on assets, cost-to-income and return volatility keep their sign on every rung and hold at one percent on all of them except the within-region comparison, where the first two hold at five percent. Credit intensity holds at one percent on the four national rungs and is not distinguishable from zero within region (Section 4.3). Dropping the sector's two cooperative-owned banks changes every coefficient by 1.3 percent or less, apart from the provisioning coefficient, which stays within 0.0002 of zero. Two results that appear against the broad group disappear against banks.</w:t>
+        <w:t xml:space="preserve">Table 4 states which differentials survive against which comparison group, and Figure 5 shows their size and precision on the same five rungs: the broad group, banks, banks within macro-region, commercial banks and structural banks. Return on assets, cost-to-income and return volatility survive on every rung; credit intensity survives on the four national rungs and not within region (Section 4.3). Dropping the sector's two cooperative-owned banks changes every coefficient by 1.3 percent or less, apart from the provisioning coefficient, which stays within 0.0002 of zero. Two results that appear against the broad group disappear against banks.</w:t>
+      </w:r>
+    </w:p>
+    <w:p>
+      <w:pPr>
+        <w:pStyle w:val="TablaImagen-Ttulo"/>
+        <w:keepNext/>
+        <w:keepLines/>
+        <w:spacing w:before="200" w:after="60"/>
+      </w:pPr>
+      <w:r>
+        <w:rPr>
+          <w:b/>
+          <w:bCs/>
+        </w:rPr>
+        <w:t xml:space="preserve">Table 4. </w:t>
+      </w:r>
+      <w:r>
+        <w:t xml:space="preserve">What survives against which comparison group</w:t>
+      </w:r>
+    </w:p>
+    <w:tbl>
+      <w:tblPr>
+        <w:tblW w:w="7598" w:type="dxa"/>
+        <w:jc w:val="center"/>
+        <w:tblBorders>
+          <w:top w:val="nil"/>
+          <w:left w:val="nil"/>
+          <w:bottom w:val="nil"/>
+          <w:right w:val="nil"/>
+          <w:insideH w:val="nil"/>
+          <w:insideV w:val="nil"/>
+        </w:tblBorders>
+        <w:tblLayout w:type="fixed"/>
+        <w:tblCellMar>
+          <w:left w:w="40" w:type="dxa"/>
+          <w:right w:w="40" w:type="dxa"/>
+        </w:tblCellMar>
+        <w:tblLook w:val="0000" w:firstRow="0" w:lastRow="0" w:firstColumn="0" w:lastColumn="0" w:noHBand="0" w:noVBand="0"/>
+      </w:tblPr>
+      <w:tblGrid>
+        <w:gridCol w:w="1500"/>
+        <w:gridCol w:w="1219"/>
+        <w:gridCol w:w="1219"/>
+        <w:gridCol w:w="1219"/>
+        <w:gridCol w:w="1219"/>
+        <w:gridCol w:w="1222"/>
+      </w:tblGrid>
+      <w:tr>
+        <w:trPr>
+          <w:tblHeader/>
+        </w:trPr>
+        <w:tc>
+          <w:tcPr>
+            <w:tcW w:w="1500" w:type="dxa"/>
+            <w:tcBorders>
+              <w:top w:val="single" w:sz="8" w:space="0" w:color="auto"/>
+              <w:bottom w:val="single" w:sz="4" w:space="0" w:color="auto"/>
+            </w:tcBorders>
+          </w:tcPr>
+          <w:p>
+            <w:pPr>
+              <w:spacing w:before="20" w:after="20" w:line="240" w:lineRule="auto"/>
+              <w:jc w:val="left"/>
+            </w:pPr>
+            <w:r>
+              <w:rPr>
+                <w:sz w:val="15"/>
+                <w:szCs w:val="15"/>
+              </w:rPr>
+              <w:t xml:space="preserve">Outcome</w:t>
+            </w:r>
+          </w:p>
+        </w:tc>
+        <w:tc>
+          <w:tcPr>
+            <w:tcW w:w="1219" w:type="dxa"/>
+            <w:tcBorders>
+              <w:top w:val="single" w:sz="8" w:space="0" w:color="auto"/>
+              <w:bottom w:val="single" w:sz="4" w:space="0" w:color="auto"/>
+            </w:tcBorders>
+          </w:tcPr>
+          <w:p>
+            <w:pPr>
+              <w:spacing w:before="20" w:after="20" w:line="240" w:lineRule="auto"/>
+              <w:jc w:val="center"/>
+            </w:pPr>
+            <w:r>
+              <w:rPr>
+                <w:sz w:val="15"/>
+                <w:szCs w:val="15"/>
+              </w:rPr>
+              <w:t xml:space="preserve">All non-coop.</w:t>
+            </w:r>
+          </w:p>
+        </w:tc>
+        <w:tc>
+          <w:tcPr>
+            <w:tcW w:w="1219" w:type="dxa"/>
+            <w:tcBorders>
+              <w:top w:val="single" w:sz="8" w:space="0" w:color="auto"/>
+              <w:bottom w:val="single" w:sz="4" w:space="0" w:color="auto"/>
+            </w:tcBorders>
+          </w:tcPr>
+          <w:p>
+            <w:pPr>
+              <w:spacing w:before="20" w:after="20" w:line="240" w:lineRule="auto"/>
+              <w:jc w:val="center"/>
+            </w:pPr>
+            <w:r>
+              <w:rPr>
+                <w:sz w:val="15"/>
+                <w:szCs w:val="15"/>
+              </w:rPr>
+              <w:t xml:space="preserve">Banks</w:t>
+            </w:r>
+          </w:p>
+        </w:tc>
+        <w:tc>
+          <w:tcPr>
+            <w:tcW w:w="1219" w:type="dxa"/>
+            <w:tcBorders>
+              <w:top w:val="single" w:sz="8" w:space="0" w:color="auto"/>
+              <w:bottom w:val="single" w:sz="4" w:space="0" w:color="auto"/>
+            </w:tcBorders>
+          </w:tcPr>
+          <w:p>
+            <w:pPr>
+              <w:spacing w:before="20" w:after="20" w:line="240" w:lineRule="auto"/>
+              <w:jc w:val="center"/>
+            </w:pPr>
+            <w:r>
+              <w:rPr>
+                <w:sz w:val="15"/>
+                <w:szCs w:val="15"/>
+              </w:rPr>
+              <w:t xml:space="preserve">Within region</w:t>
+            </w:r>
+          </w:p>
+        </w:tc>
+        <w:tc>
+          <w:tcPr>
+            <w:tcW w:w="1219" w:type="dxa"/>
+            <w:tcBorders>
+              <w:top w:val="single" w:sz="8" w:space="0" w:color="auto"/>
+              <w:bottom w:val="single" w:sz="4" w:space="0" w:color="auto"/>
+            </w:tcBorders>
+          </w:tcPr>
+          <w:p>
+            <w:pPr>
+              <w:spacing w:before="20" w:after="20" w:line="240" w:lineRule="auto"/>
+              <w:jc w:val="center"/>
+            </w:pPr>
+            <w:r>
+              <w:rPr>
+                <w:sz w:val="15"/>
+                <w:szCs w:val="15"/>
+              </w:rPr>
+              <w:t xml:space="preserve">Commercial</w:t>
+            </w:r>
+          </w:p>
+        </w:tc>
+        <w:tc>
+          <w:tcPr>
+            <w:tcW w:w="1222" w:type="dxa"/>
+            <w:tcBorders>
+              <w:top w:val="single" w:sz="8" w:space="0" w:color="auto"/>
+              <w:bottom w:val="single" w:sz="4" w:space="0" w:color="auto"/>
+            </w:tcBorders>
+          </w:tcPr>
+          <w:p>
+            <w:pPr>
+              <w:spacing w:before="20" w:after="20" w:line="240" w:lineRule="auto"/>
+              <w:jc w:val="center"/>
+            </w:pPr>
+            <w:r>
+              <w:rPr>
+                <w:sz w:val="15"/>
+                <w:szCs w:val="15"/>
+              </w:rPr>
+              <w:t xml:space="preserve">Structural</w:t>
+            </w:r>
+          </w:p>
+        </w:tc>
+      </w:tr>
+      <w:tr>
+        <w:trPr>
+          <w:cantSplit/>
+        </w:trPr>
+        <w:tc>
+          <w:tcPr>
+            <w:tcW w:w="1500" w:type="dxa"/>
+          </w:tcPr>
+          <w:p>
+            <w:pPr>
+              <w:spacing w:before="20" w:after="20" w:line="240" w:lineRule="auto"/>
+              <w:jc w:val="left"/>
+            </w:pPr>
+            <w:r>
+              <w:rPr>
+                <w:sz w:val="15"/>
+                <w:szCs w:val="15"/>
+              </w:rPr>
+              <w:t xml:space="preserve">Basel capital ratio (pp)</w:t>
+            </w:r>
+          </w:p>
+        </w:tc>
+        <w:tc>
+          <w:tcPr>
+            <w:tcW w:w="1219" w:type="dxa"/>
+          </w:tcPr>
+          <w:p>
+            <w:pPr>
+              <w:spacing w:before="20" w:after="20" w:line="240" w:lineRule="auto"/>
+              <w:jc w:val="center"/>
+            </w:pPr>
+            <w:r>
+              <w:rPr>
+                <w:sz w:val="15"/>
+                <w:szCs w:val="15"/>
+              </w:rPr>
+              <w:t xml:space="preserve">−</w:t>
+            </w:r>
+          </w:p>
+        </w:tc>
+        <w:tc>
+          <w:tcPr>
+            <w:tcW w:w="1219" w:type="dxa"/>
+          </w:tcPr>
+          <w:p>
+            <w:pPr>
+              <w:spacing w:before="20" w:after="20" w:line="240" w:lineRule="auto"/>
+              <w:jc w:val="center"/>
+            </w:pPr>
+            <w:r>
+              <w:rPr>
+                <w:sz w:val="15"/>
+                <w:szCs w:val="15"/>
+              </w:rPr>
+              <w:t xml:space="preserve">−</w:t>
+            </w:r>
+          </w:p>
+        </w:tc>
+        <w:tc>
+          <w:tcPr>
+            <w:tcW w:w="1219" w:type="dxa"/>
+          </w:tcPr>
+          <w:p>
+            <w:pPr>
+              <w:spacing w:before="20" w:after="20" w:line="240" w:lineRule="auto"/>
+              <w:jc w:val="center"/>
+            </w:pPr>
+            <w:r>
+              <w:rPr>
+                <w:sz w:val="15"/>
+                <w:szCs w:val="15"/>
+              </w:rPr>
+              <w:t xml:space="preserve">−</w:t>
+            </w:r>
+          </w:p>
+        </w:tc>
+        <w:tc>
+          <w:tcPr>
+            <w:tcW w:w="1219" w:type="dxa"/>
+          </w:tcPr>
+          <w:p>
+            <w:pPr>
+              <w:spacing w:before="20" w:after="20" w:line="240" w:lineRule="auto"/>
+              <w:jc w:val="center"/>
+            </w:pPr>
+            <w:r>
+              <w:rPr>
+                <w:sz w:val="15"/>
+                <w:szCs w:val="15"/>
+              </w:rPr>
+              <w:t xml:space="preserve">−</w:t>
+            </w:r>
+          </w:p>
+        </w:tc>
+        <w:tc>
+          <w:tcPr>
+            <w:tcW w:w="1222" w:type="dxa"/>
+          </w:tcPr>
+          <w:p>
+            <w:pPr>
+              <w:spacing w:before="20" w:after="20" w:line="240" w:lineRule="auto"/>
+              <w:jc w:val="center"/>
+            </w:pPr>
+            <w:r>
+              <w:rPr>
+                <w:sz w:val="15"/>
+                <w:szCs w:val="15"/>
+              </w:rPr>
+              <w:t xml:space="preserve">−</w:t>
+            </w:r>
+          </w:p>
+        </w:tc>
+      </w:tr>
+      <w:tr>
+        <w:trPr>
+          <w:cantSplit/>
+        </w:trPr>
+        <w:tc>
+          <w:tcPr>
+            <w:tcW w:w="1500" w:type="dxa"/>
+          </w:tcPr>
+          <w:p>
+            <w:pPr>
+              <w:spacing w:before="20" w:after="20" w:line="240" w:lineRule="auto"/>
+              <w:jc w:val="left"/>
+            </w:pPr>
+            <w:r>
+              <w:rPr>
+                <w:sz w:val="15"/>
+                <w:szCs w:val="15"/>
+              </w:rPr>
+              <w:t xml:space="preserve">Leverage</w:t>
+            </w:r>
+          </w:p>
+        </w:tc>
+        <w:tc>
+          <w:tcPr>
+            <w:tcW w:w="1219" w:type="dxa"/>
+          </w:tcPr>
+          <w:p>
+            <w:pPr>
+              <w:spacing w:before="20" w:after="20" w:line="240" w:lineRule="auto"/>
+              <w:jc w:val="center"/>
+            </w:pPr>
+            <w:r>
+              <w:rPr>
+                <w:sz w:val="15"/>
+                <w:szCs w:val="15"/>
+              </w:rPr>
+              <w:t xml:space="preserve"> + </w:t>
+            </w:r>
+          </w:p>
+        </w:tc>
+        <w:tc>
+          <w:tcPr>
+            <w:tcW w:w="1219" w:type="dxa"/>
+          </w:tcPr>
+          <w:p>
+            <w:pPr>
+              <w:spacing w:before="20" w:after="20" w:line="240" w:lineRule="auto"/>
+              <w:jc w:val="center"/>
+            </w:pPr>
+            <w:r>
+              <w:rPr>
+                <w:sz w:val="15"/>
+                <w:szCs w:val="15"/>
+              </w:rPr>
+              <w:t xml:space="preserve"> + </w:t>
+            </w:r>
+          </w:p>
+        </w:tc>
+        <w:tc>
+          <w:tcPr>
+            <w:tcW w:w="1219" w:type="dxa"/>
+          </w:tcPr>
+          <w:p>
+            <w:pPr>
+              <w:spacing w:before="20" w:after="20" w:line="240" w:lineRule="auto"/>
+              <w:jc w:val="center"/>
+            </w:pPr>
+            <w:r>
+              <w:rPr>
+                <w:sz w:val="15"/>
+                <w:szCs w:val="15"/>
+              </w:rPr>
+              <w:t xml:space="preserve"> + </w:t>
+            </w:r>
+          </w:p>
+        </w:tc>
+        <w:tc>
+          <w:tcPr>
+            <w:tcW w:w="1219" w:type="dxa"/>
+          </w:tcPr>
+          <w:p>
+            <w:pPr>
+              <w:spacing w:before="20" w:after="20" w:line="240" w:lineRule="auto"/>
+              <w:jc w:val="center"/>
+            </w:pPr>
+            <w:r>
+              <w:rPr>
+                <w:sz w:val="15"/>
+                <w:szCs w:val="15"/>
+              </w:rPr>
+              <w:t xml:space="preserve"> + </w:t>
+            </w:r>
+          </w:p>
+        </w:tc>
+        <w:tc>
+          <w:tcPr>
+            <w:tcW w:w="1222" w:type="dxa"/>
+          </w:tcPr>
+          <w:p>
+            <w:pPr>
+              <w:spacing w:before="20" w:after="20" w:line="240" w:lineRule="auto"/>
+              <w:jc w:val="center"/>
+            </w:pPr>
+            <w:r>
+              <w:rPr>
+                <w:sz w:val="15"/>
+                <w:szCs w:val="15"/>
+              </w:rPr>
+              <w:t xml:space="preserve"> + </w:t>
+            </w:r>
+          </w:p>
+        </w:tc>
+      </w:tr>
+      <w:tr>
+        <w:trPr>
+          <w:cantSplit/>
+        </w:trPr>
+        <w:tc>
+          <w:tcPr>
+            <w:tcW w:w="1500" w:type="dxa"/>
+          </w:tcPr>
+          <w:p>
+            <w:pPr>
+              <w:spacing w:before="20" w:after="20" w:line="240" w:lineRule="auto"/>
+              <w:jc w:val="left"/>
+            </w:pPr>
+            <w:r>
+              <w:rPr>
+                <w:sz w:val="15"/>
+                <w:szCs w:val="15"/>
+              </w:rPr>
+              <w:t xml:space="preserve">Return on assets</w:t>
+            </w:r>
+          </w:p>
+        </w:tc>
+        <w:tc>
+          <w:tcPr>
+            <w:tcW w:w="1219" w:type="dxa"/>
+          </w:tcPr>
+          <w:p>
+            <w:pPr>
+              <w:spacing w:before="20" w:after="20" w:line="240" w:lineRule="auto"/>
+              <w:jc w:val="center"/>
+            </w:pPr>
+            <w:r>
+              <w:rPr>
+                <w:sz w:val="15"/>
+                <w:szCs w:val="15"/>
+              </w:rPr>
+              <w:t xml:space="preserve"> + </w:t>
+            </w:r>
+          </w:p>
+        </w:tc>
+        <w:tc>
+          <w:tcPr>
+            <w:tcW w:w="1219" w:type="dxa"/>
+          </w:tcPr>
+          <w:p>
+            <w:pPr>
+              <w:spacing w:before="20" w:after="20" w:line="240" w:lineRule="auto"/>
+              <w:jc w:val="center"/>
+            </w:pPr>
+            <w:r>
+              <w:rPr>
+                <w:sz w:val="15"/>
+                <w:szCs w:val="15"/>
+              </w:rPr>
+              <w:t xml:space="preserve"> + </w:t>
+            </w:r>
+          </w:p>
+        </w:tc>
+        <w:tc>
+          <w:tcPr>
+            <w:tcW w:w="1219" w:type="dxa"/>
+          </w:tcPr>
+          <w:p>
+            <w:pPr>
+              <w:spacing w:before="20" w:after="20" w:line="240" w:lineRule="auto"/>
+              <w:jc w:val="center"/>
+            </w:pPr>
+            <w:r>
+              <w:rPr>
+                <w:sz w:val="15"/>
+                <w:szCs w:val="15"/>
+              </w:rPr>
+              <w:t xml:space="preserve"> + </w:t>
+            </w:r>
+          </w:p>
+        </w:tc>
+        <w:tc>
+          <w:tcPr>
+            <w:tcW w:w="1219" w:type="dxa"/>
+          </w:tcPr>
+          <w:p>
+            <w:pPr>
+              <w:spacing w:before="20" w:after="20" w:line="240" w:lineRule="auto"/>
+              <w:jc w:val="center"/>
+            </w:pPr>
+            <w:r>
+              <w:rPr>
+                <w:sz w:val="15"/>
+                <w:szCs w:val="15"/>
+              </w:rPr>
+              <w:t xml:space="preserve"> + </w:t>
+            </w:r>
+          </w:p>
+        </w:tc>
+        <w:tc>
+          <w:tcPr>
+            <w:tcW w:w="1222" w:type="dxa"/>
+          </w:tcPr>
+          <w:p>
+            <w:pPr>
+              <w:spacing w:before="20" w:after="20" w:line="240" w:lineRule="auto"/>
+              <w:jc w:val="center"/>
+            </w:pPr>
+            <w:r>
+              <w:rPr>
+                <w:sz w:val="15"/>
+                <w:szCs w:val="15"/>
+              </w:rPr>
+              <w:t xml:space="preserve"> + </w:t>
+            </w:r>
+          </w:p>
+        </w:tc>
+      </w:tr>
+      <w:tr>
+        <w:trPr>
+          <w:cantSplit/>
+        </w:trPr>
+        <w:tc>
+          <w:tcPr>
+            <w:tcW w:w="1500" w:type="dxa"/>
+          </w:tcPr>
+          <w:p>
+            <w:pPr>
+              <w:spacing w:before="20" w:after="20" w:line="240" w:lineRule="auto"/>
+              <w:jc w:val="left"/>
+            </w:pPr>
+            <w:r>
+              <w:rPr>
+                <w:sz w:val="15"/>
+                <w:szCs w:val="15"/>
+              </w:rPr>
+              <w:t xml:space="preserve">Cost-to-income ratio</w:t>
+            </w:r>
+          </w:p>
+        </w:tc>
+        <w:tc>
+          <w:tcPr>
+            <w:tcW w:w="1219" w:type="dxa"/>
+          </w:tcPr>
+          <w:p>
+            <w:pPr>
+              <w:spacing w:before="20" w:after="20" w:line="240" w:lineRule="auto"/>
+              <w:jc w:val="center"/>
+            </w:pPr>
+            <w:r>
+              <w:rPr>
+                <w:sz w:val="15"/>
+                <w:szCs w:val="15"/>
+              </w:rPr>
+              <w:t xml:space="preserve">−</w:t>
+            </w:r>
+          </w:p>
+        </w:tc>
+        <w:tc>
+          <w:tcPr>
+            <w:tcW w:w="1219" w:type="dxa"/>
+          </w:tcPr>
+          <w:p>
+            <w:pPr>
+              <w:spacing w:before="20" w:after="20" w:line="240" w:lineRule="auto"/>
+              <w:jc w:val="center"/>
+            </w:pPr>
+            <w:r>
+              <w:rPr>
+                <w:sz w:val="15"/>
+                <w:szCs w:val="15"/>
+              </w:rPr>
+              <w:t xml:space="preserve">−</w:t>
+            </w:r>
+          </w:p>
+        </w:tc>
+        <w:tc>
+          <w:tcPr>
+            <w:tcW w:w="1219" w:type="dxa"/>
+          </w:tcPr>
+          <w:p>
+            <w:pPr>
+              <w:spacing w:before="20" w:after="20" w:line="240" w:lineRule="auto"/>
+              <w:jc w:val="center"/>
+            </w:pPr>
+            <w:r>
+              <w:rPr>
+                <w:sz w:val="15"/>
+                <w:szCs w:val="15"/>
+              </w:rPr>
+              <w:t xml:space="preserve">−</w:t>
+            </w:r>
+          </w:p>
+        </w:tc>
+        <w:tc>
+          <w:tcPr>
+            <w:tcW w:w="1219" w:type="dxa"/>
+          </w:tcPr>
+          <w:p>
+            <w:pPr>
+              <w:spacing w:before="20" w:after="20" w:line="240" w:lineRule="auto"/>
+              <w:jc w:val="center"/>
+            </w:pPr>
+            <w:r>
+              <w:rPr>
+                <w:sz w:val="15"/>
+                <w:szCs w:val="15"/>
+              </w:rPr>
+              <w:t xml:space="preserve">−</w:t>
+            </w:r>
+          </w:p>
+        </w:tc>
+        <w:tc>
+          <w:tcPr>
+            <w:tcW w:w="1222" w:type="dxa"/>
+          </w:tcPr>
+          <w:p>
+            <w:pPr>
+              <w:spacing w:before="20" w:after="20" w:line="240" w:lineRule="auto"/>
+              <w:jc w:val="center"/>
+            </w:pPr>
+            <w:r>
+              <w:rPr>
+                <w:sz w:val="15"/>
+                <w:szCs w:val="15"/>
+              </w:rPr>
+              <w:t xml:space="preserve">−</w:t>
+            </w:r>
+          </w:p>
+        </w:tc>
+      </w:tr>
+      <w:tr>
+        <w:trPr>
+          <w:cantSplit/>
+        </w:trPr>
+        <w:tc>
+          <w:tcPr>
+            <w:tcW w:w="1500" w:type="dxa"/>
+          </w:tcPr>
+          <w:p>
+            <w:pPr>
+              <w:spacing w:before="20" w:after="20" w:line="240" w:lineRule="auto"/>
+              <w:jc w:val="left"/>
+            </w:pPr>
+            <w:r>
+              <w:rPr>
+                <w:sz w:val="15"/>
+                <w:szCs w:val="15"/>
+              </w:rPr>
+              <w:t xml:space="preserve">Credit portfolio / assets</w:t>
+            </w:r>
+          </w:p>
+        </w:tc>
+        <w:tc>
+          <w:tcPr>
+            <w:tcW w:w="1219" w:type="dxa"/>
+          </w:tcPr>
+          <w:p>
+            <w:pPr>
+              <w:spacing w:before="20" w:after="20" w:line="240" w:lineRule="auto"/>
+              <w:jc w:val="center"/>
+            </w:pPr>
+            <w:r>
+              <w:rPr>
+                <w:sz w:val="15"/>
+                <w:szCs w:val="15"/>
+              </w:rPr>
+              <w:t xml:space="preserve"> + </w:t>
+            </w:r>
+          </w:p>
+        </w:tc>
+        <w:tc>
+          <w:tcPr>
+            <w:tcW w:w="1219" w:type="dxa"/>
+          </w:tcPr>
+          <w:p>
+            <w:pPr>
+              <w:spacing w:before="20" w:after="20" w:line="240" w:lineRule="auto"/>
+              <w:jc w:val="center"/>
+            </w:pPr>
+            <w:r>
+              <w:rPr>
+                <w:sz w:val="15"/>
+                <w:szCs w:val="15"/>
+              </w:rPr>
+              <w:t xml:space="preserve"> + </w:t>
+            </w:r>
+          </w:p>
+        </w:tc>
+        <w:tc>
+          <w:tcPr>
+            <w:tcW w:w="1219" w:type="dxa"/>
+          </w:tcPr>
+          <w:p>
+            <w:pPr>
+              <w:spacing w:before="20" w:after="20" w:line="240" w:lineRule="auto"/>
+              <w:jc w:val="center"/>
+            </w:pPr>
+            <w:r>
+              <w:rPr>
+                <w:sz w:val="15"/>
+                <w:szCs w:val="15"/>
+              </w:rPr>
+              <w:t xml:space="preserve">·</w:t>
+            </w:r>
+          </w:p>
+        </w:tc>
+        <w:tc>
+          <w:tcPr>
+            <w:tcW w:w="1219" w:type="dxa"/>
+          </w:tcPr>
+          <w:p>
+            <w:pPr>
+              <w:spacing w:before="20" w:after="20" w:line="240" w:lineRule="auto"/>
+              <w:jc w:val="center"/>
+            </w:pPr>
+            <w:r>
+              <w:rPr>
+                <w:sz w:val="15"/>
+                <w:szCs w:val="15"/>
+              </w:rPr>
+              <w:t xml:space="preserve"> + </w:t>
+            </w:r>
+          </w:p>
+        </w:tc>
+        <w:tc>
+          <w:tcPr>
+            <w:tcW w:w="1222" w:type="dxa"/>
+          </w:tcPr>
+          <w:p>
+            <w:pPr>
+              <w:spacing w:before="20" w:after="20" w:line="240" w:lineRule="auto"/>
+              <w:jc w:val="center"/>
+            </w:pPr>
+            <w:r>
+              <w:rPr>
+                <w:sz w:val="15"/>
+                <w:szCs w:val="15"/>
+              </w:rPr>
+              <w:t xml:space="preserve"> + </w:t>
+            </w:r>
+          </w:p>
+        </w:tc>
+      </w:tr>
+      <w:tr>
+        <w:trPr>
+          <w:cantSplit/>
+        </w:trPr>
+        <w:tc>
+          <w:tcPr>
+            <w:tcW w:w="1500" w:type="dxa"/>
+          </w:tcPr>
+          <w:p>
+            <w:pPr>
+              <w:spacing w:before="20" w:after="20" w:line="240" w:lineRule="auto"/>
+              <w:jc w:val="left"/>
+            </w:pPr>
+            <w:r>
+              <w:rPr>
+                <w:sz w:val="15"/>
+                <w:szCs w:val="15"/>
+              </w:rPr>
+              <w:t xml:space="preserve">Provisioning ratio</w:t>
+            </w:r>
+          </w:p>
+        </w:tc>
+        <w:tc>
+          <w:tcPr>
+            <w:tcW w:w="1219" w:type="dxa"/>
+          </w:tcPr>
+          <w:p>
+            <w:pPr>
+              <w:spacing w:before="20" w:after="20" w:line="240" w:lineRule="auto"/>
+              <w:jc w:val="center"/>
+            </w:pPr>
+            <w:r>
+              <w:rPr>
+                <w:sz w:val="15"/>
+                <w:szCs w:val="15"/>
+              </w:rPr>
+              <w:t xml:space="preserve">−</w:t>
+            </w:r>
+          </w:p>
+        </w:tc>
+        <w:tc>
+          <w:tcPr>
+            <w:tcW w:w="1219" w:type="dxa"/>
+          </w:tcPr>
+          <w:p>
+            <w:pPr>
+              <w:spacing w:before="20" w:after="20" w:line="240" w:lineRule="auto"/>
+              <w:jc w:val="center"/>
+            </w:pPr>
+            <w:r>
+              <w:rPr>
+                <w:sz w:val="15"/>
+                <w:szCs w:val="15"/>
+              </w:rPr>
+              <w:t xml:space="preserve">·</w:t>
+            </w:r>
+          </w:p>
+        </w:tc>
+        <w:tc>
+          <w:tcPr>
+            <w:tcW w:w="1219" w:type="dxa"/>
+          </w:tcPr>
+          <w:p>
+            <w:pPr>
+              <w:spacing w:before="20" w:after="20" w:line="240" w:lineRule="auto"/>
+              <w:jc w:val="center"/>
+            </w:pPr>
+            <w:r>
+              <w:rPr>
+                <w:sz w:val="15"/>
+                <w:szCs w:val="15"/>
+              </w:rPr>
+              <w:t xml:space="preserve">·</w:t>
+            </w:r>
+          </w:p>
+        </w:tc>
+        <w:tc>
+          <w:tcPr>
+            <w:tcW w:w="1219" w:type="dxa"/>
+          </w:tcPr>
+          <w:p>
+            <w:pPr>
+              <w:spacing w:before="20" w:after="20" w:line="240" w:lineRule="auto"/>
+              <w:jc w:val="center"/>
+            </w:pPr>
+            <w:r>
+              <w:rPr>
+                <w:sz w:val="15"/>
+                <w:szCs w:val="15"/>
+              </w:rPr>
+              <w:t xml:space="preserve">·</w:t>
+            </w:r>
+          </w:p>
+        </w:tc>
+        <w:tc>
+          <w:tcPr>
+            <w:tcW w:w="1222" w:type="dxa"/>
+          </w:tcPr>
+          <w:p>
+            <w:pPr>
+              <w:spacing w:before="20" w:after="20" w:line="240" w:lineRule="auto"/>
+              <w:jc w:val="center"/>
+            </w:pPr>
+            <w:r>
+              <w:rPr>
+                <w:sz w:val="15"/>
+                <w:szCs w:val="15"/>
+              </w:rPr>
+              <w:t xml:space="preserve">·</w:t>
+            </w:r>
+          </w:p>
+        </w:tc>
+      </w:tr>
+      <w:tr>
+        <w:trPr>
+          <w:cantSplit/>
+        </w:trPr>
+        <w:tc>
+          <w:tcPr>
+            <w:tcW w:w="1500" w:type="dxa"/>
+          </w:tcPr>
+          <w:p>
+            <w:pPr>
+              <w:spacing w:before="20" w:after="20" w:line="240" w:lineRule="auto"/>
+              <w:jc w:val="left"/>
+            </w:pPr>
+            <w:r>
+              <w:rPr>
+                <w:sz w:val="15"/>
+                <w:szCs w:val="15"/>
+              </w:rPr>
+              <w:t xml:space="preserve">Intermediation margin</w:t>
+            </w:r>
+          </w:p>
+        </w:tc>
+        <w:tc>
+          <w:tcPr>
+            <w:tcW w:w="1219" w:type="dxa"/>
+          </w:tcPr>
+          <w:p>
+            <w:pPr>
+              <w:spacing w:before="20" w:after="20" w:line="240" w:lineRule="auto"/>
+              <w:jc w:val="center"/>
+            </w:pPr>
+            <w:r>
+              <w:rPr>
+                <w:sz w:val="15"/>
+                <w:szCs w:val="15"/>
+              </w:rPr>
+              <w:t xml:space="preserve">−</w:t>
+            </w:r>
+          </w:p>
+        </w:tc>
+        <w:tc>
+          <w:tcPr>
+            <w:tcW w:w="1219" w:type="dxa"/>
+          </w:tcPr>
+          <w:p>
+            <w:pPr>
+              <w:spacing w:before="20" w:after="20" w:line="240" w:lineRule="auto"/>
+              <w:jc w:val="center"/>
+            </w:pPr>
+            <w:r>
+              <w:rPr>
+                <w:sz w:val="15"/>
+                <w:szCs w:val="15"/>
+              </w:rPr>
+              <w:t xml:space="preserve">·</w:t>
+            </w:r>
+          </w:p>
+        </w:tc>
+        <w:tc>
+          <w:tcPr>
+            <w:tcW w:w="1219" w:type="dxa"/>
+          </w:tcPr>
+          <w:p>
+            <w:pPr>
+              <w:spacing w:before="20" w:after="20" w:line="240" w:lineRule="auto"/>
+              <w:jc w:val="center"/>
+            </w:pPr>
+            <w:r>
+              <w:rPr>
+                <w:sz w:val="15"/>
+                <w:szCs w:val="15"/>
+              </w:rPr>
+              <w:t xml:space="preserve">·</w:t>
+            </w:r>
+          </w:p>
+        </w:tc>
+        <w:tc>
+          <w:tcPr>
+            <w:tcW w:w="1219" w:type="dxa"/>
+          </w:tcPr>
+          <w:p>
+            <w:pPr>
+              <w:spacing w:before="20" w:after="20" w:line="240" w:lineRule="auto"/>
+              <w:jc w:val="center"/>
+            </w:pPr>
+            <w:r>
+              <w:rPr>
+                <w:sz w:val="15"/>
+                <w:szCs w:val="15"/>
+              </w:rPr>
+              <w:t xml:space="preserve">·</w:t>
+            </w:r>
+          </w:p>
+        </w:tc>
+        <w:tc>
+          <w:tcPr>
+            <w:tcW w:w="1222" w:type="dxa"/>
+          </w:tcPr>
+          <w:p>
+            <w:pPr>
+              <w:spacing w:before="20" w:after="20" w:line="240" w:lineRule="auto"/>
+              <w:jc w:val="center"/>
+            </w:pPr>
+            <w:r>
+              <w:rPr>
+                <w:sz w:val="15"/>
+                <w:szCs w:val="15"/>
+              </w:rPr>
+              <w:t xml:space="preserve"> + </w:t>
+            </w:r>
+          </w:p>
+        </w:tc>
+      </w:tr>
+      <w:tr>
+        <w:trPr>
+          <w:cantSplit/>
+        </w:trPr>
+        <w:tc>
+          <w:tcPr>
+            <w:tcW w:w="1500" w:type="dxa"/>
+            <w:tcBorders>
+              <w:bottom w:val="single" w:sz="4" w:space="0" w:color="auto"/>
+            </w:tcBorders>
+          </w:tcPr>
+          <w:p>
+            <w:pPr>
+              <w:spacing w:before="20" w:after="20" w:line="240" w:lineRule="auto"/>
+              <w:jc w:val="left"/>
+            </w:pPr>
+            <w:r>
+              <w:rPr>
+                <w:sz w:val="15"/>
+                <w:szCs w:val="15"/>
+              </w:rPr>
+              <w:t xml:space="preserve">Funding ratio</w:t>
+            </w:r>
+          </w:p>
+        </w:tc>
+        <w:tc>
+          <w:tcPr>
+            <w:tcW w:w="1219" w:type="dxa"/>
+            <w:tcBorders>
+              <w:bottom w:val="single" w:sz="4" w:space="0" w:color="auto"/>
+            </w:tcBorders>
+          </w:tcPr>
+          <w:p>
+            <w:pPr>
+              <w:spacing w:before="20" w:after="20" w:line="240" w:lineRule="auto"/>
+              <w:jc w:val="center"/>
+            </w:pPr>
+            <w:r>
+              <w:rPr>
+                <w:sz w:val="15"/>
+                <w:szCs w:val="15"/>
+              </w:rPr>
+              <w:t xml:space="preserve"> + </w:t>
+            </w:r>
+          </w:p>
+        </w:tc>
+        <w:tc>
+          <w:tcPr>
+            <w:tcW w:w="1219" w:type="dxa"/>
+            <w:tcBorders>
+              <w:bottom w:val="single" w:sz="4" w:space="0" w:color="auto"/>
+            </w:tcBorders>
+          </w:tcPr>
+          <w:p>
+            <w:pPr>
+              <w:spacing w:before="20" w:after="20" w:line="240" w:lineRule="auto"/>
+              <w:jc w:val="center"/>
+            </w:pPr>
+            <w:r>
+              <w:rPr>
+                <w:sz w:val="15"/>
+                <w:szCs w:val="15"/>
+              </w:rPr>
+              <w:t xml:space="preserve"> + </w:t>
+            </w:r>
+          </w:p>
+        </w:tc>
+        <w:tc>
+          <w:tcPr>
+            <w:tcW w:w="1219" w:type="dxa"/>
+            <w:tcBorders>
+              <w:bottom w:val="single" w:sz="4" w:space="0" w:color="auto"/>
+            </w:tcBorders>
+          </w:tcPr>
+          <w:p>
+            <w:pPr>
+              <w:spacing w:before="20" w:after="20" w:line="240" w:lineRule="auto"/>
+              <w:jc w:val="center"/>
+            </w:pPr>
+            <w:r>
+              <w:rPr>
+                <w:sz w:val="15"/>
+                <w:szCs w:val="15"/>
+              </w:rPr>
+              <w:t xml:space="preserve">·</w:t>
+            </w:r>
+          </w:p>
+        </w:tc>
+        <w:tc>
+          <w:tcPr>
+            <w:tcW w:w="1219" w:type="dxa"/>
+            <w:tcBorders>
+              <w:bottom w:val="single" w:sz="4" w:space="0" w:color="auto"/>
+            </w:tcBorders>
+          </w:tcPr>
+          <w:p>
+            <w:pPr>
+              <w:spacing w:before="20" w:after="20" w:line="240" w:lineRule="auto"/>
+              <w:jc w:val="center"/>
+            </w:pPr>
+            <w:r>
+              <w:rPr>
+                <w:sz w:val="15"/>
+                <w:szCs w:val="15"/>
+              </w:rPr>
+              <w:t xml:space="preserve">·</w:t>
+            </w:r>
+          </w:p>
+        </w:tc>
+        <w:tc>
+          <w:tcPr>
+            <w:tcW w:w="1222" w:type="dxa"/>
+            <w:tcBorders>
+              <w:bottom w:val="single" w:sz="4" w:space="0" w:color="auto"/>
+            </w:tcBorders>
+          </w:tcPr>
+          <w:p>
+            <w:pPr>
+              <w:spacing w:before="20" w:after="20" w:line="240" w:lineRule="auto"/>
+              <w:jc w:val="center"/>
+            </w:pPr>
+            <w:r>
+              <w:rPr>
+                <w:sz w:val="15"/>
+                <w:szCs w:val="15"/>
+              </w:rPr>
+              <w:t xml:space="preserve">·</w:t>
+            </w:r>
+          </w:p>
+        </w:tc>
+      </w:tr>
+      <w:tr>
+        <w:trPr>
+          <w:cantSplit/>
+        </w:trPr>
+        <w:tc>
+          <w:tcPr>
+            <w:tcW w:w="1500" w:type="dxa"/>
+          </w:tcPr>
+          <w:p>
+            <w:pPr>
+              <w:spacing w:before="20" w:after="20" w:line="240" w:lineRule="auto"/>
+              <w:jc w:val="left"/>
+            </w:pPr>
+            <w:r>
+              <w:rPr>
+                <w:sz w:val="15"/>
+                <w:szCs w:val="15"/>
+              </w:rPr>
+              <w:t xml:space="preserve">Return on assets volatility</w:t>
+            </w:r>
+          </w:p>
+        </w:tc>
+        <w:tc>
+          <w:tcPr>
+            <w:tcW w:w="1219" w:type="dxa"/>
+          </w:tcPr>
+          <w:p>
+            <w:pPr>
+              <w:spacing w:before="20" w:after="20" w:line="240" w:lineRule="auto"/>
+              <w:jc w:val="center"/>
+            </w:pPr>
+            <w:r>
+              <w:rPr>
+                <w:sz w:val="15"/>
+                <w:szCs w:val="15"/>
+              </w:rPr>
+              <w:t xml:space="preserve">−</w:t>
+            </w:r>
+          </w:p>
+        </w:tc>
+        <w:tc>
+          <w:tcPr>
+            <w:tcW w:w="1219" w:type="dxa"/>
+          </w:tcPr>
+          <w:p>
+            <w:pPr>
+              <w:spacing w:before="20" w:after="20" w:line="240" w:lineRule="auto"/>
+              <w:jc w:val="center"/>
+            </w:pPr>
+            <w:r>
+              <w:rPr>
+                <w:sz w:val="15"/>
+                <w:szCs w:val="15"/>
+              </w:rPr>
+              <w:t xml:space="preserve">−</w:t>
+            </w:r>
+          </w:p>
+        </w:tc>
+        <w:tc>
+          <w:tcPr>
+            <w:tcW w:w="1219" w:type="dxa"/>
+          </w:tcPr>
+          <w:p>
+            <w:pPr>
+              <w:spacing w:before="20" w:after="20" w:line="240" w:lineRule="auto"/>
+              <w:jc w:val="center"/>
+            </w:pPr>
+            <w:r>
+              <w:rPr>
+                <w:sz w:val="15"/>
+                <w:szCs w:val="15"/>
+              </w:rPr>
+              <w:t xml:space="preserve">−</w:t>
+            </w:r>
+          </w:p>
+        </w:tc>
+        <w:tc>
+          <w:tcPr>
+            <w:tcW w:w="1219" w:type="dxa"/>
+          </w:tcPr>
+          <w:p>
+            <w:pPr>
+              <w:spacing w:before="20" w:after="20" w:line="240" w:lineRule="auto"/>
+              <w:jc w:val="center"/>
+            </w:pPr>
+            <w:r>
+              <w:rPr>
+                <w:sz w:val="15"/>
+                <w:szCs w:val="15"/>
+              </w:rPr>
+              <w:t xml:space="preserve">−</w:t>
+            </w:r>
+          </w:p>
+        </w:tc>
+        <w:tc>
+          <w:tcPr>
+            <w:tcW w:w="1222" w:type="dxa"/>
+          </w:tcPr>
+          <w:p>
+            <w:pPr>
+              <w:spacing w:before="20" w:after="20" w:line="240" w:lineRule="auto"/>
+              <w:jc w:val="center"/>
+            </w:pPr>
+            <w:r>
+              <w:rPr>
+                <w:sz w:val="15"/>
+                <w:szCs w:val="15"/>
+              </w:rPr>
+              <w:t xml:space="preserve">−</w:t>
+            </w:r>
+          </w:p>
+        </w:tc>
+      </w:tr>
+      <w:tr>
+        <w:trPr>
+          <w:cantSplit/>
+        </w:trPr>
+        <w:tc>
+          <w:tcPr>
+            <w:tcW w:w="1500" w:type="dxa"/>
+            <w:tcBorders>
+              <w:bottom w:val="single" w:sz="8" w:space="0" w:color="auto"/>
+            </w:tcBorders>
+          </w:tcPr>
+          <w:p>
+            <w:pPr>
+              <w:spacing w:before="20" w:after="20" w:line="240" w:lineRule="auto"/>
+              <w:jc w:val="left"/>
+            </w:pPr>
+            <w:r>
+              <w:rPr>
+                <w:sz w:val="15"/>
+                <w:szCs w:val="15"/>
+              </w:rPr>
+              <w:t xml:space="preserve">Z-score</w:t>
+            </w:r>
+          </w:p>
+        </w:tc>
+        <w:tc>
+          <w:tcPr>
+            <w:tcW w:w="1219" w:type="dxa"/>
+            <w:tcBorders>
+              <w:bottom w:val="single" w:sz="8" w:space="0" w:color="auto"/>
+            </w:tcBorders>
+          </w:tcPr>
+          <w:p>
+            <w:pPr>
+              <w:spacing w:before="20" w:after="20" w:line="240" w:lineRule="auto"/>
+              <w:jc w:val="center"/>
+            </w:pPr>
+            <w:r>
+              <w:rPr>
+                <w:sz w:val="15"/>
+                <w:szCs w:val="15"/>
+              </w:rPr>
+              <w:t xml:space="preserve"> + </w:t>
+            </w:r>
+          </w:p>
+        </w:tc>
+        <w:tc>
+          <w:tcPr>
+            <w:tcW w:w="1219" w:type="dxa"/>
+            <w:tcBorders>
+              <w:bottom w:val="single" w:sz="8" w:space="0" w:color="auto"/>
+            </w:tcBorders>
+          </w:tcPr>
+          <w:p>
+            <w:pPr>
+              <w:spacing w:before="20" w:after="20" w:line="240" w:lineRule="auto"/>
+              <w:jc w:val="center"/>
+            </w:pPr>
+            <w:r>
+              <w:rPr>
+                <w:sz w:val="15"/>
+                <w:szCs w:val="15"/>
+              </w:rPr>
+              <w:t xml:space="preserve"> + </w:t>
+            </w:r>
+          </w:p>
+        </w:tc>
+        <w:tc>
+          <w:tcPr>
+            <w:tcW w:w="1219" w:type="dxa"/>
+            <w:tcBorders>
+              <w:bottom w:val="single" w:sz="8" w:space="0" w:color="auto"/>
+            </w:tcBorders>
+          </w:tcPr>
+          <w:p>
+            <w:pPr>
+              <w:spacing w:before="20" w:after="20" w:line="240" w:lineRule="auto"/>
+              <w:jc w:val="center"/>
+            </w:pPr>
+            <w:r>
+              <w:rPr>
+                <w:sz w:val="15"/>
+                <w:szCs w:val="15"/>
+              </w:rPr>
+              <w:t xml:space="preserve">·</w:t>
+            </w:r>
+          </w:p>
+        </w:tc>
+        <w:tc>
+          <w:tcPr>
+            <w:tcW w:w="1219" w:type="dxa"/>
+            <w:tcBorders>
+              <w:bottom w:val="single" w:sz="8" w:space="0" w:color="auto"/>
+            </w:tcBorders>
+          </w:tcPr>
+          <w:p>
+            <w:pPr>
+              <w:spacing w:before="20" w:after="20" w:line="240" w:lineRule="auto"/>
+              <w:jc w:val="center"/>
+            </w:pPr>
+            <w:r>
+              <w:rPr>
+                <w:sz w:val="15"/>
+                <w:szCs w:val="15"/>
+              </w:rPr>
+              <w:t xml:space="preserve"> + </w:t>
+            </w:r>
+          </w:p>
+        </w:tc>
+        <w:tc>
+          <w:tcPr>
+            <w:tcW w:w="1222" w:type="dxa"/>
+            <w:tcBorders>
+              <w:bottom w:val="single" w:sz="8" w:space="0" w:color="auto"/>
+            </w:tcBorders>
+          </w:tcPr>
+          <w:p>
+            <w:pPr>
+              <w:spacing w:before="20" w:after="20" w:line="240" w:lineRule="auto"/>
+              <w:jc w:val="center"/>
+            </w:pPr>
+            <w:r>
+              <w:rPr>
+                <w:sz w:val="15"/>
+                <w:szCs w:val="15"/>
+              </w:rPr>
+              <w:t xml:space="preserve"> + </w:t>
+            </w:r>
+          </w:p>
+        </w:tc>
+      </w:tr>
+    </w:tbl>
+    <w:p>
+      <w:pPr>
+        <w:spacing w:before="60" w:after="200" w:line="240" w:lineRule="auto"/>
+        <w:jc w:val="both"/>
+      </w:pPr>
+      <w:r>
+        <w:rPr>
+          <w:sz w:val="16"/>
+          <w:szCs w:val="16"/>
+        </w:rPr>
+        <w:t xml:space="preserve">Sign of the cooperative coefficient where it is significant at five percent, a dot otherwise. Controlled specification; within region uses the matched specification. HC3 errors for the last two rows.</w:t>
       </w:r>
     </w:p>
     <w:p>
@@ -5944,7 +7288,7 @@
         <w:jc w:val="both"/>
       </w:pPr>
       <w:r>
-        <w:t xml:space="preserve">Against all non-cooperatives, cooperatives appear to provision less, significant at one percent in all four specifications, while against banks the coefficient is close to zero. The broad-group gap comes from the non-banking lenders, whose provisioning ratios are nearly three times those of banks and cooperatives; the institutions that do not lend barely enter, since fewer than five percent of their quarters carry the ratio. At the conditional median the sign reverses, with cooperatives provisioning more, and under the tightest winsorisation rule the mean coefficient also turns positive and significant. Supervisory concern attaches to capital, so we also split the sample into terciles of the Basel ratio. No tercile shows cooperatives provisioning less: on the unconditional ratio the differential is positive and significant only in the middle tercile, where most cooperative quarters sit, and on the ratio residualised on size and quarter no tercile differs. Because minimum provisions are a step function of the AA to H rating of each operation, the result most likely describes how the two groups classify their books.</w:t>
+        <w:t xml:space="preserve">Against all non-cooperatives, cooperatives appear to provision less, significant at one percent in all four specifications, while against banks the coefficient is close to zero. The broad-group gap comes from the non-banking lenders, whose provisioning ratios are nearly three times those of banks and cooperatives. At the conditional median the sign reverses, with cooperatives provisioning more, and under the tightest winsorisation rule the mean coefficient also turns positive and significant. Supervisory concern attaches to capital, so we also split the sample into terciles of the Basel ratio. No tercile shows cooperatives provisioning less: on the unconditional ratio the differential is positive and significant only in the middle tercile, where most cooperative quarters sit, and on the ratio residualised on size and quarter no tercile differs. Because minimum provisions are a step function of the AA to H rating of each operation, the result most likely describes how the two groups classify their books.</w:t>
       </w:r>
       <w:r>
         <w:rPr>
@@ -6014,7 +7358,7 @@
         <w:jc w:val="both"/>
       </w:pPr>
       <w:r>
-        <w:t xml:space="preserve">The online appendix splits the cooperative side by system. Sicredi and Sicoob account for all but seven of the cooperatives, so the split describes those two networks and cannot test network affiliation as such. Cooperatives in both networks hold less regulatory capital than comparable banks, significant under the bootstrap in each. The six independents rest on five treated clusters, three of which supply nearly all the quarters. Their capital estimate is positive and cannot be separated from noise.</w:t>
+        <w:t xml:space="preserve">The online appendix splits the cooperative side by system. Sicredi and Sicoob account for all but seven of the cooperatives, so the split describes those two networks and cannot test network affiliation as such. Cooperatives in both networks hold less regulatory capital than comparable banks, significant under the bootstrap in each. The six independents rest on five treated clusters, and their capital estimate is positive and cannot be separated from noise.</w:t>
       </w:r>
     </w:p>
     <w:p>
@@ -6089,7 +7433,7 @@
         <w:jc w:val="both"/>
       </w:pPr>
       <w:r>
-        <w:t xml:space="preserve">The online appendix reports the conditional medians and the specification without the eleven S1 and S2 banks, which moves no significant coefficient by more than two percent. In addition, it reports a split at the January 2022 replacement of the 2013 capital rules. Every surviving result keeps its sign and significance in both subperiods, and provisioning and the margin remain null in both. Magnitudes are roughly a fifth smaller after 2022, so the comparison under a common methodology holds across the methodology's own revision. Four winsorisation rules, re-estimation on the rows where provisioning is observed, and dropping the six cooperatives that revert to the simplified methodology leave every surviving sign unchanged. The weighted and unweighted matched-sample estimates differ by less than the sampling error; the largest difference is for the capital ratio, where the weighted estimand is two percentage points larger. All results come from one script run on the public IF.data files, with every comparison group, coarsening, winsorisation rule and check as a parameter, and the tables are generated from its output.</w:t>
+        <w:t xml:space="preserve">The online appendix reports the conditional medians and the specification without the eleven S1 and S2 banks, which moves no significant coefficient by more than two percent. In addition, it reports a split at the January 2022 replacement of the 2013 capital rules. Every surviving result keeps its sign and significance in both subperiods, and provisioning and the margin remain null in both. Magnitudes are roughly a fifth smaller after 2022. Four winsorisation rules, re-estimation on the rows where provisioning is observed, and dropping the six cooperatives that revert to the simplified methodology leave every surviving sign unchanged. The weighted and unweighted matched-sample estimates differ by less than the sampling error. All results come from one script run on the public IF.data files, with every comparison group, coarsening, winsorisation rule and check as a parameter, and the tables are generated from its output.</w:t>
       </w:r>
     </w:p>
     <w:p>
@@ -6169,7 +7513,7 @@
         <w:jc w:val="both"/>
       </w:pPr>
       <w:r>
-        <w:t xml:space="preserve">Six limitations bound the claims. Because cooperative status is time-invariant, the estimates are conditional correlations. The full-methodology restriction selects the largest cooperatives, and the results generalise only to that subpopulation. The provisioning ratio is an accounting variable and does not measure delinquency. The stability outcomes are institution-level statistics on a subsample, estimated without quarter effects. Most systems are too thinly represented for separate inference, and the network backstop hypothesis needs consolidated network data that IF.data does not carry. The mediator question in Section 4.3 also needs a market measure finer than macro-region, and IF.data's credit-modality modules, which carry rural credit, are the natural next step. Finally, we attempted a within-institution design around the adoption of the full methodology and do not report one. Adoption is driven by growth, growth moves every balance-sheet ratio continuously, and pre-adoption trends run through the adoption date without a break, so the threshold crossing does not identify a regime effect.</w:t>
+        <w:t xml:space="preserve">Six limitations bound the claims. Because cooperative status is time-invariant, the estimates are conditional correlations. The full-methodology restriction selects the largest cooperatives, and the results generalise only to that subpopulation. The provisioning ratio is an accounting variable and does not measure delinquency. The stability outcomes are institution-level statistics on a subsample, estimated without quarter effects. Most systems are too thinly represented for separate inference, and the network backstop hypothesis needs consolidated network data that IF.data does not carry. The mediator question in Section 4.3 also needs a market measure finer than macro-region, and IF.data's credit-modality modules, which carry rural credit, are the natural next step. Finally, a within-institution design around the adoption of the full methodology does not identify a regime effect: adoption follows growth, which moves every balance-sheet ratio continuously, and pre-adoption trends run through the adoption date without a break.</w:t>
       </w:r>
     </w:p>
     <w:p>
@@ -6193,7 +7537,7 @@
         <w:jc w:val="both"/>
       </w:pPr>
       <w:r>
-        <w:t xml:space="preserve">This paper characterises cooperative behaviour under full Basel-style regulation in a large emerging market, on the full population of full-methodology institutions. The substantive contribution is this profile, together with two nulls that correct claims the same data appear to support under a looser comparison group. The methodological contribution is a protocol that defines peers on the regulator's own categories, reports a ladder of comparison groups, and separates sector-wide from within-market differences. It also states how cumulative flows were converted to rates, reports the matched estimand, and prints treated cluster counts beside system-level </w:t>
+        <w:t xml:space="preserve">This paper characterises cooperative behaviour under full Basel-style regulation in a large emerging market, on the full population of full-methodology institutions. The substantive contribution is this profile, together with two nulls that correct claims the same data appear to support under a looser comparison group. The methodological contribution is a protocol that defines peers on the regulator's own categories, reports a ladder of comparison groups, and separates sector-wide from within-market differences. It also states how cumulative flows were converted to rates, reports the matched estimand and prints treated cluster counts beside system-level </w:t>
       </w:r>
       <w:r>
         <w:rPr>
@@ -6203,7 +7547,7 @@
         <w:t xml:space="preserve">p</w:t>
       </w:r>
       <w:r>
-        <w:t xml:space="preserve">-values. Each step is inexpensive, and in our data each changed at least one conclusion.</w:t>
+        <w:t xml:space="preserve">-values; each step is inexpensive, and each changed at least one conclusion.</w:t>
       </w:r>
     </w:p>
     <w:p>
@@ -6219,7 +7563,31 @@
         <w:jc w:val="both"/>
       </w:pPr>
       <w:r>
-        <w:t xml:space="preserve">For the cooperative movement, the difference between the two forms persists under a common prudential methodology, in a narrower form than a loose comparison suggests. Our evidence does not support a case resting on cooperatives provisioning more conservatively than banks. A case resting on cost at the median and on return stability holds against every definition of a bank we tried; one resting on the return on assets holds after tax, and before tax the gap is smaller and not established. One resting on credit intensity holds against the national bank population but has not been shown within regional markets.</w:t>
+        <w:t xml:space="preserve">For the cooperative movement, the difference between the two forms persists under a common prudential methodology, in a narrower form than a loose comparison suggests. Our evidence does not support a case resting on cooperatives provisioning more conservatively than banks. A case resting on cost at the median and on return stability holds against every definition of a bank we tried; one resting on the return on assets holds after tax, and before tax the gap is smaller and not established. One resting on credit intensity holds against the national bank population but has not been shown within regional markets; the territorial claim is the one these data cannot yet settle, and the rural-credit modules of IF.data are the next step.</w:t>
+      </w:r>
+    </w:p>
+    <w:p>
+      <w:pPr>
+        <w:pStyle w:val="Heading2"/>
+        <w:keepNext/>
+        <w:keepLines/>
+        <w:numPr>
+          <w:ilvl w:val="0"/>
+          <w:numId w:val="0"/>
+        </w:numPr>
+        <w:spacing w:before="200" w:after="80"/>
+        <w:ind w:left="0" w:firstLine="0"/>
+      </w:pPr>
+      <w:r>
+        <w:t xml:space="preserve">6.1 Declaration</w:t>
+      </w:r>
+    </w:p>
+    <w:p>
+      <w:pPr>
+        <w:jc w:val="both"/>
+      </w:pPr>
+      <w:r>
+        <w:t xml:space="preserve">The authors work at the Organization of Brazilian Cooperatives (OCB System), which represents the cooperative sector in Brazil. The study uses public data and a public reproduction pipeline, and the views expressed are the authors' own.</w:t>
       </w:r>
     </w:p>
     <w:p>
@@ -6249,7 +7617,7 @@
           <w:sz w:val="18"/>
           <w:szCs w:val="18"/>
         </w:rPr>
-        <w:t xml:space="preserve">Abadie, A., Athey, S., Imbens, G. W., &amp; Wooldridge, J. M. (2023). When should you adjust standard errors for clustering? </w:t>
+        <w:t xml:space="preserve">Ayres, I., &amp; Braithwaite, J. (1992). </w:t>
       </w:r>
       <w:r>
         <w:rPr>
@@ -6258,30 +7626,14 @@
           <w:sz w:val="18"/>
           <w:szCs w:val="18"/>
         </w:rPr>
-        <w:t xml:space="preserve">Quarterly Journal of Economics</w:t>
-      </w:r>
-      <w:r>
-        <w:rPr>
-          <w:sz w:val="18"/>
-          <w:szCs w:val="18"/>
-        </w:rPr>
-        <w:t xml:space="preserve">, </w:t>
-      </w:r>
-      <w:r>
-        <w:rPr>
-          <w:i/>
-          <w:iCs/>
-          <w:sz w:val="18"/>
-          <w:szCs w:val="18"/>
-        </w:rPr>
-        <w:t xml:space="preserve">138</w:t>
-      </w:r>
-      <w:r>
-        <w:rPr>
-          <w:sz w:val="18"/>
-          <w:szCs w:val="18"/>
-        </w:rPr>
-        <w:t xml:space="preserve">(1), 1–35. https://doi.org/10.1093/qje/qjac038</w:t>
+        <w:t xml:space="preserve">Responsive regulation: Transcending the deregulation debate</w:t>
+      </w:r>
+      <w:r>
+        <w:rPr>
+          <w:sz w:val="18"/>
+          <w:szCs w:val="18"/>
+        </w:rPr>
+        <w:t xml:space="preserve">. Oxford University Press.</w:t>
       </w:r>
     </w:p>
     <w:p>
@@ -6295,7 +7647,7 @@
           <w:sz w:val="18"/>
           <w:szCs w:val="18"/>
         </w:rPr>
-        <w:t xml:space="preserve">Ayres, I., &amp; Braithwaite, J. (1992). </w:t>
+        <w:t xml:space="preserve">Baldwin, R., &amp; Black, J. (2008). Really responsive regulation. </w:t>
       </w:r>
       <w:r>
         <w:rPr>
@@ -6304,14 +7656,30 @@
           <w:sz w:val="18"/>
           <w:szCs w:val="18"/>
         </w:rPr>
-        <w:t xml:space="preserve">Responsive regulation: Transcending the deregulation debate</w:t>
-      </w:r>
-      <w:r>
-        <w:rPr>
-          <w:sz w:val="18"/>
-          <w:szCs w:val="18"/>
-        </w:rPr>
-        <w:t xml:space="preserve">. Oxford University Press.</w:t>
+        <w:t xml:space="preserve">Modern Law Review</w:t>
+      </w:r>
+      <w:r>
+        <w:rPr>
+          <w:sz w:val="18"/>
+          <w:szCs w:val="18"/>
+        </w:rPr>
+        <w:t xml:space="preserve">, </w:t>
+      </w:r>
+      <w:r>
+        <w:rPr>
+          <w:i/>
+          <w:iCs/>
+          <w:sz w:val="18"/>
+          <w:szCs w:val="18"/>
+        </w:rPr>
+        <w:t xml:space="preserve">71</w:t>
+      </w:r>
+      <w:r>
+        <w:rPr>
+          <w:sz w:val="18"/>
+          <w:szCs w:val="18"/>
+        </w:rPr>
+        <w:t xml:space="preserve">(1), 59–94. https://doi.org/10.1111/j.1468-2230.2008.00681.x</w:t>
       </w:r>
     </w:p>
     <w:p>
@@ -6325,7 +7693,7 @@
           <w:sz w:val="18"/>
           <w:szCs w:val="18"/>
         </w:rPr>
-        <w:t xml:space="preserve">Baldwin, R., &amp; Black, J. (2008). Really responsive regulation. </w:t>
+        <w:t xml:space="preserve">Banco Central do Brasil. (2025). </w:t>
       </w:r>
       <w:r>
         <w:rPr>
@@ -6334,30 +7702,14 @@
           <w:sz w:val="18"/>
           <w:szCs w:val="18"/>
         </w:rPr>
-        <w:t xml:space="preserve">Modern Law Review</w:t>
-      </w:r>
-      <w:r>
-        <w:rPr>
-          <w:sz w:val="18"/>
-          <w:szCs w:val="18"/>
-        </w:rPr>
-        <w:t xml:space="preserve">, </w:t>
-      </w:r>
-      <w:r>
-        <w:rPr>
-          <w:i/>
-          <w:iCs/>
-          <w:sz w:val="18"/>
-          <w:szCs w:val="18"/>
-        </w:rPr>
-        <w:t xml:space="preserve">71</w:t>
-      </w:r>
-      <w:r>
-        <w:rPr>
-          <w:sz w:val="18"/>
-          <w:szCs w:val="18"/>
-        </w:rPr>
-        <w:t xml:space="preserve">(1), 59–94. https://doi.org/10.1111/j.1468-2230.2008.00681.x</w:t>
+        <w:t xml:space="preserve">Panorama do Sistema Nacional de Crédito Cooperativo: data-base dezembro de 2024</w:t>
+      </w:r>
+      <w:r>
+        <w:rPr>
+          <w:sz w:val="18"/>
+          <w:szCs w:val="18"/>
+        </w:rPr>
+        <w:t xml:space="preserve">. </w:t>
       </w:r>
     </w:p>
     <w:p>
@@ -6371,7 +7723,7 @@
           <w:sz w:val="18"/>
           <w:szCs w:val="18"/>
         </w:rPr>
-        <w:t xml:space="preserve">Banco Central do Brasil. (2025). </w:t>
+        <w:t xml:space="preserve">Banco Central do Brasil. (2026). </w:t>
       </w:r>
       <w:r>
         <w:rPr>
@@ -6380,7 +7732,7 @@
           <w:sz w:val="18"/>
           <w:szCs w:val="18"/>
         </w:rPr>
-        <w:t xml:space="preserve">Panorama do Sistema Nacional de Crédito Cooperativo: data-base dezembro de 2024</w:t>
+        <w:t xml:space="preserve">Panorama do Sistema Nacional de Crédito Cooperativo: data-base dezembro de 2025</w:t>
       </w:r>
       <w:r>
         <w:rPr>
@@ -6401,7 +7753,7 @@
           <w:sz w:val="18"/>
           <w:szCs w:val="18"/>
         </w:rPr>
-        <w:t xml:space="preserve">Banco Central do Brasil. (2026). </w:t>
+        <w:t xml:space="preserve">Basel Committee on Banking Supervision. (2011). </w:t>
       </w:r>
       <w:r>
         <w:rPr>
@@ -6410,14 +7762,14 @@
           <w:sz w:val="18"/>
           <w:szCs w:val="18"/>
         </w:rPr>
-        <w:t xml:space="preserve">Panorama do Sistema Nacional de Crédito Cooperativo: data-base dezembro de 2025</w:t>
-      </w:r>
-      <w:r>
-        <w:rPr>
-          <w:sz w:val="18"/>
-          <w:szCs w:val="18"/>
-        </w:rPr>
-        <w:t xml:space="preserve">. </w:t>
+        <w:t xml:space="preserve">Basel III: A global regulatory framework for more resilient banks and banking systems</w:t>
+      </w:r>
+      <w:r>
+        <w:rPr>
+          <w:sz w:val="18"/>
+          <w:szCs w:val="18"/>
+        </w:rPr>
+        <w:t xml:space="preserve">. Bank for International Settlements. </w:t>
       </w:r>
     </w:p>
     <w:p>
@@ -6431,7 +7783,7 @@
           <w:sz w:val="18"/>
           <w:szCs w:val="18"/>
         </w:rPr>
-        <w:t xml:space="preserve">Basel Committee on Banking Supervision. (2011). </w:t>
+        <w:t xml:space="preserve">Basel Committee on Banking Supervision. (2019). </w:t>
       </w:r>
       <w:r>
         <w:rPr>
@@ -6440,7 +7792,7 @@
           <w:sz w:val="18"/>
           <w:szCs w:val="18"/>
         </w:rPr>
-        <w:t xml:space="preserve">Basel III: A global regulatory framework for more resilient banks and banking systems</w:t>
+        <w:t xml:space="preserve">Proportionality in bank regulation and supervision: A survey on current practices</w:t>
       </w:r>
       <w:r>
         <w:rPr>
@@ -6461,7 +7813,7 @@
           <w:sz w:val="18"/>
           <w:szCs w:val="18"/>
         </w:rPr>
-        <w:t xml:space="preserve">Basel Committee on Banking Supervision. (2019). </w:t>
+        <w:t xml:space="preserve">Becchetti, L., Ciciretti, R., &amp; Paolantonio, A. (2016). The cooperative bank difference before and after the global financial crisis. </w:t>
       </w:r>
       <w:r>
         <w:rPr>
@@ -6470,14 +7822,30 @@
           <w:sz w:val="18"/>
           <w:szCs w:val="18"/>
         </w:rPr>
-        <w:t xml:space="preserve">Proportionality in bank regulation and supervision: A survey on current practices</w:t>
-      </w:r>
-      <w:r>
-        <w:rPr>
-          <w:sz w:val="18"/>
-          <w:szCs w:val="18"/>
-        </w:rPr>
-        <w:t xml:space="preserve">. Bank for International Settlements. </w:t>
+        <w:t xml:space="preserve">Journal of International Money and Finance</w:t>
+      </w:r>
+      <w:r>
+        <w:rPr>
+          <w:sz w:val="18"/>
+          <w:szCs w:val="18"/>
+        </w:rPr>
+        <w:t xml:space="preserve">, </w:t>
+      </w:r>
+      <w:r>
+        <w:rPr>
+          <w:i/>
+          <w:iCs/>
+          <w:sz w:val="18"/>
+          <w:szCs w:val="18"/>
+        </w:rPr>
+        <w:t xml:space="preserve">69</w:t>
+      </w:r>
+      <w:r>
+        <w:rPr>
+          <w:sz w:val="18"/>
+          <w:szCs w:val="18"/>
+        </w:rPr>
+        <w:t xml:space="preserve">, 224–246. https://doi.org/10.1016/j.jimonfin.2016.06.016</w:t>
       </w:r>
     </w:p>
     <w:p>
@@ -6491,7 +7859,7 @@
           <w:sz w:val="18"/>
           <w:szCs w:val="18"/>
         </w:rPr>
-        <w:t xml:space="preserve">Becchetti, L., Ciciretti, R., &amp; Paolantonio, A. (2016). The cooperative bank difference before and after the global financial crisis. </w:t>
+        <w:t xml:space="preserve">Brasil. (2009). </w:t>
       </w:r>
       <w:r>
         <w:rPr>
@@ -6500,30 +7868,14 @@
           <w:sz w:val="18"/>
           <w:szCs w:val="18"/>
         </w:rPr>
-        <w:t xml:space="preserve">Journal of International Money and Finance</w:t>
-      </w:r>
-      <w:r>
-        <w:rPr>
-          <w:sz w:val="18"/>
-          <w:szCs w:val="18"/>
-        </w:rPr>
-        <w:t xml:space="preserve">, </w:t>
-      </w:r>
-      <w:r>
-        <w:rPr>
-          <w:i/>
-          <w:iCs/>
-          <w:sz w:val="18"/>
-          <w:szCs w:val="18"/>
-        </w:rPr>
-        <w:t xml:space="preserve">69</w:t>
-      </w:r>
-      <w:r>
-        <w:rPr>
-          <w:sz w:val="18"/>
-          <w:szCs w:val="18"/>
-        </w:rPr>
-        <w:t xml:space="preserve">, 224–246. https://doi.org/10.1016/j.jimonfin.2016.06.016</w:t>
+        <w:t xml:space="preserve">Lei Complementar nº 130, de 17 de abril de 2009. Dispõe sobre o Sistema Nacional de Crédito Cooperativo</w:t>
+      </w:r>
+      <w:r>
+        <w:rPr>
+          <w:sz w:val="18"/>
+          <w:szCs w:val="18"/>
+        </w:rPr>
+        <w:t xml:space="preserve">. Diário Oficial da União. https://www.planalto.gov.br/ccivil_03/leis/lcp/lcp130.htm</w:t>
       </w:r>
     </w:p>
     <w:p>
@@ -6537,7 +7889,7 @@
           <w:sz w:val="18"/>
           <w:szCs w:val="18"/>
         </w:rPr>
-        <w:t xml:space="preserve">Beck, T., Hesse, H., Kick, T., &amp; von Westernhagen, N. (2009). </w:t>
+        <w:t xml:space="preserve">Bressan, V. G. F., Braga, M. J., Bressan, A. A., &amp; Resende Filho, M. de A. (2011). Uma aplicação do sistema PEARLS às cooperativas de crédito brasileiras. </w:t>
       </w:r>
       <w:r>
         <w:rPr>
@@ -6546,14 +7898,30 @@
           <w:sz w:val="18"/>
           <w:szCs w:val="18"/>
         </w:rPr>
-        <w:t xml:space="preserve">Bank ownership and stability: Evidence from Germany</w:t>
-      </w:r>
-      <w:r>
-        <w:rPr>
-          <w:sz w:val="18"/>
-          <w:szCs w:val="18"/>
-        </w:rPr>
-        <w:t xml:space="preserve"> [Working paper]. Deutsche Bundesbank.</w:t>
+        <w:t xml:space="preserve">Revista de Administração (RAUSP)</w:t>
+      </w:r>
+      <w:r>
+        <w:rPr>
+          <w:sz w:val="18"/>
+          <w:szCs w:val="18"/>
+        </w:rPr>
+        <w:t xml:space="preserve">, </w:t>
+      </w:r>
+      <w:r>
+        <w:rPr>
+          <w:i/>
+          <w:iCs/>
+          <w:sz w:val="18"/>
+          <w:szCs w:val="18"/>
+        </w:rPr>
+        <w:t xml:space="preserve">46</w:t>
+      </w:r>
+      <w:r>
+        <w:rPr>
+          <w:sz w:val="18"/>
+          <w:szCs w:val="18"/>
+        </w:rPr>
+        <w:t xml:space="preserve">(3), 258–274. https://doi.org/10.1590/S0080-21072011000300005</w:t>
       </w:r>
     </w:p>
     <w:p>
@@ -6567,7 +7935,7 @@
           <w:sz w:val="18"/>
           <w:szCs w:val="18"/>
         </w:rPr>
-        <w:t xml:space="preserve">Brasil. (2009). </w:t>
+        <w:t xml:space="preserve">Cameron, A. C., Gelbach, J. B., &amp; Miller, D. L. (2008). Bootstrap-based improvements for inference with clustered errors. </w:t>
       </w:r>
       <w:r>
         <w:rPr>
@@ -6576,14 +7944,30 @@
           <w:sz w:val="18"/>
           <w:szCs w:val="18"/>
         </w:rPr>
-        <w:t xml:space="preserve">Lei Complementar nº 130, de 17 de abril de 2009. Dispõe sobre o Sistema Nacional de Crédito Cooperativo</w:t>
-      </w:r>
-      <w:r>
-        <w:rPr>
-          <w:sz w:val="18"/>
-          <w:szCs w:val="18"/>
-        </w:rPr>
-        <w:t xml:space="preserve">. Diário Oficial da União. https://www.planalto.gov.br/ccivil_03/leis/lcp/lcp130.htm</w:t>
+        <w:t xml:space="preserve">Review of Economics and Statistics</w:t>
+      </w:r>
+      <w:r>
+        <w:rPr>
+          <w:sz w:val="18"/>
+          <w:szCs w:val="18"/>
+        </w:rPr>
+        <w:t xml:space="preserve">, </w:t>
+      </w:r>
+      <w:r>
+        <w:rPr>
+          <w:i/>
+          <w:iCs/>
+          <w:sz w:val="18"/>
+          <w:szCs w:val="18"/>
+        </w:rPr>
+        <w:t xml:space="preserve">90</w:t>
+      </w:r>
+      <w:r>
+        <w:rPr>
+          <w:sz w:val="18"/>
+          <w:szCs w:val="18"/>
+        </w:rPr>
+        <w:t xml:space="preserve">(3), 414–427. https://doi.org/10.1162/rest.90.3.414</w:t>
       </w:r>
     </w:p>
     <w:p>
@@ -6597,7 +7981,7 @@
           <w:sz w:val="18"/>
           <w:szCs w:val="18"/>
         </w:rPr>
-        <w:t xml:space="preserve">Bressan, V. G. F., Braga, M. J., Bressan, A. A., &amp; Resende Filho, M. de A. (2011). Uma aplicação do sistema PEARLS às cooperativas de crédito brasileiras. </w:t>
+        <w:t xml:space="preserve">Cameron, A. C., &amp; Miller, D. L. (2015). A practitioner's guide to cluster-robust inference. </w:t>
       </w:r>
       <w:r>
         <w:rPr>
@@ -6606,7 +7990,7 @@
           <w:sz w:val="18"/>
           <w:szCs w:val="18"/>
         </w:rPr>
-        <w:t xml:space="preserve">Revista de Administração (RAUSP)</w:t>
+        <w:t xml:space="preserve">Journal of Human Resources</w:t>
       </w:r>
       <w:r>
         <w:rPr>
@@ -6622,14 +8006,14 @@
           <w:sz w:val="18"/>
           <w:szCs w:val="18"/>
         </w:rPr>
-        <w:t xml:space="preserve">46</w:t>
-      </w:r>
-      <w:r>
-        <w:rPr>
-          <w:sz w:val="18"/>
-          <w:szCs w:val="18"/>
-        </w:rPr>
-        <w:t xml:space="preserve">(3), 258–274. https://doi.org/10.1590/S0080-21072011000300005</w:t>
+        <w:t xml:space="preserve">50</w:t>
+      </w:r>
+      <w:r>
+        <w:rPr>
+          <w:sz w:val="18"/>
+          <w:szCs w:val="18"/>
+        </w:rPr>
+        <w:t xml:space="preserve">(2), 317–372. https://doi.org/10.3368/jhr.50.2.317</w:t>
       </w:r>
     </w:p>
     <w:p>
@@ -6643,7 +8027,7 @@
           <w:sz w:val="18"/>
           <w:szCs w:val="18"/>
         </w:rPr>
-        <w:t xml:space="preserve">Cameron, A. C., Gelbach, J. B., &amp; Miller, D. L. (2008). Bootstrap-based improvements for inference with clustered errors. </w:t>
+        <w:t xml:space="preserve">Carvalho, F. L. de, Diaz, M. D. M., Bialoskorski Neto, S., &amp; Kalatzis, A. E. G. (2015). Exit and failure of credit unions in Brazil: A risk analysis. </w:t>
       </w:r>
       <w:r>
         <w:rPr>
@@ -6652,7 +8036,7 @@
           <w:sz w:val="18"/>
           <w:szCs w:val="18"/>
         </w:rPr>
-        <w:t xml:space="preserve">Review of Economics and Statistics</w:t>
+        <w:t xml:space="preserve">Revista Contabilidade &amp; Finanças</w:t>
       </w:r>
       <w:r>
         <w:rPr>
@@ -6668,14 +8052,14 @@
           <w:sz w:val="18"/>
           <w:szCs w:val="18"/>
         </w:rPr>
-        <w:t xml:space="preserve">90</w:t>
-      </w:r>
-      <w:r>
-        <w:rPr>
-          <w:sz w:val="18"/>
-          <w:szCs w:val="18"/>
-        </w:rPr>
-        <w:t xml:space="preserve">(3), 414–427. https://doi.org/10.1162/rest.90.3.414</w:t>
+        <w:t xml:space="preserve">26</w:t>
+      </w:r>
+      <w:r>
+        <w:rPr>
+          <w:sz w:val="18"/>
+          <w:szCs w:val="18"/>
+        </w:rPr>
+        <w:t xml:space="preserve">(67), 70–84. https://doi.org/10.1590/1808-057x201411390</w:t>
       </w:r>
     </w:p>
     <w:p>
@@ -6689,7 +8073,7 @@
           <w:sz w:val="18"/>
           <w:szCs w:val="18"/>
         </w:rPr>
-        <w:t xml:space="preserve">Cameron, A. C., &amp; Miller, D. L. (2015). A practitioner's guide to cluster-robust inference. </w:t>
+        <w:t xml:space="preserve">Castro Carvalho, A. P., Hohl, S., Raskopf, R., &amp; Ruhnau, S. (2017). </w:t>
       </w:r>
       <w:r>
         <w:rPr>
@@ -6698,30 +8082,14 @@
           <w:sz w:val="18"/>
           <w:szCs w:val="18"/>
         </w:rPr>
-        <w:t xml:space="preserve">Journal of Human Resources</w:t>
-      </w:r>
-      <w:r>
-        <w:rPr>
-          <w:sz w:val="18"/>
-          <w:szCs w:val="18"/>
-        </w:rPr>
-        <w:t xml:space="preserve">, </w:t>
-      </w:r>
-      <w:r>
-        <w:rPr>
-          <w:i/>
-          <w:iCs/>
-          <w:sz w:val="18"/>
-          <w:szCs w:val="18"/>
-        </w:rPr>
-        <w:t xml:space="preserve">50</w:t>
-      </w:r>
-      <w:r>
-        <w:rPr>
-          <w:sz w:val="18"/>
-          <w:szCs w:val="18"/>
-        </w:rPr>
-        <w:t xml:space="preserve">(2), 317–372. https://doi.org/10.3368/jhr.50.2.317</w:t>
+        <w:t xml:space="preserve">Proportionality in banking regulation: A cross-country comparison</w:t>
+      </w:r>
+      <w:r>
+        <w:rPr>
+          <w:sz w:val="18"/>
+          <w:szCs w:val="18"/>
+        </w:rPr>
+        <w:t xml:space="preserve"> (FSI Insights on Policy Implementation No. 1). Bank for International Settlements, Financial Stability Institute. </w:t>
       </w:r>
     </w:p>
     <w:p>
@@ -6735,7 +8103,7 @@
           <w:sz w:val="18"/>
           <w:szCs w:val="18"/>
         </w:rPr>
-        <w:t xml:space="preserve">Carvalho, F. L. de, Diaz, M. D. M., Bialoskorski Neto, S., &amp; Kalatzis, A. E. G. (2015). Exit and failure of credit unions in Brazil: A risk analysis. </w:t>
+        <w:t xml:space="preserve">Coelho, R., Mazzillo, J. A., Svoronos, J.-P., &amp; Yu, T. (2019). </w:t>
       </w:r>
       <w:r>
         <w:rPr>
@@ -6744,30 +8112,14 @@
           <w:sz w:val="18"/>
           <w:szCs w:val="18"/>
         </w:rPr>
-        <w:t xml:space="preserve">Revista Contabilidade &amp; Finanças</w:t>
-      </w:r>
-      <w:r>
-        <w:rPr>
-          <w:sz w:val="18"/>
-          <w:szCs w:val="18"/>
-        </w:rPr>
-        <w:t xml:space="preserve">, </w:t>
-      </w:r>
-      <w:r>
-        <w:rPr>
-          <w:i/>
-          <w:iCs/>
-          <w:sz w:val="18"/>
-          <w:szCs w:val="18"/>
-        </w:rPr>
-        <w:t xml:space="preserve">26</w:t>
-      </w:r>
-      <w:r>
-        <w:rPr>
-          <w:sz w:val="18"/>
-          <w:szCs w:val="18"/>
-        </w:rPr>
-        <w:t xml:space="preserve">(67), 70–84. https://doi.org/10.1590/1808-057x201411390</w:t>
+        <w:t xml:space="preserve">Regulation and supervision of financial cooperatives</w:t>
+      </w:r>
+      <w:r>
+        <w:rPr>
+          <w:sz w:val="18"/>
+          <w:szCs w:val="18"/>
+        </w:rPr>
+        <w:t xml:space="preserve"> (FSI Insights on Policy Implementation No. 15). Bank for International Settlements, Financial Stability Institute. </w:t>
       </w:r>
     </w:p>
     <w:p>
@@ -6781,7 +8133,7 @@
           <w:sz w:val="18"/>
           <w:szCs w:val="18"/>
         </w:rPr>
-        <w:t xml:space="preserve">Castro Carvalho, A. P., Hohl, S., Raskopf, R., &amp; Ruhnau, S. (2017). </w:t>
+        <w:t xml:space="preserve">Conselho Monetário Nacional. (1999). </w:t>
       </w:r>
       <w:r>
         <w:rPr>
@@ -6790,14 +8142,14 @@
           <w:sz w:val="18"/>
           <w:szCs w:val="18"/>
         </w:rPr>
-        <w:t xml:space="preserve">Proportionality in banking regulation: A cross-country comparison</w:t>
-      </w:r>
-      <w:r>
-        <w:rPr>
-          <w:sz w:val="18"/>
-          <w:szCs w:val="18"/>
-        </w:rPr>
-        <w:t xml:space="preserve"> (FSI Insights on Policy Implementation No. 1). Bank for International Settlements, Financial Stability Institute. </w:t>
+        <w:t xml:space="preserve">Resolução nº 2.682, de 21 de dezembro de 1999. Critérios de classificação das operações de crédito e regras para constituição de provisão</w:t>
+      </w:r>
+      <w:r>
+        <w:rPr>
+          <w:sz w:val="18"/>
+          <w:szCs w:val="18"/>
+        </w:rPr>
+        <w:t xml:space="preserve">. Banco Central do Brasil. https://www.bcb.gov.br/pre/normativos/res/1999/pdf/res_2682_v2_L.pdf</w:t>
       </w:r>
     </w:p>
     <w:p>
@@ -6811,7 +8163,7 @@
           <w:sz w:val="18"/>
           <w:szCs w:val="18"/>
         </w:rPr>
-        <w:t xml:space="preserve">Coelho, R., Mazzillo, J. A., Svoronos, J.-P., &amp; Yu, T. (2019). </w:t>
+        <w:t xml:space="preserve">Conselho Monetário Nacional. (2015a). </w:t>
       </w:r>
       <w:r>
         <w:rPr>
@@ -6820,14 +8172,14 @@
           <w:sz w:val="18"/>
           <w:szCs w:val="18"/>
         </w:rPr>
-        <w:t xml:space="preserve">Regulation and supervision of financial cooperatives</w:t>
-      </w:r>
-      <w:r>
-        <w:rPr>
-          <w:sz w:val="18"/>
-          <w:szCs w:val="18"/>
-        </w:rPr>
-        <w:t xml:space="preserve"> (FSI Insights on Policy Implementation No. 15). Bank for International Settlements, Financial Stability Institute. </w:t>
+        <w:t xml:space="preserve">Resolução nº 4.401, de 27 de fevereiro de 2015. Requerimentos mínimos de liquidez de curto prazo (LCR)</w:t>
+      </w:r>
+      <w:r>
+        <w:rPr>
+          <w:sz w:val="18"/>
+          <w:szCs w:val="18"/>
+        </w:rPr>
+        <w:t xml:space="preserve">. Banco Central do Brasil. </w:t>
       </w:r>
     </w:p>
     <w:p>
@@ -6841,7 +8193,7 @@
           <w:sz w:val="18"/>
           <w:szCs w:val="18"/>
         </w:rPr>
-        <w:t xml:space="preserve">Conselho Monetário Nacional. (1999). </w:t>
+        <w:t xml:space="preserve">Conselho Monetário Nacional. (2015b). </w:t>
       </w:r>
       <w:r>
         <w:rPr>
@@ -6850,14 +8202,14 @@
           <w:sz w:val="18"/>
           <w:szCs w:val="18"/>
         </w:rPr>
-        <w:t xml:space="preserve">Resolução nº 2.682, de 21 de dezembro de 1999. Critérios de classificação das operações de crédito e regras para constituição de provisão</w:t>
-      </w:r>
-      <w:r>
-        <w:rPr>
-          <w:sz w:val="18"/>
-          <w:szCs w:val="18"/>
-        </w:rPr>
-        <w:t xml:space="preserve">. Banco Central do Brasil. https://www.bcb.gov.br/pre/normativos/res/1999/pdf/res_2682_v2_L.pdf</w:t>
+        <w:t xml:space="preserve">Resolução nº 4.434, de 5 de agosto de 2015. Constituição, autorização para funcionamento, funcionamento, alterações estatutárias e cancelamento de autorização para funcionamento das cooperativas de crédito</w:t>
+      </w:r>
+      <w:r>
+        <w:rPr>
+          <w:sz w:val="18"/>
+          <w:szCs w:val="18"/>
+        </w:rPr>
+        <w:t xml:space="preserve">. Banco Central do Brasil. https://normativos.bcb.gov.br/Lists/Normativos/Attachments/48507/Res_4434_v8_P.pdf</w:t>
       </w:r>
     </w:p>
     <w:p>
@@ -6871,7 +8223,7 @@
           <w:sz w:val="18"/>
           <w:szCs w:val="18"/>
         </w:rPr>
-        <w:t xml:space="preserve">Conselho Monetário Nacional. (2013a). </w:t>
+        <w:t xml:space="preserve">Conselho Monetário Nacional. (2017a). </w:t>
       </w:r>
       <w:r>
         <w:rPr>
@@ -6880,14 +8232,14 @@
           <w:sz w:val="18"/>
           <w:szCs w:val="18"/>
         </w:rPr>
-        <w:t xml:space="preserve">Resolução nº 4.192, de 1º de março de 2013. Metodologia para apuração do Patrimônio de Referência</w:t>
-      </w:r>
-      <w:r>
-        <w:rPr>
-          <w:sz w:val="18"/>
-          <w:szCs w:val="18"/>
-        </w:rPr>
-        <w:t xml:space="preserve">. Banco Central do Brasil. </w:t>
+        <w:t xml:space="preserve">Resolução nº 4.553, de 30 de janeiro de 2017. Segmentação do conjunto das instituições financeiras para fins de aplicação proporcional da regulação prudencial</w:t>
+      </w:r>
+      <w:r>
+        <w:rPr>
+          <w:sz w:val="18"/>
+          <w:szCs w:val="18"/>
+        </w:rPr>
+        <w:t xml:space="preserve">. Banco Central do Brasil. https://normativos.bcb.gov.br/Lists/Normativos/Attachments/50335/Res_4553_v2_L.pdf</w:t>
       </w:r>
     </w:p>
     <w:p>
@@ -6901,7 +8253,7 @@
           <w:sz w:val="18"/>
           <w:szCs w:val="18"/>
         </w:rPr>
-        <w:t xml:space="preserve">Conselho Monetário Nacional. (2013b). </w:t>
+        <w:t xml:space="preserve">Conselho Monetário Nacional. (2017b). </w:t>
       </w:r>
       <w:r>
         <w:rPr>
@@ -6910,14 +8262,14 @@
           <w:sz w:val="18"/>
           <w:szCs w:val="18"/>
         </w:rPr>
-        <w:t xml:space="preserve">Resolução nº 4.193, de 1º de março de 2013. Apuração dos requerimentos mínimos de Patrimônio de Referência, de Nível I e de Capital Principal e adicional de Capital Principal</w:t>
-      </w:r>
-      <w:r>
-        <w:rPr>
-          <w:sz w:val="18"/>
-          <w:szCs w:val="18"/>
-        </w:rPr>
-        <w:t xml:space="preserve">. Banco Central do Brasil. </w:t>
+        <w:t xml:space="preserve">Resolução nº 4.606, de 19 de outubro de 2017. Metodologia facultativa simplificada para apuração do requerimento mínimo de Patrimônio de Referência Simplificado (PRS5)</w:t>
+      </w:r>
+      <w:r>
+        <w:rPr>
+          <w:sz w:val="18"/>
+          <w:szCs w:val="18"/>
+        </w:rPr>
+        <w:t xml:space="preserve">. Banco Central do Brasil. https://normativos.bcb.gov.br/Lists/Normativos/Attachments/50454/Res_4606_v5_P.pdf</w:t>
       </w:r>
     </w:p>
     <w:p>
@@ -6931,7 +8283,7 @@
           <w:sz w:val="18"/>
           <w:szCs w:val="18"/>
         </w:rPr>
-        <w:t xml:space="preserve">Conselho Monetário Nacional. (2015a). </w:t>
+        <w:t xml:space="preserve">Conselho Monetário Nacional. (2017c). </w:t>
       </w:r>
       <w:r>
         <w:rPr>
@@ -6940,7 +8292,7 @@
           <w:sz w:val="18"/>
           <w:szCs w:val="18"/>
         </w:rPr>
-        <w:t xml:space="preserve">Resolução nº 4.401, de 27 de fevereiro de 2015. Requerimentos mínimos de liquidez de curto prazo (LCR)</w:t>
+        <w:t xml:space="preserve">Resolução nº 4.615, de 30 de novembro de 2017. Razão de Alavancagem</w:t>
       </w:r>
       <w:r>
         <w:rPr>
@@ -6961,7 +8313,7 @@
           <w:sz w:val="18"/>
           <w:szCs w:val="18"/>
         </w:rPr>
-        <w:t xml:space="preserve">Conselho Monetário Nacional. (2015b). </w:t>
+        <w:t xml:space="preserve">Conselho Monetário Nacional. (2017d). </w:t>
       </w:r>
       <w:r>
         <w:rPr>
@@ -6970,14 +8322,14 @@
           <w:sz w:val="18"/>
           <w:szCs w:val="18"/>
         </w:rPr>
-        <w:t xml:space="preserve">Resolução nº 4.434, de 5 de agosto de 2015. Constituição, autorização para funcionamento, funcionamento, alterações estatutárias e cancelamento de autorização para funcionamento das cooperativas de crédito</w:t>
-      </w:r>
-      <w:r>
-        <w:rPr>
-          <w:sz w:val="18"/>
-          <w:szCs w:val="18"/>
-        </w:rPr>
-        <w:t xml:space="preserve">. Banco Central do Brasil. https://normativos.bcb.gov.br/Lists/Normativos/Attachments/48507/Res_4434_v8_P.pdf</w:t>
+        <w:t xml:space="preserve">Resolução nº 4.616, de 30 de novembro de 2017. Requerimento mínimo de liquidez de longo prazo (NSFR)</w:t>
+      </w:r>
+      <w:r>
+        <w:rPr>
+          <w:sz w:val="18"/>
+          <w:szCs w:val="18"/>
+        </w:rPr>
+        <w:t xml:space="preserve">. Banco Central do Brasil. https://normativos.bcb.gov.br/Lists/Normativos/Attachments/50474/Res_4616_v1_O.pdf</w:t>
       </w:r>
     </w:p>
     <w:p>
@@ -6991,7 +8343,7 @@
           <w:sz w:val="18"/>
           <w:szCs w:val="18"/>
         </w:rPr>
-        <w:t xml:space="preserve">Conselho Monetário Nacional. (2017a). </w:t>
+        <w:t xml:space="preserve">Conselho Monetário Nacional. (2021a). </w:t>
       </w:r>
       <w:r>
         <w:rPr>
@@ -7000,14 +8352,14 @@
           <w:sz w:val="18"/>
           <w:szCs w:val="18"/>
         </w:rPr>
-        <w:t xml:space="preserve">Resolução nº 4.553, de 30 de janeiro de 2017. Segmentação do conjunto das instituições financeiras para fins de aplicação proporcional da regulação prudencial</w:t>
-      </w:r>
-      <w:r>
-        <w:rPr>
-          <w:sz w:val="18"/>
-          <w:szCs w:val="18"/>
-        </w:rPr>
-        <w:t xml:space="preserve">. Banco Central do Brasil. https://normativos.bcb.gov.br/Lists/Normativos/Attachments/50335/Res_4553_v2_L.pdf</w:t>
+        <w:t xml:space="preserve">Resolução nº 4.955, de 21 de outubro de 2021. Metodologia para apuração do Patrimônio de Referência</w:t>
+      </w:r>
+      <w:r>
+        <w:rPr>
+          <w:sz w:val="18"/>
+          <w:szCs w:val="18"/>
+        </w:rPr>
+        <w:t xml:space="preserve">. Banco Central do Brasil. </w:t>
       </w:r>
     </w:p>
     <w:p>
@@ -7021,7 +8373,7 @@
           <w:sz w:val="18"/>
           <w:szCs w:val="18"/>
         </w:rPr>
-        <w:t xml:space="preserve">Conselho Monetário Nacional. (2017b). </w:t>
+        <w:t xml:space="preserve">Conselho Monetário Nacional. (2021b). </w:t>
       </w:r>
       <w:r>
         <w:rPr>
@@ -7030,14 +8382,14 @@
           <w:sz w:val="18"/>
           <w:szCs w:val="18"/>
         </w:rPr>
-        <w:t xml:space="preserve">Resolução nº 4.606, de 19 de outubro de 2017. Metodologia facultativa simplificada para apuração do requerimento mínimo de Patrimônio de Referência Simplificado (PRS5)</w:t>
-      </w:r>
-      <w:r>
-        <w:rPr>
-          <w:sz w:val="18"/>
-          <w:szCs w:val="18"/>
-        </w:rPr>
-        <w:t xml:space="preserve">. Banco Central do Brasil. https://normativos.bcb.gov.br/Lists/Normativos/Attachments/50454/Res_4606_v5_P.pdf</w:t>
+        <w:t xml:space="preserve">Resolução nº 4.958, de 21 de outubro de 2021. Requerimentos mínimos de Patrimônio de Referência, de Nível I e de Capital Principal e adicional de Capital Principal</w:t>
+      </w:r>
+      <w:r>
+        <w:rPr>
+          <w:sz w:val="18"/>
+          <w:szCs w:val="18"/>
+        </w:rPr>
+        <w:t xml:space="preserve">. Banco Central do Brasil. </w:t>
       </w:r>
     </w:p>
     <w:p>
@@ -7051,7 +8403,7 @@
           <w:sz w:val="18"/>
           <w:szCs w:val="18"/>
         </w:rPr>
-        <w:t xml:space="preserve">Conselho Monetário Nacional. (2017c). </w:t>
+        <w:t xml:space="preserve">Conselho Monetário Nacional. (2021c). </w:t>
       </w:r>
       <w:r>
         <w:rPr>
@@ -7060,7 +8412,7 @@
           <w:sz w:val="18"/>
           <w:szCs w:val="18"/>
         </w:rPr>
-        <w:t xml:space="preserve">Resolução nº 4.615, de 30 de novembro de 2017. Razão de Alavancagem</w:t>
+        <w:t xml:space="preserve">Resolução nº 4.966, de 25 de novembro de 2021. Conceitos e critérios contábeis aplicáveis a instrumentos financeiros e provisão para perdas esperadas</w:t>
       </w:r>
       <w:r>
         <w:rPr>
@@ -7081,7 +8433,7 @@
           <w:sz w:val="18"/>
           <w:szCs w:val="18"/>
         </w:rPr>
-        <w:t xml:space="preserve">Conselho Monetário Nacional. (2017d). </w:t>
+        <w:t xml:space="preserve">Cook, M. L. (1995). The future of U.S. agricultural cooperatives: A neo-institutional approach. </w:t>
       </w:r>
       <w:r>
         <w:rPr>
@@ -7090,14 +8442,30 @@
           <w:sz w:val="18"/>
           <w:szCs w:val="18"/>
         </w:rPr>
-        <w:t xml:space="preserve">Resolução nº 4.616, de 30 de novembro de 2017. Requerimento mínimo de liquidez de longo prazo (NSFR)</w:t>
-      </w:r>
-      <w:r>
-        <w:rPr>
-          <w:sz w:val="18"/>
-          <w:szCs w:val="18"/>
-        </w:rPr>
-        <w:t xml:space="preserve">. Banco Central do Brasil. https://normativos.bcb.gov.br/Lists/Normativos/Attachments/50474/Res_4616_v1_O.pdf</w:t>
+        <w:t xml:space="preserve">American Journal of Agricultural Economics</w:t>
+      </w:r>
+      <w:r>
+        <w:rPr>
+          <w:sz w:val="18"/>
+          <w:szCs w:val="18"/>
+        </w:rPr>
+        <w:t xml:space="preserve">, </w:t>
+      </w:r>
+      <w:r>
+        <w:rPr>
+          <w:i/>
+          <w:iCs/>
+          <w:sz w:val="18"/>
+          <w:szCs w:val="18"/>
+        </w:rPr>
+        <w:t xml:space="preserve">77</w:t>
+      </w:r>
+      <w:r>
+        <w:rPr>
+          <w:sz w:val="18"/>
+          <w:szCs w:val="18"/>
+        </w:rPr>
+        <w:t xml:space="preserve">(5), 1153–1159. https://doi.org/10.2307/1243338</w:t>
       </w:r>
     </w:p>
     <w:p>
@@ -7111,7 +8479,7 @@
           <w:sz w:val="18"/>
           <w:szCs w:val="18"/>
         </w:rPr>
-        <w:t xml:space="preserve">Conselho Monetário Nacional. (2021a). </w:t>
+        <w:t xml:space="preserve">Cuevas, C. E., &amp; Fischer, K. P. (2006). </w:t>
       </w:r>
       <w:r>
         <w:rPr>
@@ -7120,14 +8488,14 @@
           <w:sz w:val="18"/>
           <w:szCs w:val="18"/>
         </w:rPr>
-        <w:t xml:space="preserve">Resolução nº 4.955, de 21 de outubro de 2021. Metodologia para apuração do Patrimônio de Referência</w:t>
-      </w:r>
-      <w:r>
-        <w:rPr>
-          <w:sz w:val="18"/>
-          <w:szCs w:val="18"/>
-        </w:rPr>
-        <w:t xml:space="preserve">. Banco Central do Brasil. </w:t>
+        <w:t xml:space="preserve">Cooperative financial institutions: Issues in governance, regulation, and supervision</w:t>
+      </w:r>
+      <w:r>
+        <w:rPr>
+          <w:sz w:val="18"/>
+          <w:szCs w:val="18"/>
+        </w:rPr>
+        <w:t xml:space="preserve"> (World Bank Working Paper No. 82). The World Bank. </w:t>
       </w:r>
     </w:p>
     <w:p>
@@ -7141,7 +8509,7 @@
           <w:sz w:val="18"/>
           <w:szCs w:val="18"/>
         </w:rPr>
-        <w:t xml:space="preserve">Conselho Monetário Nacional. (2021b). </w:t>
+        <w:t xml:space="preserve">Diamond, D. W., &amp; Dybvig, P. H. (1983). Bank runs, deposit insurance, and liquidity. </w:t>
       </w:r>
       <w:r>
         <w:rPr>
@@ -7150,14 +8518,30 @@
           <w:sz w:val="18"/>
           <w:szCs w:val="18"/>
         </w:rPr>
-        <w:t xml:space="preserve">Resolução nº 4.958, de 21 de outubro de 2021. Requerimentos mínimos de Patrimônio de Referência, de Nível I e de Capital Principal e adicional de Capital Principal</w:t>
-      </w:r>
-      <w:r>
-        <w:rPr>
-          <w:sz w:val="18"/>
-          <w:szCs w:val="18"/>
-        </w:rPr>
-        <w:t xml:space="preserve">. Banco Central do Brasil. </w:t>
+        <w:t xml:space="preserve">Journal of Political Economy</w:t>
+      </w:r>
+      <w:r>
+        <w:rPr>
+          <w:sz w:val="18"/>
+          <w:szCs w:val="18"/>
+        </w:rPr>
+        <w:t xml:space="preserve">, </w:t>
+      </w:r>
+      <w:r>
+        <w:rPr>
+          <w:i/>
+          <w:iCs/>
+          <w:sz w:val="18"/>
+          <w:szCs w:val="18"/>
+        </w:rPr>
+        <w:t xml:space="preserve">91</w:t>
+      </w:r>
+      <w:r>
+        <w:rPr>
+          <w:sz w:val="18"/>
+          <w:szCs w:val="18"/>
+        </w:rPr>
+        <w:t xml:space="preserve">(3), 401–419. https://doi.org/10.1086/261155</w:t>
       </w:r>
     </w:p>
     <w:p>
@@ -7171,7 +8555,7 @@
           <w:sz w:val="18"/>
           <w:szCs w:val="18"/>
         </w:rPr>
-        <w:t xml:space="preserve">Conselho Monetário Nacional. (2021c). </w:t>
+        <w:t xml:space="preserve">Ferri, G., Kalmi, P., &amp; Kerola, E. (2014). Does bank ownership affect lending behavior? Evidence from the Euro area. </w:t>
       </w:r>
       <w:r>
         <w:rPr>
@@ -7180,14 +8564,30 @@
           <w:sz w:val="18"/>
           <w:szCs w:val="18"/>
         </w:rPr>
-        <w:t xml:space="preserve">Resolução nº 4.966, de 25 de novembro de 2021. Conceitos e critérios contábeis aplicáveis a instrumentos financeiros e provisão para perdas esperadas</w:t>
-      </w:r>
-      <w:r>
-        <w:rPr>
-          <w:sz w:val="18"/>
-          <w:szCs w:val="18"/>
-        </w:rPr>
-        <w:t xml:space="preserve">. Banco Central do Brasil. </w:t>
+        <w:t xml:space="preserve">Journal of Banking &amp; Finance</w:t>
+      </w:r>
+      <w:r>
+        <w:rPr>
+          <w:sz w:val="18"/>
+          <w:szCs w:val="18"/>
+        </w:rPr>
+        <w:t xml:space="preserve">, </w:t>
+      </w:r>
+      <w:r>
+        <w:rPr>
+          <w:i/>
+          <w:iCs/>
+          <w:sz w:val="18"/>
+          <w:szCs w:val="18"/>
+        </w:rPr>
+        <w:t xml:space="preserve">48</w:t>
+      </w:r>
+      <w:r>
+        <w:rPr>
+          <w:sz w:val="18"/>
+          <w:szCs w:val="18"/>
+        </w:rPr>
+        <w:t xml:space="preserve">, 194–209. https://doi.org/10.1016/j.jbankfin.2014.05.007</w:t>
       </w:r>
     </w:p>
     <w:p>
@@ -7201,7 +8601,7 @@
           <w:sz w:val="18"/>
           <w:szCs w:val="18"/>
         </w:rPr>
-        <w:t xml:space="preserve">Cook, M. L. (1995). The future of U.S. agricultural cooperatives: A neo-institutional approach. </w:t>
+        <w:t xml:space="preserve">Fonteyne, W. (2007). </w:t>
       </w:r>
       <w:r>
         <w:rPr>
@@ -7210,30 +8610,14 @@
           <w:sz w:val="18"/>
           <w:szCs w:val="18"/>
         </w:rPr>
-        <w:t xml:space="preserve">American Journal of Agricultural Economics</w:t>
-      </w:r>
-      <w:r>
-        <w:rPr>
-          <w:sz w:val="18"/>
-          <w:szCs w:val="18"/>
-        </w:rPr>
-        <w:t xml:space="preserve">, </w:t>
-      </w:r>
-      <w:r>
-        <w:rPr>
-          <w:i/>
-          <w:iCs/>
-          <w:sz w:val="18"/>
-          <w:szCs w:val="18"/>
-        </w:rPr>
-        <w:t xml:space="preserve">77</w:t>
-      </w:r>
-      <w:r>
-        <w:rPr>
-          <w:sz w:val="18"/>
-          <w:szCs w:val="18"/>
-        </w:rPr>
-        <w:t xml:space="preserve">(5), 1153–1159. https://doi.org/10.2307/1243338</w:t>
+        <w:t xml:space="preserve">Cooperative banks in Europe: Policy issues</w:t>
+      </w:r>
+      <w:r>
+        <w:rPr>
+          <w:sz w:val="18"/>
+          <w:szCs w:val="18"/>
+        </w:rPr>
+        <w:t xml:space="preserve"> (IMF Working Paper No. WP/07/159). International Monetary Fund. https://doi.org/10.5089/9781451867237.001</w:t>
       </w:r>
     </w:p>
     <w:p>
@@ -7247,7 +8631,7 @@
           <w:sz w:val="18"/>
           <w:szCs w:val="18"/>
         </w:rPr>
-        <w:t xml:space="preserve">Cuevas, C. E., &amp; Fischer, K. P. (2006). </w:t>
+        <w:t xml:space="preserve">Groeneveld, H. (2020). Reconciling different truths about isomorphic pressure and distinctive behavior at European cooperative banks: Back to the future with Raiffeisen's principles. </w:t>
       </w:r>
       <w:r>
         <w:rPr>
@@ -7256,28 +8640,14 @@
           <w:sz w:val="18"/>
           <w:szCs w:val="18"/>
         </w:rPr>
-        <w:t xml:space="preserve">Cooperative financial institutions: Issues in governance, regulation, and supervision</w:t>
-      </w:r>
-      <w:r>
-        <w:rPr>
-          <w:sz w:val="18"/>
-          <w:szCs w:val="18"/>
-        </w:rPr>
-        <w:t xml:space="preserve"> (World Bank Working Paper No. 82). The World Bank. </w:t>
-      </w:r>
-    </w:p>
-    <w:p>
-      <w:pPr>
-        <w:pStyle w:val="ReferenciasBibliogrficas"/>
-        <w:spacing w:after="60" w:line="240" w:lineRule="auto"/>
-        <w:jc w:val="left"/>
-      </w:pPr>
-      <w:r>
-        <w:rPr>
-          <w:sz w:val="18"/>
-          <w:szCs w:val="18"/>
-        </w:rPr>
-        <w:t xml:space="preserve">Diamond, D. W., &amp; Dybvig, P. H. (1983). Bank runs, deposit insurance, and liquidity. </w:t>
+        <w:t xml:space="preserve">Annals of Public and Cooperative Economics</w:t>
+      </w:r>
+      <w:r>
+        <w:rPr>
+          <w:sz w:val="18"/>
+          <w:szCs w:val="18"/>
+        </w:rPr>
+        <w:t xml:space="preserve">, </w:t>
       </w:r>
       <w:r>
         <w:rPr>
@@ -7286,22 +8656,6 @@
           <w:sz w:val="18"/>
           <w:szCs w:val="18"/>
         </w:rPr>
-        <w:t xml:space="preserve">Journal of Political Economy</w:t>
-      </w:r>
-      <w:r>
-        <w:rPr>
-          <w:sz w:val="18"/>
-          <w:szCs w:val="18"/>
-        </w:rPr>
-        <w:t xml:space="preserve">, </w:t>
-      </w:r>
-      <w:r>
-        <w:rPr>
-          <w:i/>
-          <w:iCs/>
-          <w:sz w:val="18"/>
-          <w:szCs w:val="18"/>
-        </w:rPr>
         <w:t xml:space="preserve">91</w:t>
       </w:r>
       <w:r>
@@ -7309,113 +8663,7 @@
           <w:sz w:val="18"/>
           <w:szCs w:val="18"/>
         </w:rPr>
-        <w:t xml:space="preserve">(3), 401–419. https://doi.org/10.1086/261155</w:t>
-      </w:r>
-    </w:p>
-    <w:p>
-      <w:pPr>
-        <w:pStyle w:val="ReferenciasBibliogrficas"/>
-        <w:spacing w:after="60" w:line="240" w:lineRule="auto"/>
-        <w:jc w:val="left"/>
-      </w:pPr>
-      <w:r>
-        <w:rPr>
-          <w:sz w:val="18"/>
-          <w:szCs w:val="18"/>
-        </w:rPr>
-        <w:t xml:space="preserve">Ferri, G., Kalmi, P., &amp; Kerola, E. (2014). Does bank ownership affect lending behavior? Evidence from the Euro area. </w:t>
-      </w:r>
-      <w:r>
-        <w:rPr>
-          <w:i/>
-          <w:iCs/>
-          <w:sz w:val="18"/>
-          <w:szCs w:val="18"/>
-        </w:rPr>
-        <w:t xml:space="preserve">Journal of Banking &amp; Finance</w:t>
-      </w:r>
-      <w:r>
-        <w:rPr>
-          <w:sz w:val="18"/>
-          <w:szCs w:val="18"/>
-        </w:rPr>
-        <w:t xml:space="preserve">, </w:t>
-      </w:r>
-      <w:r>
-        <w:rPr>
-          <w:i/>
-          <w:iCs/>
-          <w:sz w:val="18"/>
-          <w:szCs w:val="18"/>
-        </w:rPr>
-        <w:t xml:space="preserve">48</w:t>
-      </w:r>
-      <w:r>
-        <w:rPr>
-          <w:sz w:val="18"/>
-          <w:szCs w:val="18"/>
-        </w:rPr>
-        <w:t xml:space="preserve">, 194–209. https://doi.org/10.1016/j.jbankfin.2014.05.007</w:t>
-      </w:r>
-    </w:p>
-    <w:p>
-      <w:pPr>
-        <w:pStyle w:val="ReferenciasBibliogrficas"/>
-        <w:spacing w:after="60" w:line="240" w:lineRule="auto"/>
-        <w:jc w:val="left"/>
-      </w:pPr>
-      <w:r>
-        <w:rPr>
-          <w:sz w:val="18"/>
-          <w:szCs w:val="18"/>
-        </w:rPr>
-        <w:t xml:space="preserve">Fonteyne, W. (2007). </w:t>
-      </w:r>
-      <w:r>
-        <w:rPr>
-          <w:i/>
-          <w:iCs/>
-          <w:sz w:val="18"/>
-          <w:szCs w:val="18"/>
-        </w:rPr>
-        <w:t xml:space="preserve">Cooperative banks in Europe: Policy issues</w:t>
-      </w:r>
-      <w:r>
-        <w:rPr>
-          <w:sz w:val="18"/>
-          <w:szCs w:val="18"/>
-        </w:rPr>
-        <w:t xml:space="preserve"> (IMF Working Paper No. WP/07/159). International Monetary Fund. https://doi.org/10.5089/9781451867237.001</w:t>
-      </w:r>
-    </w:p>
-    <w:p>
-      <w:pPr>
-        <w:pStyle w:val="ReferenciasBibliogrficas"/>
-        <w:spacing w:after="60" w:line="240" w:lineRule="auto"/>
-        <w:jc w:val="left"/>
-      </w:pPr>
-      <w:r>
-        <w:rPr>
-          <w:sz w:val="18"/>
-          <w:szCs w:val="18"/>
-        </w:rPr>
-        <w:t xml:space="preserve">Hansmann, H. (1996). </w:t>
-      </w:r>
-      <w:r>
-        <w:rPr>
-          <w:i/>
-          <w:iCs/>
-          <w:sz w:val="18"/>
-          <w:szCs w:val="18"/>
-        </w:rPr>
-        <w:t xml:space="preserve">The ownership of enterprise</w:t>
-      </w:r>
-      <w:r>
-        <w:rPr>
-          <w:sz w:val="18"/>
-          <w:szCs w:val="18"/>
-        </w:rPr>
-        <w:t xml:space="preserve">. The Belknap Press of Harvard University Press.</w:t>
+        <w:t xml:space="preserve">(3), 359–386. https://doi.org/10.1111/apce.12280</w:t>
       </w:r>
     </w:p>
     <w:p>

</xml_diff>

<commit_message>
Drop the award-category line (all eligible papers compete automatically); abstract says guarantee, not public guarantee
Co-Authored-By: Claude Fable 5.1 <noreply@anthropic.com>
</commit_message>
<xml_diff>
--- a/paper/ICACCR2026_paper_Nery_Victorino_Rangel.docx
+++ b/paper/ICACCR2026_paper_Nery_Victorino_Rangel.docx
@@ -113,22 +113,6 @@
           <w:rStyle w:val="Autor2"/>
         </w:rPr>
         <w:t xml:space="preserve">Organization of Brazilian Cooperatives (OCB System), Brasília, Brazil, ORCID [0000-0000-0000-0000], [email]</w:t>
-      </w:r>
-    </w:p>
-    <w:p>
-      <w:pPr>
-        <w:spacing w:after="240"/>
-        <w:jc w:val="center"/>
-      </w:pPr>
-      <w:r>
-        <w:rPr>
-          <w:i/>
-          <w:iCs/>
-        </w:rPr>
-        <w:t xml:space="preserve">Award category:</w:t>
-      </w:r>
-      <w:r>
-        <w:t xml:space="preserve"> Best Young and Emerging Scholar Paper</w:t>
       </w:r>
     </w:p>
     <w:p>

</xml_diff>

<commit_message>
Law 4.595/1964 cited from the bib (art. 31, semiannual balance sheets); source downloaded to references/
Co-Authored-By: Claude Fable 5.1 <noreply@anthropic.com>
</commit_message>
<xml_diff>
--- a/paper/ICACCR2026_paper_Nery_Victorino_Rangel.docx
+++ b/paper/ICACCR2026_paper_Nery_Victorino_Rangel.docx
@@ -809,7 +809,7 @@
         <w:jc w:val="both"/>
       </w:pPr>
       <w:r>
-        <w:t xml:space="preserve">Two features of IF.data affect how the quarterly outcomes are constructed. First, income flows accumulate within the semester. Financial institutions in Brazil draw up balance sheets semiannually, in June and December (Lei 4.595/1964), and the IF.data income fields reset at each date. The median ratio of the fourth-quarter to the first-quarter value is between 2.2 and 2.3 for every income field and close to one for balance-sheet stocks. We de-cumulate within each semester and annualise, which scales the return on assets coefficient by about 2.7 relative to reading the cumulative field as a quarterly rate, and leaves every stock-based coefficient unchanged. The de-cumulated levels agree with the Central Bank's published figures: the median annualised return of the singular cooperatives in our panel is 2.9 percent in 2023 and 2.5 percent in 2024, against 2.9 and 2.4 in the Panorama (Banco Central do Brasil, 2025). Second, the intermediation result is reported net of loan loss provisions, because the expense subtotal (</w:t>
+        <w:t xml:space="preserve">Two features of IF.data affect how the quarterly outcomes are constructed. First, income flows accumulate within the semester. Financial institutions in Brazil draw up balance sheets semiannually, in June and December (Brasil, 1964), and the IF.data income fields reset at each date. The median ratio of the fourth-quarter to the first-quarter value is between 2.2 and 2.3 for every income field and close to one for balance-sheet stocks. We de-cumulate within each semester and annualise, which scales the return on assets coefficient by about 2.7 relative to reading the cumulative field as a quarterly rate, and leaves every stock-based coefficient unchanged. The de-cumulated levels agree with the Central Bank's published figures: the median annualised return of the singular cooperatives in our panel is 2.9 percent in 2023 and 2.5 percent in 2024, against 2.9 and 2.4 in the Panorama (Banco Central do Brasil, 2025). Second, the intermediation result is reported net of loan loss provisions, because the expense subtotal (</w:t>
       </w:r>
       <w:r>
         <w:rPr>
@@ -8352,6 +8352,36 @@
           <w:szCs w:val="18"/>
         </w:rPr>
         <w:t xml:space="preserve">, 224–246. https://doi.org/10.1016/j.jimonfin.2016.06.016</w:t>
+      </w:r>
+    </w:p>
+    <w:p>
+      <w:pPr>
+        <w:pStyle w:val="ReferenciasBibliogrficas"/>
+        <w:spacing w:after="60" w:line="240" w:lineRule="auto"/>
+        <w:jc w:val="left"/>
+      </w:pPr>
+      <w:r>
+        <w:rPr>
+          <w:sz w:val="18"/>
+          <w:szCs w:val="18"/>
+        </w:rPr>
+        <w:t xml:space="preserve">Brasil. (1964). </w:t>
+      </w:r>
+      <w:r>
+        <w:rPr>
+          <w:i/>
+          <w:iCs/>
+          <w:sz w:val="18"/>
+          <w:szCs w:val="18"/>
+        </w:rPr>
+        <w:t xml:space="preserve">Lei nº 4.595, de 31 de dezembro de 1964. Dispõe sobre a política e as instituições monetárias, bancárias e creditícias, cria o Conselho Monetário Nacional e dá outras providências</w:t>
+      </w:r>
+      <w:r>
+        <w:rPr>
+          <w:sz w:val="18"/>
+          <w:szCs w:val="18"/>
+        </w:rPr>
+        <w:t xml:space="preserve">. Diário Oficial da União. https://www.planalto.gov.br/ccivil_03/leis/l4595.htm</w:t>
       </w:r>
     </w:p>
     <w:p>

</xml_diff>

<commit_message>
Jury round: headline in the abstract, three-statement opening of the Discussion, mean-versus-median rule in 3.4, credit intensity behind cost and stability, 4.5 as generalisation; cuts to pay for them
Co-Authored-By: Claude Fable 5.1 <noreply@anthropic.com>
</commit_message>
<xml_diff>
--- a/paper/ICACCR2026_paper_Nery_Victorino_Rangel.docx
+++ b/paper/ICACCR2026_paper_Nery_Victorino_Rangel.docx
@@ -155,7 +155,7 @@
         <w:jc w:val="both"/>
       </w:pPr>
       <w:r>
-        <w:t xml:space="preserve">In Brazil, a credit cooperative that grows past a size threshold computes capital, leverage and risk under the same prudential methodology as a commercial bank, while its cooperative acts remain untaxed. We ask whether the cooperative form still leaves a distinct imprint on the balance sheet. The data are a quarterly panel of every full-methodology institution from 2017 to 2024: 130 singular credit cooperatives and 144 banks. Eleven balance-sheet and performance measures are related to a cooperative dummy, controlling for size and time, on a matched sample and across five comparison groups. Three results emerge. First, at comparable size cooperatives lend a larger share of their assets than banks nationally, operate at lower cost and show steadier returns. Before tax the typical cooperative earns more than a comparable bank, though the mean gap is not established; after tax it retains about two percentage points more, of which the tax exemption explains about two fifths. Second, capital differs modestly in level and markedly in dispersion. The mean gap comes from small banks with capital ratios above fifty percent and roughly halves against deposit-funded banks; among thinly capitalised institutions, cooperatives hold more capital than banks and provision no less. Third, two differences often reported, lower provisioning and narrower margins, disappear once the comparison group is restricted to banks. Whether these differences bear on the territorial role of cooperative lenders is the claim the data cannot yet settle. What they do show is that a benchmark calibrated on the average institution may describe the locally lending cooperative poorly.</w:t>
+        <w:t xml:space="preserve">In Brazil, a credit cooperative that grows past a size threshold computes capital, leverage and risk under the same prudential methodology as a commercial bank, while its cooperative acts remain untaxed. We ask whether the cooperative form still leaves a distinct imprint on the balance sheet. The data are a quarterly panel of every full-methodology institution from 2017 to 2024: 130 singular credit cooperatives and 144 banks. Eleven balance-sheet and performance measures are related to a cooperative dummy, controlling for size and time, on a matched sample and across five comparison groups. The cooperative form leaves a clear imprint, in three results. First, at comparable size cooperatives operate at lower cost and show steadier returns, and nationally they lend a larger share of their assets than banks, a difference that does not survive matching within region. Before tax the typical cooperative earns more than a comparable bank, though the mean gap is not established; after tax it retains about two percentage points more, of which the tax exemption explains about two fifths. Second, capital differs modestly in level and markedly in dispersion. The mean gap comes from small banks with capital ratios above fifty percent and roughly halves against deposit-funded banks; among thinly capitalised institutions, cooperatives hold more capital than banks and provision no less. Third, two differences often reported, lower provisioning and narrower margins, disappear once the comparison group is restricted to banks. Whether these differences bear on the territorial role of cooperative lenders is the claim the data cannot yet settle. What they do show is that a benchmark calibrated on the average institution may describe the locally lending cooperative poorly.</w:t>
       </w:r>
     </w:p>
     <w:p>
@@ -355,7 +355,7 @@
         <w:jc w:val="both"/>
       </w:pPr>
       <w:r>
-        <w:t xml:space="preserve">Prudential capital regulation exists to internalise the externalities that a financial institution's failure imposes on depositors, on the payment system and on the safety net (Basel Committee on Banking Supervision, 2011). It also offsets the moral hazard that a deposit guarantee introduces into the institution's choice of leverage (Diamond &amp; Dybvig, 1983). In Brazil the guarantee is mutual and split by form: bank deposits are covered by the FGC and cooperative deposits by the FGCoop, a private fund created in 2013 to which every singular cooperative must adhere, capitalised by its members at a flat rate on their deposits and able to extend them liquidity assistance (Coelho et al., 2019; Conselho Monetário Nacional, 2013). One reading of the prudential rationale is a representation argument, in which the supervisor acts on behalf of small, dispersed depositors who cannot monitor a leveraged intermediary. In a credit cooperative the depositor is also a member with a residual claim and a governance right, and in the integrated systems a central body supplies consolidated monitoring. The monitoring problem is therefore likely to be partly internalised. The systemic externality of failure and the moral hazard of the guarantee remain, and under a flat-rate mutual fund a thinly capitalised cooperative shifts part of its risk onto the rest of the sector. A capital template written for one form may thus bind, when applied to another, on a margin that does not carry the risk it was designed to price.</w:t>
+        <w:t xml:space="preserve">Prudential capital regulation exists to internalise the externalities that a financial institution's failure imposes on depositors, on the payment system and on the safety net (Basel Committee on Banking Supervision, 2011). It also offsets the moral hazard that a deposit guarantee introduces into the institution's choice of leverage (Diamond &amp; Dybvig, 1983). In Brazil the guarantee is mutual and split by form: bank deposits are covered by the FGC and cooperative deposits by the FGCoop, a private fund created in 2013 to which every singular cooperative must adhere, capitalised by its members at a flat rate on their deposits and able to extend them liquidity assistance (Coelho et al., 2019; Conselho Monetário Nacional, 2013). In the representation reading of that rationale, the supervisor acts for small, dispersed depositors who cannot monitor a leveraged intermediary; a cooperative's depositor is also a member with a residual claim and a governance right, and in the integrated systems a central body monitors on their behalf, so the problem is likely to be partly internalised. The systemic externality of failure and the moral hazard of the guarantee remain, and under a flat-rate mutual fund a thinly capitalised cooperative shifts part of its risk onto the rest of the sector. A capital template written for one form may thus bind, when applied to another, on a margin that does not carry the risk it was designed to price.</w:t>
       </w:r>
     </w:p>
     <w:p>
@@ -363,7 +363,7 @@
         <w:jc w:val="both"/>
       </w:pPr>
       <w:r>
-        <w:t xml:space="preserve">Brazil's segmentation sorts institutions by size and international activity (Conselho Monetário Nacional, 2017a), and the international surveys of proportionality record size, complexity and business model as the criteria in use, none based on organisational form (Basel Committee on Banking Supervision, 2019). Where supervisors adapt the framework to cooperatives, the adaptation concerns member shares and network arrangements (Coelho et al., 2019). Organisational form and network membership are then candidate calibration margins, and the profile of each form decides whether they point to lighter treatment or closer scrutiny. This paper provides that profile.</w:t>
+        <w:t xml:space="preserve">Brazil's segmentation sorts institutions by size and international activity (Conselho Monetário Nacional, 2017a), and the international surveys of proportionality record size, complexity and business model as the criteria in use, none based on organisational form (Basel Committee on Banking Supervision, 2019). Where supervisors adapt the framework to cooperatives, the adaptation concerns member shares and network arrangements (Coelho et al., 2019). Organisational form and network membership are then candidate calibration margins, and this paper supplies the profile that decides whether they point to lighter treatment or closer scrutiny.</w:t>
       </w:r>
     </w:p>
     <w:p>
@@ -499,7 +499,7 @@
         <w:jc w:val="both"/>
       </w:pPr>
       <w:r>
-        <w:t xml:space="preserve">We construct an institution-level quarterly panel from IF.data, the public statistical repository of the Central Bank of Brazil. The summary financials, the segmentation file, the asset composition file and the income statement are merged on institution code and reporting date, and the raw panel runs from 2014Q1 to 2024Q4. The window includes the pandemic years; quarter fixed effects absorb the common shock, and the pre-2022 subperiod that contains them shows every surviving result (Section 4.6). All tables and figures are the authors' calculations from the IF.data files.</w:t>
+        <w:t xml:space="preserve">We construct an institution-level quarterly panel from IF.data, the public statistical repository of the Central Bank of Brazil. The summary financials, the segmentation file, the asset composition file and the income statement are merged on institution code and reporting date, and the raw panel runs from 2014Q1 to 2024Q4. Quarter fixed effects absorb the pandemic shock, and the pre-2022 subperiod shows every surviving result (Section 4.6). All tables and figures are the authors' calculations from the IF.data files.</w:t>
       </w:r>
     </w:p>
     <w:p>
@@ -1678,7 +1678,7 @@
         <w:jc w:val="both"/>
       </w:pPr>
       <w:r>
-        <w:t xml:space="preserve">Standard errors are clustered by institution, since cooperative status is assigned at the institution level and observations are serially correlated (Cameron &amp; Miller, 2015). Clustered inference is unreliable when few clusters are treated (MacKinnon &amp; Webb, 2017), as in the system-by-system estimates, so every coefficient also carries a restricted wild cluster bootstrap, which re-draws the sign of each institution's residuals under the null and compares the observed statistic with that distribution (Cameron et al., 2008). In simulations on our design with six treated clusters (online appendix), the clustered test over-rejects at both conventional levels, while the bootstrap is conservative at one percent and still over-rejects at five. The few-cluster problem concerns the system splits, which report their treated cluster counts; the main comparison rests on about 130 treated clusters, where the two agree. Quantile coefficients carry intervals from an institution bootstrap. Several outcomes are right-skewed, so we report the conditional median alongside the conditional mean.</w:t>
+        <w:t xml:space="preserve">Standard errors are clustered by institution, since cooperative status is assigned at the institution level and observations are serially correlated (Cameron &amp; Miller, 2015). Clustered inference is unreliable when few clusters are treated (MacKinnon &amp; Webb, 2017), as in the system-by-system estimates, so every coefficient also carries a restricted wild cluster bootstrap, which re-draws the sign of each institution's residuals under the null and compares the observed statistic with that distribution (Cameron et al., 2008). In simulations on our design with six treated clusters (online appendix), the clustered test over-rejects at both conventional levels, while the bootstrap is conservative at one percent and still over-rejects at five. The few-cluster problem concerns the system splits, which report their treated cluster counts; the main comparison rests on about 130 treated clusters, where the two agree. Quantile coefficients carry intervals from an institution bootstrap. Several outcomes are right-skewed, so we report the conditional median alongside the conditional mean, under one rule for every outcome: the tiers below are assigned on the conditional means alone, and where mean and median disagree the quantile profile decides which describes the typical institution, so that when one tail drives the mean, as for capital, cost-to-income and the pre-tax return, we read the magnitude at the median while the tier still records the mean result.</w:t>
       </w:r>
     </w:p>
     <w:p>
@@ -1740,7 +1740,7 @@
         <w:jc w:val="both"/>
       </w:pPr>
       <w:r>
-        <w:t xml:space="preserve">The analysis sample contains 130 singular cooperatives and 144 banks, 7,234 institution-quarters, from 2017Q1 to 2024Q4. Ninety percent of cooperative observations fall inside the common support region of log assets (Figure 3), against forty-eight percent of bank observations. About half the bank population therefore has no cooperative counterpart at any size. Matching and trimming bring the standardised difference in log assets from −0.72 to close to zero. Unconditional means and medians are in the online appendix.</w:t>
+        <w:t xml:space="preserve">The analysis sample contains 130 singular cooperatives and 144 banks, 7,234 institution-quarters, from 2017Q1 to 2024Q4. Ninety percent of cooperative observations fall inside the common support region of log assets (Figure 3), against forty-eight percent of bank observations. Matching and trimming bring the standardised difference in log assets from −0.72 to close to zero. Unconditional means and medians are in the online appendix.</w:t>
       </w:r>
       <w:r>
         <w:rPr>
@@ -3987,7 +3987,7 @@
         <w:jc w:val="both"/>
       </w:pPr>
       <w:r>
-        <w:t xml:space="preserve">Five of the nine quarterly outcomes keep their sign and significance across all four specifications and every winsorisation rule, including no winsorisation, and so do both stability outcomes. Their retention ratios are above one, except for the after-tax return, which keeps most of its raw value; a size-composition artefact would shrink as size is held more tightly. By the rule of Section 3.4, credit intensity and the after-tax return are stable among the quarterly outcomes, capital, leverage and cost-to-income are stable in sign, and the pre-tax return, provisioning, the margin and funding are null; return volatility and the z-score are both stable.</w:t>
+        <w:t xml:space="preserve">Five of the nine quarterly outcomes keep their sign and significance across all four specifications and every winsorisation rule, including no winsorisation, and so do both stability outcomes. By the rule of Section 3.4, credit intensity and the after-tax return are stable among the quarterly outcomes, capital, leverage and cost-to-income are stable in sign, and the pre-tax return, provisioning, the margin and funding are null; return volatility and the z-score are both stable.</w:t>
       </w:r>
     </w:p>
     <w:p>
@@ -4019,7 +4019,7 @@
         <w:jc w:val="both"/>
       </w:pPr>
       <w:r>
-        <w:t xml:space="preserve">The capital result requires the most care. Unconditionally, the median cooperative is better capitalised than the median bank, and Figure 6 shows the cooperative median above the bank median for most of the window. Yet the size-controlled mean differential is large and negative in every column of Table 2, and under controls about seven times the conditional median. Figure 4 reconciles the two: the cooperative coefficient is positive at the bottom of the conditional capital distribution and negative at the top, and it crosses zero near the fortieth percentile. Averaged over the twentieth to eightieth percentiles, the differential is about a third of the conditional mean (Table 3). Unconditionally, 14 percent of bank-quarters exceed a Basel ratio of 50 percent, against 1 percent of cooperative-quarters. At equal size, what mainly separates the two groups is dispersion: residualised on size and quarter, the standard deviation of the capital ratio among cooperatives is about a third of the bank figure (online appendix; Figure 6).</w:t>
+        <w:t xml:space="preserve">The capital result requires the most care. Unconditionally, the median cooperative is better capitalised than the median bank for most of the window (Figure 6). Yet the size-controlled mean differential is large and negative in every column of Table 2, and under controls about seven times the conditional median. Figure 4 reconciles the two: the cooperative coefficient is positive at the bottom of the conditional capital distribution and negative at the top, and it crosses zero near the fortieth percentile. Averaged over the twentieth to eightieth percentiles, the differential is about a third of the conditional mean (Table 3). Unconditionally, 14 percent of bank-quarters exceed a Basel ratio of 50 percent, against 1 percent of cooperative-quarters. At equal size, what mainly separates the two groups is dispersion: residualised on size and quarter, the standard deviation of the capital ratio among cooperatives is about a third of the bank figure (online appendix; Figure 6).</w:t>
       </w:r>
     </w:p>
     <w:p>
@@ -6193,7 +6193,7 @@
         <w:jc w:val="both"/>
       </w:pPr>
       <w:r>
-        <w:t xml:space="preserve">Cooperative returns are also less volatile. At comparable size cooperatives show a lower standard deviation of return on assets and a higher z-score, in all four designs and on every national bank rung. The two measures share the standard deviation of return on assets, so we treat them as one result. Taxes compress the after-tax volatility of bank returns, so this comparison probably understates the gap: before tax, the z-score differential is larger and the median gap in return volatility nearly doubles, while the mean volatility differential is smaller, and both keep their sign and significance (Table A11 of the online appendix). Together with the profitability results, cooperatives earn steadier returns on the same intermediation margin and retain more of them.</w:t>
+        <w:t xml:space="preserve">Cooperative returns are also less volatile. At comparable size cooperatives show a lower standard deviation of return on assets and a higher z-score, in all four designs and on every national bank rung. The two measures share the standard deviation of return on assets, so we treat them as one result. Taxes compress the after-tax volatility of bank returns, so this comparison probably understates the gap: before tax, the z-score differential is larger and the median gap in return volatility nearly doubles, while the mean volatility differential is smaller, and both keep their sign and significance (Table A11 of the online appendix).</w:t>
       </w:r>
     </w:p>
     <w:p>
@@ -7851,7 +7851,7 @@
         <w:jc w:val="both"/>
       </w:pPr>
       <w:r>
-        <w:t xml:space="preserve">Against all non-cooperatives, cooperatives appear to provision less, significant at one percent in all four specifications, while against banks the coefficient is close to zero. The broad-group gap comes from the non-banking lenders, whose provisioning ratios are nearly three times those of banks and cooperatives. At the conditional median the sign reverses, with cooperatives provisioning more. Split into terciles of the Basel ratio, where supervisory concern attaches, no tercile shows cooperatives provisioning less: the differential is positive and significant only in the middle tercile on the unconditional ratio, and no tercile differs on the residualised ratio. Because minimum provisions are a step function of the AA to H rating of each operation, the result most likely describes how the two groups classify their books.</w:t>
+        <w:t xml:space="preserve">Against all non-cooperatives, cooperatives appear to provision less, significant at one percent in all four specifications, while against banks the coefficient is close to zero. The broad-group gap comes from the non-banking lenders, whose provisioning ratios are nearly three times those of banks and cooperatives. At the conditional median the sign reverses, with cooperatives provisioning more. Split into terciles of the Basel ratio, where supervisory concern attaches, no tercile shows cooperatives provisioning less: the differential is positive and significant only in the middle tercile on the unconditional ratio, and no tercile differs on the residualised ratio. The result most likely describes how the two groups classify their books.</w:t>
       </w:r>
       <w:r>
         <w:rPr>
@@ -7937,7 +7937,7 @@
         <w:jc w:val="both"/>
       </w:pPr>
       <w:r>
-        <w:t xml:space="preserve">The comparison also crosses a boundary: banks enter partly as prudential conglomerates, cooperatives as singulars, and the centrals are excluded. A network-level aggregation is beyond IF.data, which ties a singular to its system but not to its central, but the asymmetry can be bounded. At the end of 2024 the centrals held about a quarter of the singulars' assets, mostly the singulars' own centralised deposits, but about six percent of their regulatory capital and about a tenth of their administrative and personnel expenses, and the fees a singular pays its central are booked as its own expenses. Consolidation would therefore likely move the capital and cost differentials by far less than their size.</w:t>
+        <w:t xml:space="preserve">The comparison also crosses a boundary: banks enter partly as prudential conglomerates, cooperatives as singulars, and the centrals are excluded. IF.data ties a singular to its system but not to its central, so the asymmetry can only be bounded: at the end of 2024 the centrals held about a quarter of the singulars' assets, mostly the singulars' own centralised deposits, but about six percent of their regulatory capital and a tenth of their administrative and personnel expenses, so consolidation would likely move the capital and cost differentials by far less than their size.</w:t>
       </w:r>
     </w:p>
     <w:p>
@@ -7971,7 +7971,7 @@
         <w:t xml:space="preserve">p</w:t>
       </w:r>
       <w:r>
-        <w:t xml:space="preserve"> = 0.002), marginally less profitable and marginally leaner. Selection therefore likely biases the credit and profitability estimates towards zero and the efficiency estimate marginally away from it.</w:t>
+        <w:t xml:space="preserve"> = 0.002), marginally less profitable and marginally leaner. This bears on generalisation rather than on the estimates: they describe the adopters, and the wider cooperative population would, if anything, show larger credit and profitability differentials and a smaller efficiency one.</w:t>
       </w:r>
     </w:p>
     <w:p>
@@ -8019,7 +8019,7 @@
         <w:jc w:val="both"/>
       </w:pPr>
       <w:r>
-        <w:t xml:space="preserve">Under the same prudential rules, the largest credit cooperatives lend a larger share of their assets than banks of the same size, run at lower cost and post steadier returns. Before tax the typical cooperative earns somewhat more than a comparable bank, although the average gap depends on the specification; after tax it keeps about two percentage points more, of which the tax exemption explains about two fifths, and what it keeps is the only capital it can build. Their capital ratios sit in a narrow band: below the bank average, which a few small and heavily capitalised banks pull up, and above comparable banks at the thin end of the distribution, where supervisors look. Two often-cited differences, lower provisioning and thinner margins, vanish once cooperatives are compared with banks alone. For supervisors, this argues for a benchmark calibrated on lending institutions and for reading the whole distribution as well as the mean.</w:t>
+        <w:t xml:space="preserve">Three statements summarise the findings. First, under the same prudential rules the largest credit cooperatives run at lower cost and post steadier returns than banks of the same size, lend a larger share of their assets than banks nationally, and keep about two percentage points more of their return after tax, of which the tax exemption explains about two fifths; what they keep is the only capital they can build. Second, their capital ratios sit in a narrow band: below the bank average, which a few small and heavily capitalised banks pull up, and above comparable banks at the thin end of the distribution, where supervisors look. Third, two often-cited differences, lower provisioning and thinner margins, vanish once cooperatives are compared with banks alone. For supervisors, this argues for a benchmark calibrated on lending institutions and for reading the whole distribution as well as the mean.</w:t>
       </w:r>
     </w:p>
     <w:p>

</xml_diff>

<commit_message>
Literature: Silva et al. (2023), Cavinato and Capitani (2023), Berg and Geeroms (2026) on the European simplification debate; figure floats in citation order; cuts for the word limit
Co-Authored-By: Claude Fable 5.1 <noreply@anthropic.com>
</commit_message>
<xml_diff>
--- a/paper/ICACCR2026_paper_Nery_Victorino_Rangel.docx
+++ b/paper/ICACCR2026_paper_Nery_Victorino_Rangel.docx
@@ -323,7 +323,7 @@
         <w:jc w:val="both"/>
       </w:pPr>
       <w:r>
-        <w:t xml:space="preserve">Credit cooperatives are member-owned deposit-taking institutions that lend mostly to their members. They are organised under Complementary Law 130/2009 (Brasil, 2009). Cooperatives held about six percent of system assets at the end of 2024 and 6.3 percent a year later, and their share has risen in every year since 2020 (Banco Central do Brasil, 2025, 2026). Much of the sector belongs to integrated systems in which central cooperatives supply liquidity facilities, consolidated risk management and a single supervisory interface to their affiliates.</w:t>
+        <w:t xml:space="preserve">Credit cooperatives are member-owned deposit-taking institutions that lend mostly to their members. They are organised under Complementary Law 130/2009 (Brasil, 2009). Cooperatives held about six percent of system assets at the end of 2024, and their share has risen in every year since 2020 (Banco Central do Brasil, 2025). Much of the sector belongs to integrated systems in which central cooperatives supply liquidity facilities, consolidated risk management and a single supervisory interface to their affiliates.</w:t>
       </w:r>
     </w:p>
     <w:p>
@@ -363,7 +363,7 @@
         <w:jc w:val="both"/>
       </w:pPr>
       <w:r>
-        <w:t xml:space="preserve">Brazil's segmentation sorts institutions by size and international activity (Conselho Monetário Nacional, 2017a), and the international surveys of proportionality record size, complexity and business model as the criteria in use, none based on organisational form (Basel Committee on Banking Supervision, 2019). Where supervisors adapt the framework to cooperatives, the adaptation concerns member shares and network arrangements (Coelho et al., 2019). Organisational form and network membership are then candidate calibration margins, and this paper supplies the profile that decides whether they point to lighter treatment or closer scrutiny.</w:t>
+        <w:t xml:space="preserve">Brazil's segmentation sorts institutions by size and international activity (Conselho Monetário Nacional, 2017a), and the international surveys of proportionality record size, complexity and business model as the criteria in use, none based on organisational form (Basel Committee on Banking Supervision, 2019). Where supervisors adapt the framework to cooperatives, the adaptation concerns member shares and network arrangements (Coelho et al., 2019). The current European debate on simpler rules for smaller banks keeps to the same criteria: the proposal that Berg and Geeroms (2026) weigh would let banks below a size threshold, the German savings and cooperative banks among them, opt into simpler standards, with safeguards on risk-taking. Organisational form and network membership are then candidate calibration margins, and this paper supplies the profile that decides whether they point to lighter treatment or closer scrutiny.</w:t>
       </w:r>
     </w:p>
     <w:p>
@@ -395,7 +395,7 @@
         <w:jc w:val="both"/>
       </w:pPr>
       <w:r>
-        <w:t xml:space="preserve">Besides the proportionality work above, two strands of the literature reviewed by McKillop et al. (2020) bear on this paper. The first concerns capital, profitability and stability. Hesse and Čihák (2007) find in a cross-country panel that cooperative banks are more stable than commercial banks. They attribute the result to the lower volatility of cooperative returns, which more than offsets lower profitability and capitalisation. Ayadi et al. (2010) document the performance and role of cooperative banks across Europe, Iannotta et al. (2007) find that ownership structure predicts risk and performance across European banks, and Becchetti et al. (2016) and Ferri et al. (2014) show that it shapes lending. Groeneveld (2020) weighs the adaptations of European cooperative banks against the traits they retain and finds their distinctive character intact. Cuevas and Fischer (2006) set out the tension between member orientation and prudential templates written for investor-owned banks. The second is Brazilian. Bressan et al. (2011) apply the PEARLS system to Brazilian credit cooperatives and model their insolvency risk, and Carvalho et al. (2015) analyse the exit and failure of Brazilian credit unions. None of these studies compares cooperatives with banks under a common prudential methodology, which is the setting we use here.</w:t>
+        <w:t xml:space="preserve">Besides the proportionality work above, two strands of the literature reviewed by McKillop et al. (2020) bear on this paper. The first concerns capital, profitability and stability. Hesse and Čihák (2007) find in a cross-country panel that cooperative banks are more stable than commercial banks. They attribute the result to the lower volatility of cooperative returns, which more than offsets lower profitability and capitalisation. Ayadi et al. (2010) document the performance and role of cooperative banks across Europe, Iannotta et al. (2007) find that ownership structure predicts risk and performance across European banks, and Becchetti et al. (2016) and Ferri et al. (2014) show that it shapes lending. Groeneveld (2020) weighs the adaptations of European cooperative banks against the traits they retain and finds their distinctive character intact. Cuevas and Fischer (2006) set out the tension between member orientation and prudential templates written for investor-owned banks. The second is Brazilian. Bressan et al. (2011) apply the PEARLS system to Brazilian credit cooperatives and model their insolvency risk, and Carvalho et al. (2015) analyse the exit and failure of Brazilian credit unions. More recently, Silva et al. (2023) relate the performance of Brazilian credit unions in the highest segmentation level to PEARLS indicators and find the loan portfolio the main driver of profitability, and Cavinato and Capitani (2023) show that the social efficiency of rural credit cooperatives varies with regional market conditions. None compares cooperatives with banks under a common prudential methodology, the setting used here.</w:t>
       </w:r>
     </w:p>
     <w:p>
@@ -459,7 +459,7 @@
         <w:jc w:val="both"/>
       </w:pPr>
       <w:r>
-        <w:t xml:space="preserve">We hold no prior on the second question, which concerns method: which institutions form the comparison group, how cumulative accounting flows are converted into rates, and how a matched estimator is weighted.</w:t>
+        <w:t xml:space="preserve">We hold no prior on the second question, which concerns method.</w:t>
       </w:r>
     </w:p>
     <w:p>
@@ -718,7 +718,7 @@
         <w:jc w:val="both"/>
       </w:pPr>
       <w:r>
-        <w:t xml:space="preserve">Each rung can further be restricted to banks reporting individually. The ladder stops short of a rung defined on lending, since credit intensity is an outcome and selecting peers on it would build the credit result into the comparison. Of the 339 institutions in the broad group outside the bank rung, 158 have a median of zero credit and zero funds raised (Figure 2), which makes the credit and funding differentials mechanical; we still report the broad group because its divergence from banks is one of our results.</w:t>
+        <w:t xml:space="preserve">Each rung can further be restricted to banks reporting individually. The ladder has no rung defined on lending, since selecting peers on an outcome would build the credit result into the comparison. Of the 339 institutions in the broad group outside the bank rung, 158 have a median of zero credit and zero funds raised (Figure 2), which makes the credit and funding differentials mechanical; we still report the broad group because its divergence from banks is one of our results.</w:t>
       </w:r>
     </w:p>
     <w:p>
@@ -825,7 +825,7 @@
         <w:jc w:val="both"/>
       </w:pPr>
       <w:r>
-        <w:t xml:space="preserve">Two features of IF.data affect how the quarterly outcomes are constructed. First, income flows accumulate within the semester. Financial institutions in Brazil draw up balance sheets semiannually, in June and December (Brasil, 1964), and the IF.data income fields reset at each date. The median ratio of the fourth-quarter to the first-quarter value is between 2.2 and 2.3 for every income field and close to one for balance-sheet stocks. We de-cumulate within each semester and annualise, which scales the return on assets coefficient by about 2.7 relative to reading the cumulative field as a quarterly rate, and leaves every stock-based coefficient unchanged. The de-cumulated levels agree with the Central Bank's published figures: the median annualised return of the singular cooperatives in our panel is 2.9 percent in 2023 and 2.5 percent in 2024, against 2.9 and 2.4 in the Panorama (Banco Central do Brasil, 2025). Second, the intermediation result is reported net of loan loss provisions, because the expense subtotal (</w:t>
+        <w:t xml:space="preserve">Two features of IF.data affect how the quarterly outcomes are constructed. First, income flows accumulate within the semester. Financial institutions in Brazil draw up balance sheets semiannually, in June and December (Brasil, 1964), and the IF.data income fields reset at each date. We de-cumulate within each semester and annualise, which scales the return on assets coefficient by about 2.7 relative to reading the cumulative field as a quarterly rate, and leaves every stock-based coefficient unchanged. The de-cumulated levels agree with the Central Bank's published figures: the median annualised return of the singular cooperatives in our panel is 2.9 percent in 2023 and 2.5 percent in 2024, against 2.9 and 2.4 in the Panorama (Banco Central do Brasil, 2025). Second, the intermediation result is reported net of loan loss provisions, because the expense subtotal (</w:t>
       </w:r>
       <w:r>
         <w:rPr>
@@ -835,7 +835,7 @@
         <w:t xml:space="preserve">b</w:t>
       </w:r>
       <w:r>
-        <w:t xml:space="preserve">) contains line (</w:t>
+        <w:t xml:space="preserve">) contains the provision line (</w:t>
       </w:r>
       <w:r>
         <w:rPr>
@@ -845,17 +845,7 @@
         <w:t xml:space="preserve">b</w:t>
       </w:r>
       <w:r>
-        <w:t xml:space="preserve">5), </w:t>
-      </w:r>
-      <w:r>
-        <w:rPr>
-          <w:i/>
-          <w:iCs/>
-        </w:rPr>
-        <w:t xml:space="preserve">Resultado de Provisão para Créditos de Difícil Liquidação</w:t>
-      </w:r>
-      <w:r>
-        <w:t xml:space="preserve">, so (</w:t>
+        <w:t xml:space="preserve">5), so (</w:t>
       </w:r>
       <w:r>
         <w:rPr>
@@ -1678,7 +1668,7 @@
         <w:jc w:val="both"/>
       </w:pPr>
       <w:r>
-        <w:t xml:space="preserve">Standard errors are clustered by institution, since cooperative status is assigned at the institution level and observations are serially correlated (Cameron &amp; Miller, 2015). Clustered inference is unreliable when few clusters are treated (MacKinnon &amp; Webb, 2017), as in the system-by-system estimates, so every coefficient also carries a restricted wild cluster bootstrap, which re-draws the sign of each institution's residuals under the null and compares the observed statistic with that distribution (Cameron et al., 2008). In simulations on our design with six treated clusters (online appendix), the clustered test over-rejects at both conventional levels, while the bootstrap is conservative at one percent and still over-rejects at five. The few-cluster problem concerns the system splits, which report their treated cluster counts; the main comparison rests on about 130 treated clusters, where the two agree. Quantile coefficients carry intervals from an institution bootstrap. Several outcomes are right-skewed, so we report the conditional median alongside the conditional mean, under one rule for every outcome: the tiers below are assigned on the conditional means alone, and where mean and median disagree the quantile profile decides which describes the typical institution, so that when one tail drives the mean, as for capital, cost-to-income and the pre-tax return, we read the magnitude at the median while the tier still records the mean result.</w:t>
+        <w:t xml:space="preserve">Standard errors are clustered by institution, since cooperative status is assigned at the institution level and observations are serially correlated (Cameron &amp; Miller, 2015). Clustered inference is unreliable when few clusters are treated (MacKinnon &amp; Webb, 2017), as in the system-by-system estimates, so every coefficient also carries a restricted wild cluster bootstrap, which re-draws the sign of each institution's residuals under the null and compares the observed statistic with that distribution (Cameron et al., 2008). In simulations with six treated clusters (online appendix) the clustered test over-rejects and the bootstrap is conservative at one percent; the problem concerns the system splits, while the main comparison rests on about 130 treated clusters, where the two agree. Quantile coefficients carry intervals from an institution bootstrap. Several outcomes are right-skewed, so we report the conditional median alongside the conditional mean, under one rule for every outcome: the tiers below are assigned on the conditional means alone, and where mean and median disagree the quantile profile decides which describes the typical institution, so that when one tail drives the mean, as for capital, cost-to-income and the pre-tax return, we read the magnitude at the median while the tier still records the mean result.</w:t>
       </w:r>
     </w:p>
     <w:p>
@@ -3995,7 +3985,7 @@
         <w:jc w:val="both"/>
       </w:pPr>
       <w:r>
-        <w:t xml:space="preserve">Cooperatives allocate a larger share of the balance sheet to credit, by nearly a fifth of total assets under controls and by more at the conditional median. The differential moves little across the four columns and changes by less than one percentage point across winsorisation rules.</w:t>
+        <w:t xml:space="preserve">Cooperatives allocate a larger share of the balance sheet to credit, by nearly a fifth of total assets under controls and by more at the conditional median.</w:t>
       </w:r>
     </w:p>
     <w:p>
@@ -4019,7 +4009,67 @@
         <w:jc w:val="both"/>
       </w:pPr>
       <w:r>
-        <w:t xml:space="preserve">The capital result requires the most care. Unconditionally, the median cooperative is better capitalised than the median bank for most of the window (Figure 6). Yet the size-controlled mean differential is large and negative in every column of Table 2, and under controls about seven times the conditional median. Figure 4 reconciles the two: the cooperative coefficient is positive at the bottom of the conditional capital distribution and negative at the top, and it crosses zero near the fortieth percentile. Averaged over the twentieth to eightieth percentiles, the differential is about a third of the conditional mean (Table 3). Unconditionally, 14 percent of bank-quarters exceed a Basel ratio of 50 percent, against 1 percent of cooperative-quarters. At equal size, what mainly separates the two groups is dispersion: residualised on size and quarter, the standard deviation of the capital ratio among cooperatives is about a third of the bank figure (online appendix; Figure 6).</w:t>
+        <w:t xml:space="preserve">The capital result requires the most care. Unconditionally, the median cooperative is better capitalised than the median bank for most of the window (Figure 4). Yet the size-controlled mean differential is large and negative in every column of Table 2, and under controls about seven times the conditional median. Figure 5 reconciles the two: the cooperative coefficient is positive at the bottom of the conditional capital distribution and negative at the top, and it crosses zero near the fortieth percentile. Averaged over the twentieth to eightieth percentiles, the differential is about a third of the conditional mean (Table 3). Unconditionally, 14 percent of bank-quarters exceed a Basel ratio of 50 percent, against 1 percent of cooperative-quarters. At equal size, what mainly separates the two groups is dispersion: residualised on size and quarter, the standard deviation of the capital ratio among cooperatives is about a third of the bank figure (online appendix; Figure 4).</w:t>
+      </w:r>
+    </w:p>
+    <w:p>
+      <w:pPr>
+        <w:keepNext/>
+        <w:keepLines/>
+        <w:spacing w:before="120" w:after="60"/>
+        <w:jc w:val="center"/>
+      </w:pPr>
+      <w:r>
+        <w:drawing>
+          <wp:inline distT="0" distB="0" distL="0" distR="0">
+            <wp:extent cx="4824730" cy="3190795"/>
+            <wp:docPr id="104" name="fig11_stable.png"/>
+            <wp:cNvGraphicFramePr>
+              <a:graphicFrameLocks xmlns:a="http://schemas.openxmlformats.org/drawingml/2006/main" noChangeAspect="1"/>
+            </wp:cNvGraphicFramePr>
+            <a:graphic xmlns:a="http://schemas.openxmlformats.org/drawingml/2006/main">
+              <a:graphicData uri="http://schemas.openxmlformats.org/drawingml/2006/picture">
+                <pic:pic xmlns:pic="http://schemas.openxmlformats.org/drawingml/2006/picture">
+                  <pic:nvPicPr>
+                    <pic:cNvPr id="0" name="fig11_stable.png"/>
+                    <pic:cNvPicPr/>
+                  </pic:nvPicPr>
+                  <pic:blipFill>
+                    <a:blip r:embed="rIdImg4"/>
+                    <a:stretch>
+                      <a:fillRect/>
+                    </a:stretch>
+                  </pic:blipFill>
+                  <pic:spPr>
+                    <a:xfrm>
+                      <a:off x="0" y="0"/>
+                      <a:ext cx="4824730" cy="3190795"/>
+                    </a:xfrm>
+                    <a:prstGeom prst="rect">
+                      <a:avLst/>
+                    </a:prstGeom>
+                  </pic:spPr>
+                </pic:pic>
+              </a:graphicData>
+            </a:graphic>
+          </wp:inline>
+        </w:drawing>
+      </w:r>
+    </w:p>
+    <w:p>
+      <w:pPr>
+        <w:pStyle w:val="TablaImagen-Ttulo"/>
+        <w:spacing w:before="0" w:after="60"/>
+      </w:pPr>
+      <w:r>
+        <w:rPr>
+          <w:b/>
+          <w:bCs/>
+        </w:rPr>
+        <w:t xml:space="preserve">Figure 4. </w:t>
+      </w:r>
+      <w:r>
+        <w:t xml:space="preserve">Medians and interquartile ranges, 2017 to 2024</w:t>
       </w:r>
     </w:p>
     <w:p>
@@ -6102,7 +6152,7 @@
         <w:jc w:val="both"/>
       </w:pPr>
       <w:r>
-        <w:t xml:space="preserve">Two features locate the bank upper tail. It sits among the banks that report individually, against which the controlled gap is about four times the gap against the consolidations (online appendix), and it thins when banks must be deposit-funded in every quarter: the structural rung roughly halves both the share of bank-quarters above 50 percent and the estimated mean gap, which remains significant (Figure 5). Against deposit-taking banks the capital difference is thus a modest gap in level and a large gap in dispersion.</w:t>
+        <w:t xml:space="preserve">Two features locate the bank upper tail. It sits among the banks that report individually, against which the controlled gap is about four times the gap against the consolidations (online appendix), and it thins when banks must be deposit-funded in every quarter: the structural rung roughly halves both the share of bank-quarters above 50 percent and the estimated mean gap, which remains significant (Figure 6). Against deposit-taking banks the capital difference is thus a modest gap in level and a large gap in dispersion.</w:t>
       </w:r>
     </w:p>
     <w:p>
@@ -6116,7 +6166,7 @@
         <w:drawing>
           <wp:inline distT="0" distB="0" distL="0" distR="0">
             <wp:extent cx="4824730" cy="2060346"/>
-            <wp:docPr id="104" name="fig12_capital_quantiles.png"/>
+            <wp:docPr id="105" name="fig12_capital_quantiles.png"/>
             <wp:cNvGraphicFramePr>
               <a:graphicFrameLocks xmlns:a="http://schemas.openxmlformats.org/drawingml/2006/main" noChangeAspect="1"/>
             </wp:cNvGraphicFramePr>
@@ -6128,7 +6178,7 @@
                     <pic:cNvPicPr/>
                   </pic:nvPicPr>
                   <pic:blipFill>
-                    <a:blip r:embed="rIdImg4"/>
+                    <a:blip r:embed="rIdImg5"/>
                     <a:stretch>
                       <a:fillRect/>
                     </a:stretch>
@@ -6161,7 +6211,7 @@
           <w:b/>
           <w:bCs/>
         </w:rPr>
-        <w:t xml:space="preserve">Figure 4. </w:t>
+        <w:t xml:space="preserve">Figure 5. </w:t>
       </w:r>
       <w:r>
         <w:t xml:space="preserve">The capital ratio across the distribution</w:t>
@@ -6185,7 +6235,7 @@
         <w:jc w:val="both"/>
       </w:pPr>
       <w:r>
-        <w:t xml:space="preserve">The same pattern holds for the other outcomes. Averaged over the twentieth to eightieth percentiles, the differential is of similar size to the conditional mean for credit intensity and the after-tax return. For leverage and cost-to-income it is little more than a third of the mean, and both change sign inside the distribution. At equal size, cooperatives are the more homogeneous group on every outcome, with residual standard deviations between a tenth and a half of the bank figure. Leverage and capital are closely correlated among cooperatives, and we treat the two as a single result.</w:t>
+        <w:t xml:space="preserve">Averaged over the twentieth to eightieth percentiles, the differential is of similar size to the conditional mean for credit intensity and the after-tax return. For leverage and cost-to-income it is little more than a third of the mean, and both change sign inside the distribution. At equal size, cooperatives are the more homogeneous group on every outcome, with residual standard deviations between a tenth and a half of the bank figure. Leverage and capital are closely correlated among cooperatives, and we treat the two as a single result.</w:t>
       </w:r>
     </w:p>
     <w:p>
@@ -6217,7 +6267,7 @@
         <w:jc w:val="both"/>
       </w:pPr>
       <w:r>
-        <w:t xml:space="preserve">Table 4 states which differentials survive against which comparison group, and Figure 5 shows their size and precision on the same five rungs: the broad group, banks, banks within macro-region, commercial banks and structural banks. The after-tax return, cost-to-income and return volatility survive on every rung; credit intensity survives on the four national rungs and not within region (Section 4.3); the pre-tax return survives on the three bank rungs only. Two results that appear against the broad group disappear against banks.</w:t>
+        <w:t xml:space="preserve">Table 4 states which differentials survive against which comparison group, and Figure 6 shows their size and precision on the same five rungs: the broad group, banks, banks within macro-region, commercial banks and structural banks. The after-tax return, cost-to-income and return volatility survive on every rung; credit intensity survives on the four national rungs and not within region (Section 4.3); the pre-tax return survives on the three bank rungs only. Two results that appear against the broad group disappear against banks.</w:t>
       </w:r>
     </w:p>
     <w:p>
@@ -7706,7 +7756,7 @@
         <w:drawing>
           <wp:inline distT="0" distB="0" distL="0" distR="0">
             <wp:extent cx="4824730" cy="5889462"/>
-            <wp:docPr id="105" name="fig13_ladder.png"/>
+            <wp:docPr id="106" name="fig13_ladder.png"/>
             <wp:cNvGraphicFramePr>
               <a:graphicFrameLocks xmlns:a="http://schemas.openxmlformats.org/drawingml/2006/main" noChangeAspect="1"/>
             </wp:cNvGraphicFramePr>
@@ -7718,7 +7768,7 @@
                     <pic:cNvPicPr/>
                   </pic:nvPicPr>
                   <pic:blipFill>
-                    <a:blip r:embed="rIdImg5"/>
+                    <a:blip r:embed="rIdImg6"/>
                     <a:stretch>
                       <a:fillRect/>
                     </a:stretch>
@@ -7751,7 +7801,7 @@
           <w:b/>
           <w:bCs/>
         </w:rPr>
-        <w:t xml:space="preserve">Figure 5. </w:t>
+        <w:t xml:space="preserve">Figure 6. </w:t>
       </w:r>
       <w:r>
         <w:t xml:space="preserve">Cooperative coefficient by comparison group</w:t>
@@ -7788,76 +7838,10 @@
     </w:p>
     <w:p>
       <w:pPr>
-        <w:keepNext/>
-        <w:keepLines/>
-        <w:spacing w:before="120" w:after="60"/>
-        <w:jc w:val="center"/>
-      </w:pPr>
-      <w:r>
-        <w:drawing>
-          <wp:inline distT="0" distB="0" distL="0" distR="0">
-            <wp:extent cx="4824730" cy="3190795"/>
-            <wp:docPr id="106" name="fig11_stable.png"/>
-            <wp:cNvGraphicFramePr>
-              <a:graphicFrameLocks xmlns:a="http://schemas.openxmlformats.org/drawingml/2006/main" noChangeAspect="1"/>
-            </wp:cNvGraphicFramePr>
-            <a:graphic xmlns:a="http://schemas.openxmlformats.org/drawingml/2006/main">
-              <a:graphicData uri="http://schemas.openxmlformats.org/drawingml/2006/picture">
-                <pic:pic xmlns:pic="http://schemas.openxmlformats.org/drawingml/2006/picture">
-                  <pic:nvPicPr>
-                    <pic:cNvPr id="0" name="fig11_stable.png"/>
-                    <pic:cNvPicPr/>
-                  </pic:nvPicPr>
-                  <pic:blipFill>
-                    <a:blip r:embed="rIdImg6"/>
-                    <a:stretch>
-                      <a:fillRect/>
-                    </a:stretch>
-                  </pic:blipFill>
-                  <pic:spPr>
-                    <a:xfrm>
-                      <a:off x="0" y="0"/>
-                      <a:ext cx="4824730" cy="3190795"/>
-                    </a:xfrm>
-                    <a:prstGeom prst="rect">
-                      <a:avLst/>
-                    </a:prstGeom>
-                  </pic:spPr>
-                </pic:pic>
-              </a:graphicData>
-            </a:graphic>
-          </wp:inline>
-        </w:drawing>
-      </w:r>
-    </w:p>
-    <w:p>
-      <w:pPr>
-        <w:pStyle w:val="TablaImagen-Ttulo"/>
-        <w:spacing w:before="0" w:after="60"/>
-      </w:pPr>
-      <w:r>
-        <w:rPr>
-          <w:b/>
-          <w:bCs/>
-        </w:rPr>
-        <w:t xml:space="preserve">Figure 6. </w:t>
-      </w:r>
-      <w:r>
-        <w:t xml:space="preserve">Medians and interquartile ranges, 2017 to 2024</w:t>
-      </w:r>
-    </w:p>
-    <w:p>
-      <w:pPr>
         <w:jc w:val="both"/>
       </w:pPr>
       <w:r>
         <w:t xml:space="preserve">Against all non-cooperatives, cooperatives appear to provision less, significant at one percent in all four specifications, while against banks the coefficient is close to zero. The broad-group gap comes from the non-banking lenders, whose provisioning ratios are nearly three times those of banks and cooperatives. At the conditional median the sign reverses, with cooperatives provisioning more. Split into terciles of the Basel ratio, where supervisory concern attaches, no tercile shows cooperatives provisioning less: the differential is positive and significant only in the middle tercile on the unconditional ratio, and no tercile differs on the residualised ratio. The result most likely describes how the two groups classify their books.</w:t>
-      </w:r>
-      <w:r>
-        <w:rPr>
-          <w:rStyle w:val="FootnoteReference"/>
-        </w:rPr>
-        <w:footnoteReference w:id="2"/>
       </w:r>
     </w:p>
     <w:p>
@@ -7961,7 +7945,7 @@
         <w:jc w:val="both"/>
       </w:pPr>
       <w:r>
-        <w:t xml:space="preserve">The full-methodology restriction equalises the regulatory environment, but it also selects the sample. The cooperatives we observe are the largest in the country, about a tenth of all cooperatives recorded in the panel. Fifty-one singular cooperatives are observed under the simplified methodology before they adopt the full methodology during the window. We compare those future adopters with cooperatives that never adopt, on pre-adoption quarters only and conditioning on size and quarter. The two groups show no difference in leverage, but adopters were less credit-intensive (−0.068, </w:t>
+        <w:t xml:space="preserve">The full-methodology restriction equalises the regulatory environment, but it also selects the sample. The cooperatives we observe are the largest in the country, about a tenth of all cooperatives recorded in the panel. Fifty-one cooperatives are observed under the simplified methodology before adopting the full one; we compare them with cooperatives that never adopt, on pre-adoption quarters only, conditioning on size and quarter. The two groups show no difference in leverage, but adopters were less credit-intensive (−0.068, </w:t>
       </w:r>
       <w:r>
         <w:rPr>
@@ -8083,7 +8067,7 @@
         <w:jc w:val="both"/>
       </w:pPr>
       <w:r>
-        <w:t xml:space="preserve">Six limitations bound the claims. Because cooperative status is time-invariant, the estimates are conditional correlations. The full-methodology restriction selects the largest cooperatives, and the results generalise only to that subpopulation. The provisioning ratio is an accounting variable and does not measure delinquency. The stability outcomes are institution-level statistics on a subsample, estimated without quarter effects. Most systems are too thinly represented for separate inference, and the network backstop hypothesis needs consolidated network data that IF.data does not carry. The mediator question in Section 4.3 also needs a market measure finer than macro-region, and IF.data's credit-modality modules, which carry rural credit, are the natural next step. Finally, a within-institution design around adoption of the full methodology fails to identify a regime effect, because adoption follows growth and pre-adoption trends run through the adoption date without a break.</w:t>
+        <w:t xml:space="preserve">Because cooperative status is time-invariant, the estimates are conditional correlations. The full-methodology restriction selects the largest cooperatives, and the results generalise only to that subpopulation. The provisioning ratio is an accounting variable and does not measure delinquency. The stability outcomes are institution-level statistics on a subsample, estimated without quarter effects. Most systems are too thinly represented for separate inference, and the network backstop hypothesis needs consolidated network data that IF.data does not carry. The mediator question in Section 4.3 also needs a market measure finer than macro-region, and IF.data's credit-modality modules, which carry rural credit, are the natural next step, since regional conditions shape rural cooperatives' efficiency (Cavinato &amp; Capitani, 2023). Finally, a within-institution design around adoption of the full methodology fails to identify a regime effect, because adoption follows growth and pre-adoption trends run through the adoption date without a break.</w:t>
       </w:r>
     </w:p>
     <w:p>
@@ -8131,7 +8115,7 @@
         <w:jc w:val="both"/>
       </w:pPr>
       <w:r>
-        <w:t xml:space="preserve">For the cooperative movement, the difference between the two forms persists under a common prudential methodology, in a narrower form than a loose comparison suggests. Our evidence does not support a case resting on cooperatives provisioning more conservatively than banks. A case resting on cost at the median and on return stability holds against every definition of a bank we tried; one resting on profitability holds for the retained return and, for the operating return, at the median rather than at the mean. One resting on credit intensity holds against the national bank population and remains unshown within regional markets; the territorial claim is the one these data leave open.</w:t>
+        <w:t xml:space="preserve">For the cooperative movement, the difference between the two forms persists under a common prudential methodology, in a narrower form than a loose comparison suggests. Our evidence does not support a case resting on cooperatives provisioning more conservatively than banks. A case resting on cost at the median and on return stability holds against every definition of a bank we tried; one resting on profitability holds for the retained return and, for the operating return, at the median rather than at the mean. One resting on credit intensity holds nationally and remains unshown within regional markets.</w:t>
       </w:r>
     </w:p>
     <w:p>
@@ -8245,7 +8229,7 @@
           <w:sz w:val="18"/>
           <w:szCs w:val="18"/>
         </w:rPr>
-        <w:t xml:space="preserve">Banco Central do Brasil. (2026). </w:t>
+        <w:t xml:space="preserve">Basel Committee on Banking Supervision. (2011). </w:t>
       </w:r>
       <w:r>
         <w:rPr>
@@ -8254,14 +8238,14 @@
           <w:sz w:val="18"/>
           <w:szCs w:val="18"/>
         </w:rPr>
-        <w:t xml:space="preserve">Panorama do Sistema Nacional de Crédito Cooperativo: data-base dezembro de 2025</w:t>
-      </w:r>
-      <w:r>
-        <w:rPr>
-          <w:sz w:val="18"/>
-          <w:szCs w:val="18"/>
-        </w:rPr>
-        <w:t xml:space="preserve">. </w:t>
+        <w:t xml:space="preserve">Basel III: A global regulatory framework for more resilient banks and banking systems</w:t>
+      </w:r>
+      <w:r>
+        <w:rPr>
+          <w:sz w:val="18"/>
+          <w:szCs w:val="18"/>
+        </w:rPr>
+        <w:t xml:space="preserve">. Bank for International Settlements. </w:t>
       </w:r>
     </w:p>
     <w:p>
@@ -8275,7 +8259,7 @@
           <w:sz w:val="18"/>
           <w:szCs w:val="18"/>
         </w:rPr>
-        <w:t xml:space="preserve">Basel Committee on Banking Supervision. (2011). </w:t>
+        <w:t xml:space="preserve">Basel Committee on Banking Supervision. (2019). </w:t>
       </w:r>
       <w:r>
         <w:rPr>
@@ -8284,7 +8268,7 @@
           <w:sz w:val="18"/>
           <w:szCs w:val="18"/>
         </w:rPr>
-        <w:t xml:space="preserve">Basel III: A global regulatory framework for more resilient banks and banking systems</w:t>
+        <w:t xml:space="preserve">Proportionality in bank regulation and supervision: A survey on current practices</w:t>
       </w:r>
       <w:r>
         <w:rPr>
@@ -8305,7 +8289,7 @@
           <w:sz w:val="18"/>
           <w:szCs w:val="18"/>
         </w:rPr>
-        <w:t xml:space="preserve">Basel Committee on Banking Supervision. (2019). </w:t>
+        <w:t xml:space="preserve">Becchetti, L., Ciciretti, R., &amp; Paolantonio, A. (2016). The cooperative bank difference before and after the global financial crisis. </w:t>
       </w:r>
       <w:r>
         <w:rPr>
@@ -8314,14 +8298,30 @@
           <w:sz w:val="18"/>
           <w:szCs w:val="18"/>
         </w:rPr>
-        <w:t xml:space="preserve">Proportionality in bank regulation and supervision: A survey on current practices</w:t>
-      </w:r>
-      <w:r>
-        <w:rPr>
-          <w:sz w:val="18"/>
-          <w:szCs w:val="18"/>
-        </w:rPr>
-        <w:t xml:space="preserve">. Bank for International Settlements. </w:t>
+        <w:t xml:space="preserve">Journal of International Money and Finance</w:t>
+      </w:r>
+      <w:r>
+        <w:rPr>
+          <w:sz w:val="18"/>
+          <w:szCs w:val="18"/>
+        </w:rPr>
+        <w:t xml:space="preserve">, </w:t>
+      </w:r>
+      <w:r>
+        <w:rPr>
+          <w:i/>
+          <w:iCs/>
+          <w:sz w:val="18"/>
+          <w:szCs w:val="18"/>
+        </w:rPr>
+        <w:t xml:space="preserve">69</w:t>
+      </w:r>
+      <w:r>
+        <w:rPr>
+          <w:sz w:val="18"/>
+          <w:szCs w:val="18"/>
+        </w:rPr>
+        <w:t xml:space="preserve">, 224–246. https://doi.org/10.1016/j.jimonfin.2016.06.016</w:t>
       </w:r>
     </w:p>
     <w:p>
@@ -8335,7 +8335,7 @@
           <w:sz w:val="18"/>
           <w:szCs w:val="18"/>
         </w:rPr>
-        <w:t xml:space="preserve">Becchetti, L., Ciciretti, R., &amp; Paolantonio, A. (2016). The cooperative bank difference before and after the global financial crisis. </w:t>
+        <w:t xml:space="preserve">Berg, J., &amp; Geeroms, H. (2026). </w:t>
       </w:r>
       <w:r>
         <w:rPr>
@@ -8344,30 +8344,14 @@
           <w:sz w:val="18"/>
           <w:szCs w:val="18"/>
         </w:rPr>
-        <w:t xml:space="preserve">Journal of International Money and Finance</w:t>
-      </w:r>
-      <w:r>
-        <w:rPr>
-          <w:sz w:val="18"/>
-          <w:szCs w:val="18"/>
-        </w:rPr>
-        <w:t xml:space="preserve">, </w:t>
-      </w:r>
-      <w:r>
-        <w:rPr>
-          <w:i/>
-          <w:iCs/>
-          <w:sz w:val="18"/>
-          <w:szCs w:val="18"/>
-        </w:rPr>
-        <w:t xml:space="preserve">69</w:t>
-      </w:r>
-      <w:r>
-        <w:rPr>
-          <w:sz w:val="18"/>
-          <w:szCs w:val="18"/>
-        </w:rPr>
-        <w:t xml:space="preserve">, 224–246. https://doi.org/10.1016/j.jimonfin.2016.06.016</w:t>
+        <w:t xml:space="preserve">Calls for EU financial-rule simplification should not spill over into lower standards</w:t>
+      </w:r>
+      <w:r>
+        <w:rPr>
+          <w:sz w:val="18"/>
+          <w:szCs w:val="18"/>
+        </w:rPr>
+        <w:t xml:space="preserve">. Bruegel Analysis 21/2026. https://www.bruegel.org/analysis/calls-eu-financial-rule-simplification-should-not-spill-over-lower-standards</w:t>
       </w:r>
     </w:p>
     <w:p>
@@ -8685,7 +8669,7 @@
           <w:sz w:val="18"/>
           <w:szCs w:val="18"/>
         </w:rPr>
-        <w:t xml:space="preserve">Coelho, R., Mazzillo, J. A., Svoronos, J.-P., &amp; Yu, T. (2019). </w:t>
+        <w:t xml:space="preserve">Cavinato, N. R., &amp; Capitani, D. H. D. (2023). Eficiência social das cooperativas de crédito rural no Brasil: uma análise sob a ótica regional. </w:t>
       </w:r>
       <w:r>
         <w:rPr>
@@ -8694,14 +8678,30 @@
           <w:sz w:val="18"/>
           <w:szCs w:val="18"/>
         </w:rPr>
-        <w:t xml:space="preserve">Regulation and supervision of financial cooperatives</w:t>
-      </w:r>
-      <w:r>
-        <w:rPr>
-          <w:sz w:val="18"/>
-          <w:szCs w:val="18"/>
-        </w:rPr>
-        <w:t xml:space="preserve"> (FSI Insights on Policy Implementation No. 15). Bank for International Settlements, Financial Stability Institute. </w:t>
+        <w:t xml:space="preserve">Economia e Sociedade</w:t>
+      </w:r>
+      <w:r>
+        <w:rPr>
+          <w:sz w:val="18"/>
+          <w:szCs w:val="18"/>
+        </w:rPr>
+        <w:t xml:space="preserve">, </w:t>
+      </w:r>
+      <w:r>
+        <w:rPr>
+          <w:i/>
+          <w:iCs/>
+          <w:sz w:val="18"/>
+          <w:szCs w:val="18"/>
+        </w:rPr>
+        <w:t xml:space="preserve">32</w:t>
+      </w:r>
+      <w:r>
+        <w:rPr>
+          <w:sz w:val="18"/>
+          <w:szCs w:val="18"/>
+        </w:rPr>
+        <w:t xml:space="preserve">(2), 429–455. https://doi.org/10.1590/1982-3533.2023v32n2art08</w:t>
       </w:r>
     </w:p>
     <w:p>
@@ -8715,7 +8715,7 @@
           <w:sz w:val="18"/>
           <w:szCs w:val="18"/>
         </w:rPr>
-        <w:t xml:space="preserve">Conselho Monetário Nacional. (1999). </w:t>
+        <w:t xml:space="preserve">Coelho, R., Mazzillo, J. A., Svoronos, J.-P., &amp; Yu, T. (2019). </w:t>
       </w:r>
       <w:r>
         <w:rPr>
@@ -8724,14 +8724,14 @@
           <w:sz w:val="18"/>
           <w:szCs w:val="18"/>
         </w:rPr>
-        <w:t xml:space="preserve">Resolução nº 2.682, de 21 de dezembro de 1999. Critérios de classificação das operações de crédito e regras para constituição de provisão</w:t>
-      </w:r>
-      <w:r>
-        <w:rPr>
-          <w:sz w:val="18"/>
-          <w:szCs w:val="18"/>
-        </w:rPr>
-        <w:t xml:space="preserve">. Banco Central do Brasil. https://www.bcb.gov.br/pre/normativos/res/1999/pdf/res_2682_v2_L.pdf</w:t>
+        <w:t xml:space="preserve">Regulation and supervision of financial cooperatives</w:t>
+      </w:r>
+      <w:r>
+        <w:rPr>
+          <w:sz w:val="18"/>
+          <w:szCs w:val="18"/>
+        </w:rPr>
+        <w:t xml:space="preserve"> (FSI Insights on Policy Implementation No. 15). Bank for International Settlements, Financial Stability Institute. </w:t>
       </w:r>
     </w:p>
     <w:p>
@@ -8745,7 +8745,7 @@
           <w:sz w:val="18"/>
           <w:szCs w:val="18"/>
         </w:rPr>
-        <w:t xml:space="preserve">Conselho Monetário Nacional. (2013). </w:t>
+        <w:t xml:space="preserve">Conselho Monetário Nacional. (1999). </w:t>
       </w:r>
       <w:r>
         <w:rPr>
@@ -8754,14 +8754,14 @@
           <w:sz w:val="18"/>
           <w:szCs w:val="18"/>
         </w:rPr>
-        <w:t xml:space="preserve">Resolução nº 4.284, de 5 de novembro de 2013. Aprova o Estatuto e o Regulamento do Fundo Garantidor do Cooperativismo de Crédito (FGCoop) e estabelece a forma de contribuição</w:t>
-      </w:r>
-      <w:r>
-        <w:rPr>
-          <w:sz w:val="18"/>
-          <w:szCs w:val="18"/>
-        </w:rPr>
-        <w:t xml:space="preserve">. Banco Central do Brasil. https://www.bcb.gov.br/pre/normativos/res/2013/pdf/res_4284_v1_o.pdf</w:t>
+        <w:t xml:space="preserve">Resolução nº 2.682, de 21 de dezembro de 1999. Critérios de classificação das operações de crédito e regras para constituição de provisão</w:t>
+      </w:r>
+      <w:r>
+        <w:rPr>
+          <w:sz w:val="18"/>
+          <w:szCs w:val="18"/>
+        </w:rPr>
+        <w:t xml:space="preserve">. Banco Central do Brasil. https://www.bcb.gov.br/pre/normativos/res/1999/pdf/res_2682_v2_L.pdf</w:t>
       </w:r>
     </w:p>
     <w:p>
@@ -8775,7 +8775,7 @@
           <w:sz w:val="18"/>
           <w:szCs w:val="18"/>
         </w:rPr>
-        <w:t xml:space="preserve">Conselho Monetário Nacional. (2015). </w:t>
+        <w:t xml:space="preserve">Conselho Monetário Nacional. (2013). </w:t>
       </w:r>
       <w:r>
         <w:rPr>
@@ -8784,14 +8784,14 @@
           <w:sz w:val="18"/>
           <w:szCs w:val="18"/>
         </w:rPr>
-        <w:t xml:space="preserve">Resolução nº 4.401, de 27 de fevereiro de 2015. Requerimentos mínimos de liquidez de curto prazo (LCR)</w:t>
-      </w:r>
-      <w:r>
-        <w:rPr>
-          <w:sz w:val="18"/>
-          <w:szCs w:val="18"/>
-        </w:rPr>
-        <w:t xml:space="preserve">. Banco Central do Brasil. </w:t>
+        <w:t xml:space="preserve">Resolução nº 4.284, de 5 de novembro de 2013. Aprova o Estatuto e o Regulamento do Fundo Garantidor do Cooperativismo de Crédito (FGCoop) e estabelece a forma de contribuição</w:t>
+      </w:r>
+      <w:r>
+        <w:rPr>
+          <w:sz w:val="18"/>
+          <w:szCs w:val="18"/>
+        </w:rPr>
+        <w:t xml:space="preserve">. Banco Central do Brasil. https://www.bcb.gov.br/pre/normativos/res/2013/pdf/res_4284_v1_o.pdf</w:t>
       </w:r>
     </w:p>
     <w:p>
@@ -8805,7 +8805,7 @@
           <w:sz w:val="18"/>
           <w:szCs w:val="18"/>
         </w:rPr>
-        <w:t xml:space="preserve">Conselho Monetário Nacional. (2017a). </w:t>
+        <w:t xml:space="preserve">Conselho Monetário Nacional. (2015). </w:t>
       </w:r>
       <w:r>
         <w:rPr>
@@ -8814,14 +8814,14 @@
           <w:sz w:val="18"/>
           <w:szCs w:val="18"/>
         </w:rPr>
-        <w:t xml:space="preserve">Resolução nº 4.553, de 30 de janeiro de 2017. Segmentação do conjunto das instituições financeiras para fins de aplicação proporcional da regulação prudencial</w:t>
-      </w:r>
-      <w:r>
-        <w:rPr>
-          <w:sz w:val="18"/>
-          <w:szCs w:val="18"/>
-        </w:rPr>
-        <w:t xml:space="preserve">. Banco Central do Brasil. https://normativos.bcb.gov.br/Lists/Normativos/Attachments/50335/Res_4553_v2_L.pdf</w:t>
+        <w:t xml:space="preserve">Resolução nº 4.401, de 27 de fevereiro de 2015. Requerimentos mínimos de liquidez de curto prazo (LCR)</w:t>
+      </w:r>
+      <w:r>
+        <w:rPr>
+          <w:sz w:val="18"/>
+          <w:szCs w:val="18"/>
+        </w:rPr>
+        <w:t xml:space="preserve">. Banco Central do Brasil. </w:t>
       </w:r>
     </w:p>
     <w:p>
@@ -8835,7 +8835,7 @@
           <w:sz w:val="18"/>
           <w:szCs w:val="18"/>
         </w:rPr>
-        <w:t xml:space="preserve">Conselho Monetário Nacional. (2017b). </w:t>
+        <w:t xml:space="preserve">Conselho Monetário Nacional. (2017a). </w:t>
       </w:r>
       <w:r>
         <w:rPr>
@@ -8844,14 +8844,14 @@
           <w:sz w:val="18"/>
           <w:szCs w:val="18"/>
         </w:rPr>
-        <w:t xml:space="preserve">Resolução nº 4.606, de 19 de outubro de 2017. Metodologia facultativa simplificada para apuração do requerimento mínimo de Patrimônio de Referência Simplificado (PRS5)</w:t>
-      </w:r>
-      <w:r>
-        <w:rPr>
-          <w:sz w:val="18"/>
-          <w:szCs w:val="18"/>
-        </w:rPr>
-        <w:t xml:space="preserve">. Banco Central do Brasil. https://normativos.bcb.gov.br/Lists/Normativos/Attachments/50454/Res_4606_v5_P.pdf</w:t>
+        <w:t xml:space="preserve">Resolução nº 4.553, de 30 de janeiro de 2017. Segmentação do conjunto das instituições financeiras para fins de aplicação proporcional da regulação prudencial</w:t>
+      </w:r>
+      <w:r>
+        <w:rPr>
+          <w:sz w:val="18"/>
+          <w:szCs w:val="18"/>
+        </w:rPr>
+        <w:t xml:space="preserve">. Banco Central do Brasil. https://normativos.bcb.gov.br/Lists/Normativos/Attachments/50335/Res_4553_v2_L.pdf</w:t>
       </w:r>
     </w:p>
     <w:p>
@@ -8865,7 +8865,7 @@
           <w:sz w:val="18"/>
           <w:szCs w:val="18"/>
         </w:rPr>
-        <w:t xml:space="preserve">Conselho Monetário Nacional. (2017c). </w:t>
+        <w:t xml:space="preserve">Conselho Monetário Nacional. (2017b). </w:t>
       </w:r>
       <w:r>
         <w:rPr>
@@ -8874,14 +8874,14 @@
           <w:sz w:val="18"/>
           <w:szCs w:val="18"/>
         </w:rPr>
-        <w:t xml:space="preserve">Resolução nº 4.615, de 30 de novembro de 2017. Razão de Alavancagem</w:t>
-      </w:r>
-      <w:r>
-        <w:rPr>
-          <w:sz w:val="18"/>
-          <w:szCs w:val="18"/>
-        </w:rPr>
-        <w:t xml:space="preserve">. Banco Central do Brasil. </w:t>
+        <w:t xml:space="preserve">Resolução nº 4.606, de 19 de outubro de 2017. Metodologia facultativa simplificada para apuração do requerimento mínimo de Patrimônio de Referência Simplificado (PRS5)</w:t>
+      </w:r>
+      <w:r>
+        <w:rPr>
+          <w:sz w:val="18"/>
+          <w:szCs w:val="18"/>
+        </w:rPr>
+        <w:t xml:space="preserve">. Banco Central do Brasil. https://normativos.bcb.gov.br/Lists/Normativos/Attachments/50454/Res_4606_v5_P.pdf</w:t>
       </w:r>
     </w:p>
     <w:p>
@@ -8895,7 +8895,7 @@
           <w:sz w:val="18"/>
           <w:szCs w:val="18"/>
         </w:rPr>
-        <w:t xml:space="preserve">Conselho Monetário Nacional. (2017d). </w:t>
+        <w:t xml:space="preserve">Conselho Monetário Nacional. (2017c). </w:t>
       </w:r>
       <w:r>
         <w:rPr>
@@ -8904,14 +8904,14 @@
           <w:sz w:val="18"/>
           <w:szCs w:val="18"/>
         </w:rPr>
-        <w:t xml:space="preserve">Resolução nº 4.616, de 30 de novembro de 2017. Requerimento mínimo de liquidez de longo prazo (NSFR)</w:t>
-      </w:r>
-      <w:r>
-        <w:rPr>
-          <w:sz w:val="18"/>
-          <w:szCs w:val="18"/>
-        </w:rPr>
-        <w:t xml:space="preserve">. Banco Central do Brasil. https://normativos.bcb.gov.br/Lists/Normativos/Attachments/50474/Res_4616_v1_O.pdf</w:t>
+        <w:t xml:space="preserve">Resolução nº 4.615, de 30 de novembro de 2017. Razão de Alavancagem</w:t>
+      </w:r>
+      <w:r>
+        <w:rPr>
+          <w:sz w:val="18"/>
+          <w:szCs w:val="18"/>
+        </w:rPr>
+        <w:t xml:space="preserve">. Banco Central do Brasil. </w:t>
       </w:r>
     </w:p>
     <w:p>
@@ -8925,7 +8925,7 @@
           <w:sz w:val="18"/>
           <w:szCs w:val="18"/>
         </w:rPr>
-        <w:t xml:space="preserve">Conselho Monetário Nacional. (2021a). </w:t>
+        <w:t xml:space="preserve">Conselho Monetário Nacional. (2017d). </w:t>
       </w:r>
       <w:r>
         <w:rPr>
@@ -8934,14 +8934,14 @@
           <w:sz w:val="18"/>
           <w:szCs w:val="18"/>
         </w:rPr>
-        <w:t xml:space="preserve">Resolução nº 4.955, de 21 de outubro de 2021. Metodologia para apuração do Patrimônio de Referência</w:t>
-      </w:r>
-      <w:r>
-        <w:rPr>
-          <w:sz w:val="18"/>
-          <w:szCs w:val="18"/>
-        </w:rPr>
-        <w:t xml:space="preserve">. Banco Central do Brasil. </w:t>
+        <w:t xml:space="preserve">Resolução nº 4.616, de 30 de novembro de 2017. Requerimento mínimo de liquidez de longo prazo (NSFR)</w:t>
+      </w:r>
+      <w:r>
+        <w:rPr>
+          <w:sz w:val="18"/>
+          <w:szCs w:val="18"/>
+        </w:rPr>
+        <w:t xml:space="preserve">. Banco Central do Brasil. https://normativos.bcb.gov.br/Lists/Normativos/Attachments/50474/Res_4616_v1_O.pdf</w:t>
       </w:r>
     </w:p>
     <w:p>
@@ -8955,7 +8955,7 @@
           <w:sz w:val="18"/>
           <w:szCs w:val="18"/>
         </w:rPr>
-        <w:t xml:space="preserve">Conselho Monetário Nacional. (2021b). </w:t>
+        <w:t xml:space="preserve">Conselho Monetário Nacional. (2021a). </w:t>
       </w:r>
       <w:r>
         <w:rPr>
@@ -8964,7 +8964,7 @@
           <w:sz w:val="18"/>
           <w:szCs w:val="18"/>
         </w:rPr>
-        <w:t xml:space="preserve">Resolução nº 4.958, de 21 de outubro de 2021. Requerimentos mínimos de Patrimônio de Referência, de Nível I e de Capital Principal e adicional de Capital Principal</w:t>
+        <w:t xml:space="preserve">Resolução nº 4.955, de 21 de outubro de 2021. Metodologia para apuração do Patrimônio de Referência</w:t>
       </w:r>
       <w:r>
         <w:rPr>
@@ -8985,7 +8985,7 @@
           <w:sz w:val="18"/>
           <w:szCs w:val="18"/>
         </w:rPr>
-        <w:t xml:space="preserve">Cook, M. L. (1995). The future of U.S. agricultural cooperatives: A neo-institutional approach. </w:t>
+        <w:t xml:space="preserve">Conselho Monetário Nacional. (2021b). </w:t>
       </w:r>
       <w:r>
         <w:rPr>
@@ -8994,30 +8994,14 @@
           <w:sz w:val="18"/>
           <w:szCs w:val="18"/>
         </w:rPr>
-        <w:t xml:space="preserve">American Journal of Agricultural Economics</w:t>
-      </w:r>
-      <w:r>
-        <w:rPr>
-          <w:sz w:val="18"/>
-          <w:szCs w:val="18"/>
-        </w:rPr>
-        <w:t xml:space="preserve">, </w:t>
-      </w:r>
-      <w:r>
-        <w:rPr>
-          <w:i/>
-          <w:iCs/>
-          <w:sz w:val="18"/>
-          <w:szCs w:val="18"/>
-        </w:rPr>
-        <w:t xml:space="preserve">77</w:t>
-      </w:r>
-      <w:r>
-        <w:rPr>
-          <w:sz w:val="18"/>
-          <w:szCs w:val="18"/>
-        </w:rPr>
-        <w:t xml:space="preserve">(5), 1153–1159. https://doi.org/10.2307/1243338</w:t>
+        <w:t xml:space="preserve">Resolução nº 4.958, de 21 de outubro de 2021. Requerimentos mínimos de Patrimônio de Referência, de Nível I e de Capital Principal e adicional de Capital Principal</w:t>
+      </w:r>
+      <w:r>
+        <w:rPr>
+          <w:sz w:val="18"/>
+          <w:szCs w:val="18"/>
+        </w:rPr>
+        <w:t xml:space="preserve">. Banco Central do Brasil. </w:t>
       </w:r>
     </w:p>
     <w:p>
@@ -9031,7 +9015,7 @@
           <w:sz w:val="18"/>
           <w:szCs w:val="18"/>
         </w:rPr>
-        <w:t xml:space="preserve">Cuevas, C. E., &amp; Fischer, K. P. (2006). </w:t>
+        <w:t xml:space="preserve">Cook, M. L. (1995). The future of U.S. agricultural cooperatives: A neo-institutional approach. </w:t>
       </w:r>
       <w:r>
         <w:rPr>
@@ -9040,14 +9024,30 @@
           <w:sz w:val="18"/>
           <w:szCs w:val="18"/>
         </w:rPr>
-        <w:t xml:space="preserve">Cooperative financial institutions: Issues in governance, regulation, and supervision</w:t>
-      </w:r>
-      <w:r>
-        <w:rPr>
-          <w:sz w:val="18"/>
-          <w:szCs w:val="18"/>
-        </w:rPr>
-        <w:t xml:space="preserve"> (World Bank Working Paper No. 82). The World Bank. </w:t>
+        <w:t xml:space="preserve">American Journal of Agricultural Economics</w:t>
+      </w:r>
+      <w:r>
+        <w:rPr>
+          <w:sz w:val="18"/>
+          <w:szCs w:val="18"/>
+        </w:rPr>
+        <w:t xml:space="preserve">, </w:t>
+      </w:r>
+      <w:r>
+        <w:rPr>
+          <w:i/>
+          <w:iCs/>
+          <w:sz w:val="18"/>
+          <w:szCs w:val="18"/>
+        </w:rPr>
+        <w:t xml:space="preserve">77</w:t>
+      </w:r>
+      <w:r>
+        <w:rPr>
+          <w:sz w:val="18"/>
+          <w:szCs w:val="18"/>
+        </w:rPr>
+        <w:t xml:space="preserve">(5), 1153–1159. https://doi.org/10.2307/1243338</w:t>
       </w:r>
     </w:p>
     <w:p>
@@ -9061,7 +9061,7 @@
           <w:sz w:val="18"/>
           <w:szCs w:val="18"/>
         </w:rPr>
-        <w:t xml:space="preserve">Diamond, D. W., &amp; Dybvig, P. H. (1983). Bank runs, deposit insurance, and liquidity. </w:t>
+        <w:t xml:space="preserve">Cuevas, C. E., &amp; Fischer, K. P. (2006). </w:t>
       </w:r>
       <w:r>
         <w:rPr>
@@ -9070,30 +9070,14 @@
           <w:sz w:val="18"/>
           <w:szCs w:val="18"/>
         </w:rPr>
-        <w:t xml:space="preserve">Journal of Political Economy</w:t>
-      </w:r>
-      <w:r>
-        <w:rPr>
-          <w:sz w:val="18"/>
-          <w:szCs w:val="18"/>
-        </w:rPr>
-        <w:t xml:space="preserve">, </w:t>
-      </w:r>
-      <w:r>
-        <w:rPr>
-          <w:i/>
-          <w:iCs/>
-          <w:sz w:val="18"/>
-          <w:szCs w:val="18"/>
-        </w:rPr>
-        <w:t xml:space="preserve">91</w:t>
-      </w:r>
-      <w:r>
-        <w:rPr>
-          <w:sz w:val="18"/>
-          <w:szCs w:val="18"/>
-        </w:rPr>
-        <w:t xml:space="preserve">(3), 401–419. https://doi.org/10.1086/261155</w:t>
+        <w:t xml:space="preserve">Cooperative financial institutions: Issues in governance, regulation, and supervision</w:t>
+      </w:r>
+      <w:r>
+        <w:rPr>
+          <w:sz w:val="18"/>
+          <w:szCs w:val="18"/>
+        </w:rPr>
+        <w:t xml:space="preserve"> (World Bank Working Paper No. 82). The World Bank. </w:t>
       </w:r>
     </w:p>
     <w:p>
@@ -9107,7 +9091,7 @@
           <w:sz w:val="18"/>
           <w:szCs w:val="18"/>
         </w:rPr>
-        <w:t xml:space="preserve">Ferri, G., Kalmi, P., &amp; Kerola, E. (2014). Does bank ownership affect lending behavior? Evidence from the Euro area. </w:t>
+        <w:t xml:space="preserve">Diamond, D. W., &amp; Dybvig, P. H. (1983). Bank runs, deposit insurance, and liquidity. </w:t>
       </w:r>
       <w:r>
         <w:rPr>
@@ -9116,7 +9100,7 @@
           <w:sz w:val="18"/>
           <w:szCs w:val="18"/>
         </w:rPr>
-        <w:t xml:space="preserve">Journal of Banking &amp; Finance</w:t>
+        <w:t xml:space="preserve">Journal of Political Economy</w:t>
       </w:r>
       <w:r>
         <w:rPr>
@@ -9132,14 +9116,14 @@
           <w:sz w:val="18"/>
           <w:szCs w:val="18"/>
         </w:rPr>
-        <w:t xml:space="preserve">48</w:t>
-      </w:r>
-      <w:r>
-        <w:rPr>
-          <w:sz w:val="18"/>
-          <w:szCs w:val="18"/>
-        </w:rPr>
-        <w:t xml:space="preserve">, 194–209. https://doi.org/10.1016/j.jbankfin.2014.05.007</w:t>
+        <w:t xml:space="preserve">91</w:t>
+      </w:r>
+      <w:r>
+        <w:rPr>
+          <w:sz w:val="18"/>
+          <w:szCs w:val="18"/>
+        </w:rPr>
+        <w:t xml:space="preserve">(3), 401–419. https://doi.org/10.1086/261155</w:t>
       </w:r>
     </w:p>
     <w:p>
@@ -9153,7 +9137,7 @@
           <w:sz w:val="18"/>
           <w:szCs w:val="18"/>
         </w:rPr>
-        <w:t xml:space="preserve">Fonteyne, W. (2007). </w:t>
+        <w:t xml:space="preserve">Ferri, G., Kalmi, P., &amp; Kerola, E. (2014). Does bank ownership affect lending behavior? Evidence from the Euro area. </w:t>
       </w:r>
       <w:r>
         <w:rPr>
@@ -9162,14 +9146,30 @@
           <w:sz w:val="18"/>
           <w:szCs w:val="18"/>
         </w:rPr>
-        <w:t xml:space="preserve">Cooperative banks in Europe: Policy issues</w:t>
-      </w:r>
-      <w:r>
-        <w:rPr>
-          <w:sz w:val="18"/>
-          <w:szCs w:val="18"/>
-        </w:rPr>
-        <w:t xml:space="preserve"> (IMF Working Paper No. WP/07/159). International Monetary Fund. https://doi.org/10.5089/9781451867237.001</w:t>
+        <w:t xml:space="preserve">Journal of Banking &amp; Finance</w:t>
+      </w:r>
+      <w:r>
+        <w:rPr>
+          <w:sz w:val="18"/>
+          <w:szCs w:val="18"/>
+        </w:rPr>
+        <w:t xml:space="preserve">, </w:t>
+      </w:r>
+      <w:r>
+        <w:rPr>
+          <w:i/>
+          <w:iCs/>
+          <w:sz w:val="18"/>
+          <w:szCs w:val="18"/>
+        </w:rPr>
+        <w:t xml:space="preserve">48</w:t>
+      </w:r>
+      <w:r>
+        <w:rPr>
+          <w:sz w:val="18"/>
+          <w:szCs w:val="18"/>
+        </w:rPr>
+        <w:t xml:space="preserve">, 194–209. https://doi.org/10.1016/j.jbankfin.2014.05.007</w:t>
       </w:r>
     </w:p>
     <w:p>
@@ -9183,7 +9183,7 @@
           <w:sz w:val="18"/>
           <w:szCs w:val="18"/>
         </w:rPr>
-        <w:t xml:space="preserve">Groeneveld, H. (2020). Reconciling different truths about isomorphic pressure and distinctive behavior at European cooperative banks: Back to the future with Raiffeisen's principles. </w:t>
+        <w:t xml:space="preserve">Fonteyne, W. (2007). </w:t>
       </w:r>
       <w:r>
         <w:rPr>
@@ -9192,30 +9192,14 @@
           <w:sz w:val="18"/>
           <w:szCs w:val="18"/>
         </w:rPr>
-        <w:t xml:space="preserve">Annals of Public and Cooperative Economics</w:t>
-      </w:r>
-      <w:r>
-        <w:rPr>
-          <w:sz w:val="18"/>
-          <w:szCs w:val="18"/>
-        </w:rPr>
-        <w:t xml:space="preserve">, </w:t>
-      </w:r>
-      <w:r>
-        <w:rPr>
-          <w:i/>
-          <w:iCs/>
-          <w:sz w:val="18"/>
-          <w:szCs w:val="18"/>
-        </w:rPr>
-        <w:t xml:space="preserve">91</w:t>
-      </w:r>
-      <w:r>
-        <w:rPr>
-          <w:sz w:val="18"/>
-          <w:szCs w:val="18"/>
-        </w:rPr>
-        <w:t xml:space="preserve">(3), 359–386. https://doi.org/10.1111/apce.12280</w:t>
+        <w:t xml:space="preserve">Cooperative banks in Europe: Policy issues</w:t>
+      </w:r>
+      <w:r>
+        <w:rPr>
+          <w:sz w:val="18"/>
+          <w:szCs w:val="18"/>
+        </w:rPr>
+        <w:t xml:space="preserve"> (IMF Working Paper No. WP/07/159). International Monetary Fund. https://doi.org/10.5089/9781451867237.001</w:t>
       </w:r>
     </w:p>
     <w:p>
@@ -9229,7 +9213,7 @@
           <w:sz w:val="18"/>
           <w:szCs w:val="18"/>
         </w:rPr>
-        <w:t xml:space="preserve">Hesse, H., &amp; Čihák, M. (2007). </w:t>
+        <w:t xml:space="preserve">Groeneveld, H. (2020). Reconciling different truths about isomorphic pressure and distinctive behavior at European cooperative banks: Back to the future with Raiffeisen's principles. </w:t>
       </w:r>
       <w:r>
         <w:rPr>
@@ -9238,14 +9222,30 @@
           <w:sz w:val="18"/>
           <w:szCs w:val="18"/>
         </w:rPr>
-        <w:t xml:space="preserve">Cooperative banks and financial stability</w:t>
-      </w:r>
-      <w:r>
-        <w:rPr>
-          <w:sz w:val="18"/>
-          <w:szCs w:val="18"/>
-        </w:rPr>
-        <w:t xml:space="preserve"> (IMF Working Paper No. WP/07/2). International Monetary Fund. https://doi.org/10.5089/9781451865660.001</w:t>
+        <w:t xml:space="preserve">Annals of Public and Cooperative Economics</w:t>
+      </w:r>
+      <w:r>
+        <w:rPr>
+          <w:sz w:val="18"/>
+          <w:szCs w:val="18"/>
+        </w:rPr>
+        <w:t xml:space="preserve">, </w:t>
+      </w:r>
+      <w:r>
+        <w:rPr>
+          <w:i/>
+          <w:iCs/>
+          <w:sz w:val="18"/>
+          <w:szCs w:val="18"/>
+        </w:rPr>
+        <w:t xml:space="preserve">91</w:t>
+      </w:r>
+      <w:r>
+        <w:rPr>
+          <w:sz w:val="18"/>
+          <w:szCs w:val="18"/>
+        </w:rPr>
+        <w:t xml:space="preserve">(3), 359–386. https://doi.org/10.1111/apce.12280</w:t>
       </w:r>
     </w:p>
     <w:p>
@@ -9259,7 +9259,7 @@
           <w:sz w:val="18"/>
           <w:szCs w:val="18"/>
         </w:rPr>
-        <w:t xml:space="preserve">Iacus, S. M., King, G., &amp; Porro, G. (2012). Causal inference without balance checking: Coarsened exact matching. </w:t>
+        <w:t xml:space="preserve">Hesse, H., &amp; Čihák, M. (2007). </w:t>
       </w:r>
       <w:r>
         <w:rPr>
@@ -9268,30 +9268,14 @@
           <w:sz w:val="18"/>
           <w:szCs w:val="18"/>
         </w:rPr>
-        <w:t xml:space="preserve">Political Analysis</w:t>
-      </w:r>
-      <w:r>
-        <w:rPr>
-          <w:sz w:val="18"/>
-          <w:szCs w:val="18"/>
-        </w:rPr>
-        <w:t xml:space="preserve">, </w:t>
-      </w:r>
-      <w:r>
-        <w:rPr>
-          <w:i/>
-          <w:iCs/>
-          <w:sz w:val="18"/>
-          <w:szCs w:val="18"/>
-        </w:rPr>
-        <w:t xml:space="preserve">20</w:t>
-      </w:r>
-      <w:r>
-        <w:rPr>
-          <w:sz w:val="18"/>
-          <w:szCs w:val="18"/>
-        </w:rPr>
-        <w:t xml:space="preserve">(1), 1–24. https://doi.org/10.1093/pan/mpr013</w:t>
+        <w:t xml:space="preserve">Cooperative banks and financial stability</w:t>
+      </w:r>
+      <w:r>
+        <w:rPr>
+          <w:sz w:val="18"/>
+          <w:szCs w:val="18"/>
+        </w:rPr>
+        <w:t xml:space="preserve"> (IMF Working Paper No. WP/07/2). International Monetary Fund. https://doi.org/10.5089/9781451865660.001</w:t>
       </w:r>
     </w:p>
     <w:p>
@@ -9305,7 +9289,7 @@
           <w:sz w:val="18"/>
           <w:szCs w:val="18"/>
         </w:rPr>
-        <w:t xml:space="preserve">Iannotta, G., Nocera, G., &amp; Sironi, A. (2007). Ownership structure, risk and performance in the European banking industry. </w:t>
+        <w:t xml:space="preserve">Iacus, S. M., King, G., &amp; Porro, G. (2012). Causal inference without balance checking: Coarsened exact matching. </w:t>
       </w:r>
       <w:r>
         <w:rPr>
@@ -9314,7 +9298,7 @@
           <w:sz w:val="18"/>
           <w:szCs w:val="18"/>
         </w:rPr>
-        <w:t xml:space="preserve">Journal of Banking &amp; Finance</w:t>
+        <w:t xml:space="preserve">Political Analysis</w:t>
       </w:r>
       <w:r>
         <w:rPr>
@@ -9330,14 +9314,14 @@
           <w:sz w:val="18"/>
           <w:szCs w:val="18"/>
         </w:rPr>
-        <w:t xml:space="preserve">31</w:t>
-      </w:r>
-      <w:r>
-        <w:rPr>
-          <w:sz w:val="18"/>
-          <w:szCs w:val="18"/>
-        </w:rPr>
-        <w:t xml:space="preserve">(7), 2127–2149. https://doi.org/10.1016/j.jbankfin.2006.07.013</w:t>
+        <w:t xml:space="preserve">20</w:t>
+      </w:r>
+      <w:r>
+        <w:rPr>
+          <w:sz w:val="18"/>
+          <w:szCs w:val="18"/>
+        </w:rPr>
+        <w:t xml:space="preserve">(1), 1–24. https://doi.org/10.1093/pan/mpr013</w:t>
       </w:r>
     </w:p>
     <w:p>
@@ -9351,7 +9335,7 @@
           <w:sz w:val="18"/>
           <w:szCs w:val="18"/>
         </w:rPr>
-        <w:t xml:space="preserve">MacKinnon, J. G., &amp; Webb, M. D. (2017). Wild bootstrap inference for wildly different cluster sizes. </w:t>
+        <w:t xml:space="preserve">Iannotta, G., Nocera, G., &amp; Sironi, A. (2007). Ownership structure, risk and performance in the European banking industry. </w:t>
       </w:r>
       <w:r>
         <w:rPr>
@@ -9360,7 +9344,7 @@
           <w:sz w:val="18"/>
           <w:szCs w:val="18"/>
         </w:rPr>
-        <w:t xml:space="preserve">Journal of Applied Econometrics</w:t>
+        <w:t xml:space="preserve">Journal of Banking &amp; Finance</w:t>
       </w:r>
       <w:r>
         <w:rPr>
@@ -9376,14 +9360,14 @@
           <w:sz w:val="18"/>
           <w:szCs w:val="18"/>
         </w:rPr>
-        <w:t xml:space="preserve">32</w:t>
-      </w:r>
-      <w:r>
-        <w:rPr>
-          <w:sz w:val="18"/>
-          <w:szCs w:val="18"/>
-        </w:rPr>
-        <w:t xml:space="preserve">(2), 233–254. https://doi.org/10.1002/jae.2508</w:t>
+        <w:t xml:space="preserve">31</w:t>
+      </w:r>
+      <w:r>
+        <w:rPr>
+          <w:sz w:val="18"/>
+          <w:szCs w:val="18"/>
+        </w:rPr>
+        <w:t xml:space="preserve">(7), 2127–2149. https://doi.org/10.1016/j.jbankfin.2006.07.013</w:t>
       </w:r>
     </w:p>
     <w:p>
@@ -9397,7 +9381,7 @@
           <w:sz w:val="18"/>
           <w:szCs w:val="18"/>
         </w:rPr>
-        <w:t xml:space="preserve">McKillop, D., French, D., Quinn, B., Sobiech, A. L., &amp; Wilson, J. O. S. (2020). Cooperative financial institutions: A review of the literature. </w:t>
+        <w:t xml:space="preserve">MacKinnon, J. G., &amp; Webb, M. D. (2017). Wild bootstrap inference for wildly different cluster sizes. </w:t>
       </w:r>
       <w:r>
         <w:rPr>
@@ -9406,7 +9390,7 @@
           <w:sz w:val="18"/>
           <w:szCs w:val="18"/>
         </w:rPr>
-        <w:t xml:space="preserve">International Review of Financial Analysis</w:t>
+        <w:t xml:space="preserve">Journal of Applied Econometrics</w:t>
       </w:r>
       <w:r>
         <w:rPr>
@@ -9422,6 +9406,52 @@
           <w:sz w:val="18"/>
           <w:szCs w:val="18"/>
         </w:rPr>
+        <w:t xml:space="preserve">32</w:t>
+      </w:r>
+      <w:r>
+        <w:rPr>
+          <w:sz w:val="18"/>
+          <w:szCs w:val="18"/>
+        </w:rPr>
+        <w:t xml:space="preserve">(2), 233–254. https://doi.org/10.1002/jae.2508</w:t>
+      </w:r>
+    </w:p>
+    <w:p>
+      <w:pPr>
+        <w:pStyle w:val="ReferenciasBibliogrficas"/>
+        <w:spacing w:after="60" w:line="240" w:lineRule="auto"/>
+        <w:jc w:val="left"/>
+      </w:pPr>
+      <w:r>
+        <w:rPr>
+          <w:sz w:val="18"/>
+          <w:szCs w:val="18"/>
+        </w:rPr>
+        <w:t xml:space="preserve">McKillop, D., French, D., Quinn, B., Sobiech, A. L., &amp; Wilson, J. O. S. (2020). Cooperative financial institutions: A review of the literature. </w:t>
+      </w:r>
+      <w:r>
+        <w:rPr>
+          <w:i/>
+          <w:iCs/>
+          <w:sz w:val="18"/>
+          <w:szCs w:val="18"/>
+        </w:rPr>
+        <w:t xml:space="preserve">International Review of Financial Analysis</w:t>
+      </w:r>
+      <w:r>
+        <w:rPr>
+          <w:sz w:val="18"/>
+          <w:szCs w:val="18"/>
+        </w:rPr>
+        <w:t xml:space="preserve">, </w:t>
+      </w:r>
+      <w:r>
+        <w:rPr>
+          <w:i/>
+          <w:iCs/>
+          <w:sz w:val="18"/>
+          <w:szCs w:val="18"/>
+        </w:rPr>
         <w:t xml:space="preserve">71</w:t>
       </w:r>
       <w:r>
@@ -9430,6 +9460,52 @@
           <w:szCs w:val="18"/>
         </w:rPr>
         <w:t xml:space="preserve">, 101520. https://doi.org/10.1016/j.irfa.2020.101520</w:t>
+      </w:r>
+    </w:p>
+    <w:p>
+      <w:pPr>
+        <w:pStyle w:val="ReferenciasBibliogrficas"/>
+        <w:spacing w:after="60" w:line="240" w:lineRule="auto"/>
+        <w:jc w:val="left"/>
+      </w:pPr>
+      <w:r>
+        <w:rPr>
+          <w:sz w:val="18"/>
+          <w:szCs w:val="18"/>
+        </w:rPr>
+        <w:t xml:space="preserve">Silva, A., Santos, J. F. dos, &amp; Ranciaro Neto, A. (2023). Performance of Brazilian credit unions: An analysis from PEARLS indicators. </w:t>
+      </w:r>
+      <w:r>
+        <w:rPr>
+          <w:i/>
+          <w:iCs/>
+          <w:sz w:val="18"/>
+          <w:szCs w:val="18"/>
+        </w:rPr>
+        <w:t xml:space="preserve">RAM. Revista de Administração Mackenzie</w:t>
+      </w:r>
+      <w:r>
+        <w:rPr>
+          <w:sz w:val="18"/>
+          <w:szCs w:val="18"/>
+        </w:rPr>
+        <w:t xml:space="preserve">, </w:t>
+      </w:r>
+      <w:r>
+        <w:rPr>
+          <w:i/>
+          <w:iCs/>
+          <w:sz w:val="18"/>
+          <w:szCs w:val="18"/>
+        </w:rPr>
+        <w:t xml:space="preserve">24</w:t>
+      </w:r>
+      <w:r>
+        <w:rPr>
+          <w:sz w:val="18"/>
+          <w:szCs w:val="18"/>
+        </w:rPr>
+        <w:t xml:space="preserve">(1), eRAMR230057. https://doi.org/10.1590/1678-6971/eRAMR230057.en</w:t>
       </w:r>
     </w:p>
     <w:sectPr>
@@ -9554,35 +9630,6 @@
           <w:szCs w:val="16"/>
         </w:rPr>
         <w:t xml:space="preserve">The online appendix (supplement.pdf) is at https://github.com/r2nery/coops-basel-regulation.</w:t>
-      </w:r>
-    </w:p>
-  </w:footnote>
-  <w:footnote w:id="2">
-    <w:p>
-      <w:pPr>
-        <w:pStyle w:val="FootnoteText"/>
-        <w:spacing w:after="40"/>
-        <w:jc w:val="both"/>
-      </w:pPr>
-      <w:r>
-        <w:rPr>
-          <w:rStyle w:val="FootnoteReference"/>
-        </w:rPr>
-        <w:footnoteRef/>
-      </w:r>
-      <w:r>
-        <w:rPr>
-          <w:sz w:val="16"/>
-          <w:szCs w:val="16"/>
-        </w:rPr>
-        <w:t xml:space="preserve"> </w:t>
-      </w:r>
-      <w:r>
-        <w:rPr>
-          <w:sz w:val="16"/>
-          <w:szCs w:val="16"/>
-        </w:rPr>
-        <w:t xml:space="preserve">Provisioning is observed for nearly all cooperative-quarters and for about five in six bank-quarters; the gaps concentrate among the low-credit institutions the ladder removes and in 2023, when bank coverage falls to about two thirds.</w:t>
       </w:r>
     </w:p>
   </w:footnote>

</xml_diff>

<commit_message>
Final jury round: three-finding paragraph opens Results, award line directly below the title, quantile wording softened, cuts, system-split counts reconciled, Beck et al. (2009) restored
Co-Authored-By: Claude Fable 5.1 <noreply@anthropic.com>
</commit_message>
<xml_diff>
--- a/paper/ICACCR2026_paper_Nery_Victorino_Rangel.docx
+++ b/paper/ICACCR2026_paper_Nery_Victorino_Rangel.docx
@@ -19,6 +19,22 @@
     </w:p>
     <w:p>
       <w:pPr>
+        <w:spacing w:after="120"/>
+        <w:jc w:val="center"/>
+      </w:pPr>
+      <w:r>
+        <w:rPr>
+          <w:i/>
+          <w:iCs/>
+        </w:rPr>
+        <w:t xml:space="preserve">Award category: </w:t>
+      </w:r>
+      <w:r>
+        <w:t xml:space="preserve">Best Young and Emerging Scholar Paper</w:t>
+      </w:r>
+    </w:p>
+    <w:p>
+      <w:pPr>
         <w:pStyle w:val="Autor1"/>
         <w:jc w:val="center"/>
       </w:pPr>
@@ -113,22 +129,6 @@
           <w:rStyle w:val="Autor2"/>
         </w:rPr>
         <w:t xml:space="preserve">Organization of Brazilian Cooperatives (OCB System), Brasília, Brazil, rodrigo.rangel@sescoop.coop.br</w:t>
-      </w:r>
-    </w:p>
-    <w:p>
-      <w:pPr>
-        <w:spacing w:after="240"/>
-        <w:jc w:val="center"/>
-      </w:pPr>
-      <w:r>
-        <w:rPr>
-          <w:i/>
-          <w:iCs/>
-        </w:rPr>
-        <w:t xml:space="preserve">Award category:</w:t>
-      </w:r>
-      <w:r>
-        <w:t xml:space="preserve"> Best Young and Emerging Scholar Paper</w:t>
       </w:r>
     </w:p>
     <w:p>
@@ -155,7 +155,7 @@
         <w:jc w:val="both"/>
       </w:pPr>
       <w:r>
-        <w:t xml:space="preserve">In Brazil, a credit cooperative that grows past a size threshold computes capital, leverage and risk under the same prudential methodology as a commercial bank, while its cooperative acts remain untaxed. We ask whether the cooperative form still leaves a distinct imprint on the balance sheet. The data are a quarterly panel of every full-methodology institution from 2017 to 2024: 130 singular credit cooperatives and 144 banks. Eleven balance-sheet and performance measures are related to a cooperative dummy, controlling for size and time, on a matched sample and across five comparison groups. The cooperative form leaves a clear imprint, in three results. First, at comparable size cooperatives operate at lower cost and show steadier returns, and nationally they lend a larger share of their assets than banks, a difference that does not survive matching within region. Before tax the typical cooperative earns more than a comparable bank, though the mean gap is not established; after tax it retains about two percentage points more, of which the tax exemption explains about two fifths. Second, capital differs modestly in level and markedly in dispersion. The mean gap comes from small banks with capital ratios above fifty percent and roughly halves against deposit-funded banks; among thinly capitalised institutions, cooperatives hold more capital than banks and provision no less. Third, two differences often reported, lower provisioning and narrower margins, disappear once the comparison group is restricted to banks. Whether these differences bear on the territorial role of cooperative lenders is the claim the data cannot yet settle. What they do show is that a benchmark calibrated on the average institution may describe the locally lending cooperative poorly.</w:t>
+        <w:t xml:space="preserve">In Brazil, a credit cooperative that grows past a size threshold computes capital, leverage and risk under the same prudential methodology as a commercial bank, while its cooperative acts remain untaxed. We ask whether the cooperative form still leaves a distinct imprint on the balance sheet. The data are a quarterly panel of every full-methodology institution from 2017 to 2024: 130 singular credit cooperatives and 144 banks. Eleven balance-sheet and performance measures are related to a cooperative dummy, controlling for size and time, on a matched sample and across five comparison groups. The cooperative form leaves a clear imprint, in three results. First, at comparable size cooperatives operate at lower cost and show steadier returns, and nationally they lend a larger share of their assets than banks, a difference that does not survive matching within region. Before tax the typical cooperative earns more than a comparable bank, though the mean gap is not established; after tax it retains about two percentage points more, of which the tax exemption explains about two fifths. Second, capital differs modestly in level and markedly in dispersion. The mean gap comes from small banks with capital ratios above fifty percent and roughly halves against deposit-funded banks; in the lower part of the capital distribution, cooperatives hold more capital than banks at the same quantile and provision no less. Third, two differences often reported, lower provisioning and narrower margins, disappear once the comparison group is restricted to banks. Whether these differences bear on the territorial role of cooperative lenders is the claim the data cannot yet settle. What they do show is that a benchmark calibrated on the average institution may describe the locally lending cooperative poorly.</w:t>
       </w:r>
     </w:p>
     <w:p>
@@ -395,7 +395,7 @@
         <w:jc w:val="both"/>
       </w:pPr>
       <w:r>
-        <w:t xml:space="preserve">Besides the proportionality work above, two strands of the literature reviewed by McKillop et al. (2020) bear on this paper. The first concerns capital, profitability and stability. Hesse and Čihák (2007) find in a cross-country panel that cooperative banks are more stable than commercial banks. They attribute the result to the lower volatility of cooperative returns, which more than offsets lower profitability and capitalisation. Ayadi et al. (2010) document the performance and role of cooperative banks across Europe, Iannotta et al. (2007) find that ownership structure predicts risk and performance across European banks, and Becchetti et al. (2016) and Ferri et al. (2014) show that it shapes lending. Groeneveld (2020) weighs the adaptations of European cooperative banks against the traits they retain and finds their distinctive character intact. Cuevas and Fischer (2006) set out the tension between member orientation and prudential templates written for investor-owned banks. The second is Brazilian. Bressan et al. (2011) apply the PEARLS system to Brazilian credit cooperatives and model their insolvency risk, and Carvalho et al. (2015) analyse the exit and failure of Brazilian credit unions. More recently, Silva et al. (2023) relate the performance of Brazilian credit unions in the highest segmentation level to PEARLS indicators and find the loan portfolio the main driver of profitability, and Cavinato and Capitani (2023) show that the social efficiency of rural credit cooperatives varies with regional market conditions. None compares cooperatives with banks under a common prudential methodology, the setting used here.</w:t>
+        <w:t xml:space="preserve">Besides the proportionality work above, two strands of the literature reviewed by McKillop et al. (2020) bear on this paper. The first concerns capital, profitability and stability. Hesse and Čihák (2007) find in a cross-country panel that cooperative banks are more stable than commercial banks. They attribute the result to the lower volatility of cooperative returns, which more than offsets lower profitability and capitalisation. Beck et al. (2009) reach a similar conclusion for German banks under one supervisory regime, where cooperative banks are farther from insolvency than both privately owned and savings banks. Ayadi et al. (2010) document the performance and role of cooperative banks across Europe, Iannotta et al. (2007) find that ownership structure predicts risk and performance across European banks, and Becchetti et al. (2016) and Ferri et al. (2014) show that it shapes lending. Groeneveld (2020) weighs the adaptations of European cooperative banks against the traits they retain and finds their distinctive character intact. Cuevas and Fischer (2006) set out the tension between member orientation and prudential templates written for investor-owned banks. The second is Brazilian. Bressan et al. (2011) apply the PEARLS system to Brazilian credit cooperatives and model their insolvency risk, and Carvalho et al. (2015) analyse the exit and failure of Brazilian credit unions. More recently, Silva et al. (2023) relate the performance of Brazilian credit unions in the highest segmentation level to PEARLS indicators and find the loan portfolio the main driver of profitability, and Cavinato and Capitani (2023) show that the social efficiency of rural credit cooperatives varies with regional market conditions. None compares cooperatives with banks under a common prudential methodology, the setting used here.</w:t>
       </w:r>
     </w:p>
     <w:p>
@@ -1668,7 +1668,7 @@
         <w:jc w:val="both"/>
       </w:pPr>
       <w:r>
-        <w:t xml:space="preserve">Standard errors are clustered by institution, since cooperative status is assigned at the institution level and observations are serially correlated (Cameron &amp; Miller, 2015). Clustered inference is unreliable when few clusters are treated (MacKinnon &amp; Webb, 2017), as in the system-by-system estimates, so every coefficient also carries a restricted wild cluster bootstrap, which re-draws the sign of each institution's residuals under the null and compares the observed statistic with that distribution (Cameron et al., 2008). In simulations with six treated clusters (online appendix) the clustered test over-rejects and the bootstrap is conservative at one percent; the problem concerns the system splits, while the main comparison rests on about 130 treated clusters, where the two agree. Quantile coefficients carry intervals from an institution bootstrap. Several outcomes are right-skewed, so we report the conditional median alongside the conditional mean, under one rule for every outcome: the tiers below are assigned on the conditional means alone, and where mean and median disagree the quantile profile decides which describes the typical institution, so that when one tail drives the mean, as for capital, cost-to-income and the pre-tax return, we read the magnitude at the median while the tier still records the mean result.</w:t>
+        <w:t xml:space="preserve">Standard errors are clustered by institution, since cooperative status is assigned at the institution level and observations are serially correlated (Cameron &amp; Miller, 2015). Clustered inference is unreliable when few clusters are treated (MacKinnon &amp; Webb, 2017), as in the system-by-system estimates, so every coefficient also carries a restricted wild cluster bootstrap, which re-draws the sign of each institution's residuals under the null and compares the observed statistic with that distribution (Cameron et al., 2008). In simulations with six treated clusters, the size of the smallest system split (online appendix), the clustered test over-rejects and the bootstrap is conservative at one percent; the problem concerns the system splits, while the main comparison rests on about 130 treated clusters, where the two agree. Quantile coefficients carry intervals from an institution bootstrap. Several outcomes are right-skewed, so we report the conditional median alongside the conditional mean, under one rule for every outcome: tiers are assigned on the conditional means alone, and when the quantile profile shows one tail driving the mean, as for capital, cost-to-income and the pre-tax return, the magnitude is read at the median while the tier records the mean result.</w:t>
       </w:r>
     </w:p>
     <w:p>
@@ -1737,6 +1737,14 @@
           <w:rStyle w:val="FootnoteReference"/>
         </w:rPr>
         <w:footnoteReference w:id="1"/>
+      </w:r>
+    </w:p>
+    <w:p>
+      <w:pPr>
+        <w:jc w:val="both"/>
+      </w:pPr>
+      <w:r>
+        <w:t xml:space="preserve">Three statements summarise what follows. First, under the same prudential rules the largest credit cooperatives run at lower cost and post steadier returns than banks of the same size, lend a larger share of their assets than banks nationally, and keep about two percentage points more of their return after tax, of which the tax exemption explains about two fifths; what they keep is the only capital they can build. Second, their capital ratios sit in a narrow band: below the bank average, which a few small and heavily capitalised banks pull up, and above banks at the same quantile at the thin end of the distribution, where supervisors look. Third, two often-cited differences, lower provisioning and thinner margins, vanish once cooperatives are compared with banks alone.</w:t>
       </w:r>
     </w:p>
     <w:p>
@@ -3993,7 +4001,7 @@
         <w:jc w:val="both"/>
       </w:pPr>
       <w:r>
-        <w:t xml:space="preserve">Profitability splits into the two channels of Section 1. Before tax, the cooperative differential is positive in every specification but significant only in the first two, so by the rule it is null. The null comes from the mean. The conditional median differential before tax is 1.4 percentage points, with a bootstrap interval that excludes zero, and the quantile coefficient is positive through the median and significantly negative only in the top decile (Table 3), so a high-earning bank upper tail pulls the mean towards zero, as it does for capital below. The typical cooperative thus earns more than a comparable bank before tax, on an intermediation margin indistinguishable from the banks', while the mean gap is not established across specifications. After tax the differential is about two percentage points under controls, significant everywhere and stable. The distance between the two rows is the tax exemption: among quarters with a positive pre-tax result, the median effective rate of income tax and social contribution is about a third for banks and close to zero for cooperatives, and the pre-tax differential under controls is about three fifths of the after-tax one, so tax accounts for about two fifths of the after-tax gap. The after-tax row is what a cooperative retains and accumulates as capital; the pre-tax row is the operating comparison.</w:t>
+        <w:t xml:space="preserve">Profitability splits into the two channels of Section 1. Before tax, the cooperative differential is positive in every specification but significant only in the first two, so by the rule it is null. The null comes from the mean: the conditional median differential before tax is 1.4 percentage points with a bootstrap interval that excludes zero, and the quantile coefficient turns negative only in the top decile (Table 3), where a high-earning bank tail pulls the mean towards zero. The typical cooperative thus earns more than a comparable bank before tax, on an indistinguishable intermediation margin, while the mean gap is not established. After tax the differential is about two percentage points under controls, significant everywhere and stable. The distance between the two rows is the tax exemption: among quarters with a positive pre-tax result, the median effective rate of income tax and social contribution is about a third for banks and close to zero for cooperatives, and the pre-tax differential under controls is about three fifths of the after-tax one, so tax accounts for about two fifths of the after-tax gap. The after-tax row is what a cooperative retains and accumulates as capital; the pre-tax row is the operating comparison.</w:t>
       </w:r>
     </w:p>
     <w:p>
@@ -6243,7 +6251,7 @@
         <w:jc w:val="both"/>
       </w:pPr>
       <w:r>
-        <w:t xml:space="preserve">Cooperative returns are also less volatile. At comparable size cooperatives show a lower standard deviation of return on assets and a higher z-score, in all four designs and on every national bank rung. The two measures share the standard deviation of return on assets, so we treat them as one result. Taxes compress the after-tax volatility of bank returns, so this comparison probably understates the gap: before tax, the z-score differential is larger and the median gap in return volatility nearly doubles, while the mean volatility differential is smaller, and both keep their sign and significance (Table A11 of the online appendix).</w:t>
+        <w:t xml:space="preserve">Cooperative returns are also less volatile. At comparable size cooperatives show a lower standard deviation of return on assets and a higher z-score, in all four designs and on every national bank rung. The two measures share the standard deviation of return on assets, so we treat them as one result. Taxes compress the after-tax volatility of bank returns, and before tax both measures keep their sign and significance, with the median volatility gap nearly doubling (Table A11 of the online appendix).</w:t>
       </w:r>
     </w:p>
     <w:p>
@@ -7841,7 +7849,7 @@
         <w:jc w:val="both"/>
       </w:pPr>
       <w:r>
-        <w:t xml:space="preserve">Against all non-cooperatives, cooperatives appear to provision less, significant at one percent in all four specifications, while against banks the coefficient is close to zero. The broad-group gap comes from the non-banking lenders, whose provisioning ratios are nearly three times those of banks and cooperatives. At the conditional median the sign reverses, with cooperatives provisioning more. Split into terciles of the Basel ratio, where supervisory concern attaches, no tercile shows cooperatives provisioning less: the differential is positive and significant only in the middle tercile on the unconditional ratio, and no tercile differs on the residualised ratio. The result most likely describes how the two groups classify their books.</w:t>
+        <w:t xml:space="preserve">Against all non-cooperatives, cooperatives appear to provision less, significant at one percent in all four specifications, while against banks the coefficient is close to zero. The broad-group gap comes from the non-banking lenders, whose provisioning ratios are nearly three times those of banks and cooperatives. At the conditional median the sign reverses, with cooperatives provisioning more. Split into terciles of the Basel ratio, no tercile shows cooperatives provisioning less.</w:t>
       </w:r>
     </w:p>
     <w:p>
@@ -7849,7 +7857,7 @@
         <w:jc w:val="both"/>
       </w:pPr>
       <w:r>
-        <w:t xml:space="preserve">The intermediation margin behaves in the same way: large and highly significant against the broad group, small and insignificant against banks, and positive and significant against structural banks, so its sign depends on the comparison group and we keep it as a null. The funding ratio is significant in one of four specifications and reverses sign at the conditional median, so we leave it out of the findings.</w:t>
+        <w:t xml:space="preserve">The intermediation margin behaves in the same way: large and highly significant against the broad group, small and insignificant against banks, and positive and significant against structural banks, so its sign depends on the comparison group and we keep it as a null. The funding ratio is significant in one specification only and is left out of the findings.</w:t>
       </w:r>
     </w:p>
     <w:p>
@@ -7873,7 +7881,7 @@
         <w:jc w:val="both"/>
       </w:pPr>
       <w:r>
-        <w:t xml:space="preserve">Matched on size alone, cooperatives allocate a substantially larger share of assets to credit than comparable banks, significant at one percent in every specification. Matched also on macro-region, the differential is small and indistinguishable from zero under any coarsening scheme. Which estimate is the parameter depends on an untestable assumption: if cooperatives concentrate where they do for reasons internal to member-based finance, region is a mediator and the size-only estimate is the parameter; if regional market structure is unrelated to form, region is a confounder and credit intensity is a null. We report both, sector-wide and within-market, and label every claim by the comparison it rests on.</w:t>
+        <w:t xml:space="preserve">Matched on size alone, cooperatives allocate a substantially larger share of assets to credit than comparable banks, significant at one percent in every specification. Matched also on macro-region, the differential is small and indistinguishable from zero under any coarsening scheme. Which estimate is the parameter depends on an untestable assumption: if cooperatives concentrate where they do for reasons internal to member-based finance, region is a mediator and the size-only estimate is the parameter; if regional market structure is unrelated to form, region is a confounder and credit intensity is a null. We report both and label every claim by the comparison it rests on.</w:t>
       </w:r>
     </w:p>
     <w:p>
@@ -7905,7 +7913,7 @@
         <w:jc w:val="both"/>
       </w:pPr>
       <w:r>
-        <w:t xml:space="preserve">The online appendix splits the cooperative side by system. Sicredi and Sicoob account for all but seven of the cooperatives, so the split describes those two networks; a test of network affiliation as such is beyond it. Cooperatives in both networks hold less regulatory capital than comparable banks, significant under the bootstrap in each. The six independents rest on five treated clusters, and their capital estimate is positive and indistinguishable from noise.</w:t>
+        <w:t xml:space="preserve">The online appendix splits the cooperative side by system. Sicredi and Sicoob account for all but seven of the cooperatives, one of which belongs to Cresol, so the split describes those two networks; a test of network affiliation as such is beyond it. Cooperatives in both networks hold less regulatory capital than comparable banks, significant under the bootstrap in each. The six independents contribute five treated clusters, since one lacks the outcome, and their capital estimate is positive and indistinguishable from noise.</w:t>
       </w:r>
     </w:p>
     <w:p>
@@ -8003,15 +8011,7 @@
         <w:jc w:val="both"/>
       </w:pPr>
       <w:r>
-        <w:t xml:space="preserve">Three statements summarise the findings. First, under the same prudential rules the largest credit cooperatives run at lower cost and post steadier returns than banks of the same size, lend a larger share of their assets than banks nationally, and keep about two percentage points more of their return after tax, of which the tax exemption explains about two fifths; what they keep is the only capital they can build. Second, their capital ratios sit in a narrow band: below the bank average, which a few small and heavily capitalised banks pull up, and above comparable banks at the thin end of the distribution, where supervisors look. Third, two often-cited differences, lower provisioning and thinner margins, vanish once cooperatives are compared with banks alone. For supervisors, this argues for a benchmark calibrated on lending institutions and for reading the whole distribution as well as the mean.</w:t>
-      </w:r>
-    </w:p>
-    <w:p>
-      <w:pPr>
-        <w:jc w:val="both"/>
-      </w:pPr>
-      <w:r>
-        <w:t xml:space="preserve">The surviving results describe a focused retail lender, consistent with a member-service orientation in which capital accumulation is a means to member credit (Fonteyne, 2007).</w:t>
+        <w:t xml:space="preserve">For supervisors, the findings suggest a benchmark calibrated on lending institutions and a reading of the whole distribution as well as the mean. The surviving results describe a focused retail lender, consistent with a member-service orientation in which capital accumulation is a means to member credit (Fonteyne, 2007).</w:t>
       </w:r>
     </w:p>
     <w:p>
@@ -8322,6 +8322,36 @@
           <w:szCs w:val="18"/>
         </w:rPr>
         <w:t xml:space="preserve">, 224–246. https://doi.org/10.1016/j.jimonfin.2016.06.016</w:t>
+      </w:r>
+    </w:p>
+    <w:p>
+      <w:pPr>
+        <w:pStyle w:val="ReferenciasBibliogrficas"/>
+        <w:spacing w:after="60" w:line="240" w:lineRule="auto"/>
+        <w:jc w:val="left"/>
+      </w:pPr>
+      <w:r>
+        <w:rPr>
+          <w:sz w:val="18"/>
+          <w:szCs w:val="18"/>
+        </w:rPr>
+        <w:t xml:space="preserve">Beck, T., Hesse, H., Kick, T., &amp; von Westernhagen, N. (2009). </w:t>
+      </w:r>
+      <w:r>
+        <w:rPr>
+          <w:i/>
+          <w:iCs/>
+          <w:sz w:val="18"/>
+          <w:szCs w:val="18"/>
+        </w:rPr>
+        <w:t xml:space="preserve">Bank ownership and stability: Evidence from Germany</w:t>
+      </w:r>
+      <w:r>
+        <w:rPr>
+          <w:sz w:val="18"/>
+          <w:szCs w:val="18"/>
+        </w:rPr>
+        <w:t xml:space="preserve"> [Working paper]. Deutsche Bundesbank.</w:t>
       </w:r>
     </w:p>
     <w:p>

</xml_diff>

<commit_message>
Three new citations worded to what the sources say; Bruegel DOI added
Co-Authored-By: Claude Fable 5.1 <noreply@anthropic.com>
</commit_message>
<xml_diff>
--- a/paper/ICACCR2026_paper_Nery_Victorino_Rangel.docx
+++ b/paper/ICACCR2026_paper_Nery_Victorino_Rangel.docx
@@ -363,7 +363,7 @@
         <w:jc w:val="both"/>
       </w:pPr>
       <w:r>
-        <w:t xml:space="preserve">Brazil's segmentation sorts institutions by size and international activity (Conselho Monetário Nacional, 2017a), and the international surveys of proportionality record size, complexity and business model as the criteria in use, none based on organisational form (Basel Committee on Banking Supervision, 2019). Where supervisors adapt the framework to cooperatives, the adaptation concerns member shares and network arrangements (Coelho et al., 2019). The current European debate on simpler rules for smaller banks keeps to the same criteria: the proposal that Berg and Geeroms (2026) weigh would let banks below a size threshold, the German savings and cooperative banks among them, opt into simpler standards, with safeguards on risk-taking. Organisational form and network membership are then candidate calibration margins, and this paper supplies the profile that decides whether they point to lighter treatment or closer scrutiny.</w:t>
+        <w:t xml:space="preserve">Brazil's segmentation sorts institutions by size and international activity (Conselho Monetário Nacional, 2017a), and the international surveys of proportionality record size, complexity and business model as the criteria in use, none based on organisational form (Basel Committee on Banking Supervision, 2019). Where supervisors adapt the framework to cooperatives, the adaptation concerns member shares and network arrangements (Coelho et al., 2019). The current European debate on simpler rules for smaller banks keeps to the same criteria: a German supervisory proposal reviewed by Berg and Geeroms (2026) would let small, non-complex banks, the savings and cooperative banks among them, opt out of the Basel-based requirements, which the authors support only with conservative calibration and safeguards against risk-taking. Organisational form and network membership are then candidate calibration margins, and this paper supplies the profile that decides whether they point to lighter treatment or closer scrutiny.</w:t>
       </w:r>
     </w:p>
     <w:p>
@@ -395,7 +395,7 @@
         <w:jc w:val="both"/>
       </w:pPr>
       <w:r>
-        <w:t xml:space="preserve">Besides the proportionality work above, two strands of the literature reviewed by McKillop et al. (2020) bear on this paper. The first concerns capital, profitability and stability. Hesse and Čihák (2007) find in a cross-country panel that cooperative banks are more stable than commercial banks. They attribute the result to the lower volatility of cooperative returns, which more than offsets lower profitability and capitalisation. Beck et al. (2009) reach a similar conclusion for German banks under one supervisory regime, where cooperative banks are farther from insolvency than both privately owned and savings banks. Ayadi et al. (2010) document the performance and role of cooperative banks across Europe, Iannotta et al. (2007) find that ownership structure predicts risk and performance across European banks, and Becchetti et al. (2016) and Ferri et al. (2014) show that it shapes lending. Groeneveld (2020) weighs the adaptations of European cooperative banks against the traits they retain and finds their distinctive character intact. Cuevas and Fischer (2006) set out the tension between member orientation and prudential templates written for investor-owned banks. The second is Brazilian. Bressan et al. (2011) apply the PEARLS system to Brazilian credit cooperatives and model their insolvency risk, and Carvalho et al. (2015) analyse the exit and failure of Brazilian credit unions. More recently, Silva et al. (2023) relate the performance of Brazilian credit unions in the highest segmentation level to PEARLS indicators and find the loan portfolio the main driver of profitability, and Cavinato and Capitani (2023) show that the social efficiency of rural credit cooperatives varies with regional market conditions. None compares cooperatives with banks under a common prudential methodology, the setting used here.</w:t>
+        <w:t xml:space="preserve">Besides the proportionality work above, two strands of the literature reviewed by McKillop et al. (2020) bear on this paper. The first concerns capital, profitability and stability. Hesse and Čihák (2007) find in a cross-country panel that cooperative banks are more stable than commercial banks. They attribute the result to the lower volatility of cooperative returns, which more than offsets lower profitability and capitalisation. Beck et al. (2009) reach a similar conclusion for German banks under one supervisory regime, where cooperative banks are farther from insolvency than both privately owned and savings banks. Ayadi et al. (2010) document the performance and role of cooperative banks across Europe, Iannotta et al. (2007) find that ownership structure predicts risk and performance across European banks, and Becchetti et al. (2016) and Ferri et al. (2014) show that it shapes lending. Groeneveld (2020) weighs the adaptations of European cooperative banks against the traits they retain and finds their distinctive character intact. Cuevas and Fischer (2006) set out the tension between member orientation and prudential templates written for investor-owned banks. The second is Brazilian. Bressan et al. (2011) apply the PEARLS system to Brazilian credit cooperatives and model their insolvency risk, and Carvalho et al. (2015) analyse the exit and failure of Brazilian credit unions. More recently, Silva et al. (2023) relate the performance of the credit unions in segment S4 to PEARLS indicators and find net lending positively associated with profitability and equity growth; they propose a comparison with the banks of the same segment, which this paper makes. Cavinato and Capitani (2023) show that the social efficiency of rural credit cooperatives differs across regions. None compares cooperatives with banks under a common prudential methodology, the setting used here.</w:t>
       </w:r>
     </w:p>
     <w:p>
@@ -8067,7 +8067,7 @@
         <w:jc w:val="both"/>
       </w:pPr>
       <w:r>
-        <w:t xml:space="preserve">Because cooperative status is time-invariant, the estimates are conditional correlations. The full-methodology restriction selects the largest cooperatives, and the results generalise only to that subpopulation. The provisioning ratio is an accounting variable and does not measure delinquency. The stability outcomes are institution-level statistics on a subsample, estimated without quarter effects. Most systems are too thinly represented for separate inference, and the network backstop hypothesis needs consolidated network data that IF.data does not carry. The mediator question in Section 4.3 also needs a market measure finer than macro-region, and IF.data's credit-modality modules, which carry rural credit, are the natural next step, since regional conditions shape rural cooperatives' efficiency (Cavinato &amp; Capitani, 2023). Finally, a within-institution design around adoption of the full methodology fails to identify a regime effect, because adoption follows growth and pre-adoption trends run through the adoption date without a break.</w:t>
+        <w:t xml:space="preserve">Because cooperative status is time-invariant, the estimates are conditional correlations. The full-methodology restriction selects the largest cooperatives, and the results generalise only to that subpopulation. The provisioning ratio is an accounting variable and does not measure delinquency. The stability outcomes are institution-level statistics on a subsample, estimated without quarter effects. Most systems are too thinly represented for separate inference, and the network backstop hypothesis needs consolidated network data that IF.data does not carry. The mediator question in Section 4.3 also needs a market measure finer than macro-region, and IF.data's credit-modality modules, which carry rural credit, are the natural next step, since the social efficiency of rural cooperatives differs across regions (Cavinato &amp; Capitani, 2023). Finally, a within-institution design around adoption of the full methodology fails to identify a regime effect, because adoption follows growth and pre-adoption trends run through the adoption date without a break.</w:t>
       </w:r>
     </w:p>
     <w:p>
@@ -8381,7 +8381,7 @@
           <w:sz w:val="18"/>
           <w:szCs w:val="18"/>
         </w:rPr>
-        <w:t xml:space="preserve">. Bruegel Analysis 21/2026. https://www.bruegel.org/analysis/calls-eu-financial-rule-simplification-should-not-spill-over-lower-standards</w:t>
+        <w:t xml:space="preserve">. Bruegel Analysis 21/2026. https://doi.org/10.64153/SSLG8909</w:t>
       </w:r>
     </w:p>
     <w:p>

</xml_diff>

<commit_message>
Word cuts (4.6, literature sentence, abstract), Discussion opens with the interpretation, survivorship sentence in the limitations
Co-Authored-By: Claude Fable 5.1 <noreply@anthropic.com>
</commit_message>
<xml_diff>
--- a/paper/ICACCR2026_paper_Nery_Victorino_Rangel.docx
+++ b/paper/ICACCR2026_paper_Nery_Victorino_Rangel.docx
@@ -155,7 +155,7 @@
         <w:jc w:val="both"/>
       </w:pPr>
       <w:r>
-        <w:t xml:space="preserve">In Brazil, a credit cooperative that grows past a size threshold computes capital, leverage and risk under the same prudential methodology as a commercial bank, while its cooperative acts remain untaxed. We ask whether the cooperative form still leaves a distinct imprint on the balance sheet. The data are a quarterly panel of every full-methodology institution from 2017 to 2024: 130 singular credit cooperatives and 144 banks. Eleven balance-sheet and performance measures are related to a cooperative dummy, controlling for size and time, on a matched sample and across five comparison groups. The cooperative form leaves a clear imprint, in three results. First, at comparable size cooperatives operate at lower cost and show steadier returns, and nationally they lend a larger share of their assets than banks, a difference that does not survive matching within region. Before tax the typical cooperative earns more than a comparable bank, though the mean gap is not established; after tax it retains about two percentage points more, of which the tax exemption explains about two fifths. Second, capital differs modestly in level and markedly in dispersion. The mean gap comes from small banks with capital ratios above fifty percent and roughly halves against deposit-funded banks; in the lower part of the capital distribution, cooperatives hold more capital than banks at the same quantile and provision no less. Third, two differences often reported, lower provisioning and narrower margins, disappear once the comparison group is restricted to banks. Whether these differences bear on the territorial role of cooperative lenders is the claim the data cannot yet settle. What they do show is that a benchmark calibrated on the average institution may describe the locally lending cooperative poorly.</w:t>
+        <w:t xml:space="preserve">In Brazil, a credit cooperative that grows past a size threshold computes capital, leverage and risk under the same prudential methodology as a commercial bank, while its cooperative acts remain untaxed. We ask whether the cooperative form still leaves a distinct imprint on the balance sheet. The data are a quarterly panel of every full-methodology institution from 2017 to 2024: 130 singular credit cooperatives and 144 banks. Eleven balance-sheet and performance measures are related to a cooperative dummy, controlling for size and time, on a matched sample and across five comparison groups. The cooperative form leaves a clear imprint, in three results. First, at comparable size cooperatives operate at lower cost and show steadier returns, and nationally they lend a larger share of their assets than banks, a difference that does not survive matching within region. After tax they retain about two percentage points more of their return, of which the tax exemption explains about two fifths; before tax the typical cooperative still earns more, though the mean gap is not established. Second, capital differs modestly in level and markedly in dispersion. The mean gap comes from small banks with capital ratios above fifty percent and roughly halves against deposit-funded banks; in the lower part of the capital distribution, cooperatives hold more capital than banks at the same quantile and provision no less. Third, two differences often reported, lower provisioning and narrower margins, disappear once the comparison group is restricted to banks. Whether these differences bear on the territorial role of cooperative lenders is the claim the data cannot yet settle. What they do show is that a benchmark calibrated on the average institution may describe the locally lending cooperative poorly.</w:t>
       </w:r>
     </w:p>
     <w:p>
@@ -395,7 +395,7 @@
         <w:jc w:val="both"/>
       </w:pPr>
       <w:r>
-        <w:t xml:space="preserve">Besides the proportionality work above, two strands of the literature reviewed by McKillop et al. (2020) bear on this paper. The first concerns capital, profitability and stability. Hesse and Čihák (2007) find in a cross-country panel that cooperative banks are more stable than commercial banks. They attribute the result to the lower volatility of cooperative returns, which more than offsets lower profitability and capitalisation. Beck et al. (2009) reach a similar conclusion for German banks under one supervisory regime, where cooperative banks are farther from insolvency than both privately owned and savings banks. Ayadi et al. (2010) document the performance and role of cooperative banks across Europe, Iannotta et al. (2007) find that ownership structure predicts risk and performance across European banks, and Becchetti et al. (2016) and Ferri et al. (2014) show that it shapes lending. Groeneveld (2020) weighs the adaptations of European cooperative banks against the traits they retain and finds their distinctive character intact. Cuevas and Fischer (2006) set out the tension between member orientation and prudential templates written for investor-owned banks. The second is Brazilian. Bressan et al. (2011) apply the PEARLS system to Brazilian credit cooperatives and model their insolvency risk, and Carvalho et al. (2015) analyse the exit and failure of Brazilian credit unions. More recently, Silva et al. (2023) relate the performance of the credit unions in segment S4 to PEARLS indicators and find net lending positively associated with profitability and equity growth; they propose a comparison with the banks of the same segment, which this paper makes. Cavinato and Capitani (2023) show that the social efficiency of rural credit cooperatives differs across regions. None compares cooperatives with banks under a common prudential methodology, the setting used here.</w:t>
+        <w:t xml:space="preserve">Besides the proportionality work above, two strands of the literature reviewed by McKillop et al. (2020) bear on this paper. The first concerns capital, profitability and stability. Hesse and Čihák (2007) find in a cross-country panel that cooperative banks are more stable than commercial banks. They attribute the result to the lower volatility of cooperative returns, which more than offsets lower profitability and capitalisation. Beck et al. (2009) reach a similar conclusion for German banks under one supervisory regime, where cooperative banks are farther from insolvency than both privately owned and savings banks. Ayadi et al. (2010), Iannotta et al. (2007) and Groeneveld (2020) document the performance, risk and persistent distinctiveness of European cooperative banks, and Becchetti et al. (2016) and Ferri et al. (2014) show that ownership shapes lending. Cuevas and Fischer (2006) set out the tension between member orientation and prudential templates written for investor-owned banks. The second is Brazilian. Bressan et al. (2011) apply the PEARLS system to Brazilian credit cooperatives and model their insolvency risk, and Carvalho et al. (2015) analyse the exit and failure of Brazilian credit unions. More recently, Silva et al. (2023) relate the performance of the credit unions in segment S4 to PEARLS indicators and find net lending positively associated with profitability and equity growth; they propose a comparison with the banks of the same segment, which this paper makes. Cavinato and Capitani (2023) show that the social efficiency of rural credit cooperatives differs across regions. None compares cooperatives with banks under a common prudential methodology, the setting used here.</w:t>
       </w:r>
     </w:p>
     <w:p>
@@ -7987,7 +7987,7 @@
         <w:jc w:val="both"/>
       </w:pPr>
       <w:r>
-        <w:t xml:space="preserve">The online appendix reports the conditional medians and the specification without the eleven S1 and S2 banks, which moves no significant coefficient by more than two percent. It also reports a split at the January 2022 replacement of the 2013 capital rules. Every surviving result keeps its sign and significance in both subperiods, and provisioning and the margin remain null in both. Magnitudes are roughly a fifth smaller after 2022. Four winsorisation rules, re-estimation on the rows where provisioning is observed, dropping the sector's two cooperative-owned banks, and dropping the six cooperatives that revert to the simplified methodology leave every surviving sign unchanged. The weighted and unweighted matched-sample estimates differ by less than the sampling error.</w:t>
+        <w:t xml:space="preserve">The online appendix reports the conditional medians and the specification without the eleven S1 and S2 banks, which moves no significant coefficient by more than two percent. It also reports a split at the January 2022 replacement of the 2013 capital rules. Every surviving result keeps its sign and significance in both subperiods, and provisioning and the margin remain null in both. Magnitudes are roughly a fifth smaller after 2022. Four winsorisation rules, dropping the sector's two cooperative-owned banks and dropping the six cooperatives that revert to the simplified methodology leave every surviving sign unchanged.</w:t>
       </w:r>
     </w:p>
     <w:p>
@@ -8011,7 +8011,7 @@
         <w:jc w:val="both"/>
       </w:pPr>
       <w:r>
-        <w:t xml:space="preserve">For supervisors, the findings suggest a benchmark calibrated on lending institutions and a reading of the whole distribution as well as the mean. The surviving results describe a focused retail lender, consistent with a member-service orientation in which capital accumulation is a means to member credit (Fonteyne, 2007).</w:t>
+        <w:t xml:space="preserve">The surviving results describe a focused retail lender, consistent with a member-service orientation in which capital accumulation is a means to member credit (Fonteyne, 2007). For supervisors, the findings suggest a benchmark calibrated on lending institutions and a reading of the whole distribution as well as the mean.</w:t>
       </w:r>
     </w:p>
     <w:p>
@@ -8067,7 +8067,7 @@
         <w:jc w:val="both"/>
       </w:pPr>
       <w:r>
-        <w:t xml:space="preserve">Because cooperative status is time-invariant, the estimates are conditional correlations. The full-methodology restriction selects the largest cooperatives, and the results generalise only to that subpopulation. The provisioning ratio is an accounting variable and does not measure delinquency. The stability outcomes are institution-level statistics on a subsample, estimated without quarter effects. Most systems are too thinly represented for separate inference, and the network backstop hypothesis needs consolidated network data that IF.data does not carry. The mediator question in Section 4.3 also needs a market measure finer than macro-region, and IF.data's credit-modality modules, which carry rural credit, are the natural next step, since the social efficiency of rural cooperatives differs across regions (Cavinato &amp; Capitani, 2023). Finally, a within-institution design around adoption of the full methodology fails to identify a regime effect, because adoption follows growth and pre-adoption trends run through the adoption date without a break.</w:t>
+        <w:t xml:space="preserve">Because cooperative status is time-invariant, the estimates are conditional correlations. The full-methodology restriction selects the largest cooperatives, and the results generalise only to that subpopulation. The provisioning ratio is an accounting variable and does not measure delinquency. The stability outcomes are institution-level statistics on a subsample, estimated without quarter effects; the panel is unbalanced, an institution that is incorporated or closes leaves it at its last reported quarter, and institutions with fewer than eight quarters are absent from that subsample. Most systems are too thinly represented for separate inference, and the network backstop hypothesis needs consolidated network data that IF.data does not carry. The mediator question in Section 4.3 also needs a market measure finer than macro-region, and IF.data's credit-modality modules, which carry rural credit, are the natural next step, since the social efficiency of rural cooperatives differs across regions (Cavinato &amp; Capitani, 2023). Finally, a within-institution design around adoption of the full methodology fails to identify a regime effect, because adoption follows growth and pre-adoption trends run through the adoption date without a break.</w:t>
       </w:r>
     </w:p>
     <w:p>

</xml_diff>

<commit_message>
Three redundant passages cut (Section 1 closing paragraph, 1.2 final paragraph, 4.1 quantile-average sentences)
Co-Authored-By: Claude Fable 5.1 <noreply@anthropic.com>
</commit_message>
<xml_diff>
--- a/paper/ICACCR2026_paper_Nery_Victorino_Rangel.docx
+++ b/paper/ICACCR2026_paper_Nery_Victorino_Rangel.docx
@@ -328,14 +328,6 @@
     </w:p>
     <w:p>
       <w:pPr>
-        <w:jc w:val="both"/>
-      </w:pPr>
-      <w:r>
-        <w:t xml:space="preserve">Cooperatives are the part of the regulated system that lends locally and has grown fastest. Whether a prudential benchmark calibrated on an average institution that barely lends measures them against a standard drawn from a different kind of institution is the question we ask.</w:t>
-      </w:r>
-    </w:p>
-    <w:p>
-      <w:pPr>
         <w:pStyle w:val="Heading2"/>
         <w:keepNext/>
         <w:keepLines/>
@@ -396,14 +388,6 @@
       </w:pPr>
       <w:r>
         <w:t xml:space="preserve">Besides the proportionality work above, two strands of the literature reviewed by McKillop et al. (2020) bear on this paper. The first concerns capital, profitability and stability. Hesse and Čihák (2007) find in a cross-country panel that cooperative banks are more stable than commercial banks. They attribute the result to the lower volatility of cooperative returns, which more than offsets lower profitability and capitalisation. Beck et al. (2009) reach a similar conclusion for German banks under one supervisory regime, where cooperative banks are farther from insolvency than both privately owned and savings banks. Ayadi et al. (2010), Iannotta et al. (2007) and Groeneveld (2020) document the performance, risk and persistent distinctiveness of European cooperative banks, and Becchetti et al. (2016) and Ferri et al. (2014) show that ownership shapes lending. Cuevas and Fischer (2006) set out the tension between member orientation and prudential templates written for investor-owned banks. The second is Brazilian. Bressan et al. (2011) apply the PEARLS system to Brazilian credit cooperatives and model their insolvency risk, and Carvalho et al. (2015) analyse the exit and failure of Brazilian credit unions. More recently, Silva et al. (2023) relate the performance of the credit unions in segment S4 to PEARLS indicators and find net lending positively associated with profitability and equity growth; they propose a comparison with the banks of the same segment, which this paper makes. Cavinato and Capitani (2023) show that the social efficiency of rural credit cooperatives differs across regions. None compares cooperatives with banks under a common prudential methodology, the setting used here.</w:t>
-      </w:r>
-    </w:p>
-    <w:p>
-      <w:pPr>
-        <w:jc w:val="both"/>
-      </w:pPr>
-      <w:r>
-        <w:t xml:space="preserve">A further question is asked less often: which institutions the comparison group contains. Regulatory populations are defined by legal category and can include institutions with little economic resemblance to a bank, as Section 3.2 shows for Brazil.</w:t>
       </w:r>
     </w:p>
     <w:p>
@@ -6243,7 +6227,7 @@
         <w:jc w:val="both"/>
       </w:pPr>
       <w:r>
-        <w:t xml:space="preserve">Averaged over the twentieth to eightieth percentiles, the differential is of similar size to the conditional mean for credit intensity and the after-tax return. For leverage and cost-to-income it is little more than a third of the mean, and both change sign inside the distribution. At equal size, cooperatives are the more homogeneous group on every outcome, with residual standard deviations between a tenth and a half of the bank figure. Leverage and capital are closely correlated among cooperatives, and we treat the two as a single result.</w:t>
+        <w:t xml:space="preserve">At equal size, cooperatives are the more homogeneous group on every outcome, with residual standard deviations between a tenth and a half of the bank figure. Leverage and capital are closely correlated among cooperatives, and we treat the two as a single result.</w:t>
       </w:r>
     </w:p>
     <w:p>

</xml_diff>